<commit_message>
Update evaluation metrics and training scripts for Stage 3
- Updated precision, recall, and F1 scores in `test_per_class.json` and `val_per_class.json` to reflect improved model performance.
- Modified confusion matrices in both JSON files to align with new evaluation results.
- Changed the best checkpoint path in `evaluate.py` to point to Stage 3 model.
- Updated log file sizes in `train_stage1_log.csv` and `train_stage2_log.csv` to reflect new data.
- Added new training log file `train_stage3_log.csv` for Stage 3.
- Updated confusion matrix images for validation and added a new confusion matrix for Stage 3.
- Introduced `train_final.py` for final training stage with enhanced configurations and logging.
- Renamed scripts for clarity in pseudo-label generation and training stages.
</commit_message>
<xml_diff>
--- a/docs/张吉鹏-毕设.docx
+++ b/docs/张吉鹏-毕设.docx
@@ -24,6 +24,9 @@
         </w:rPr>
       </w:pPr>
       <w:r>
+        <w:rPr>
+          <w:noProof/>
+        </w:rPr>
         <w:drawing>
           <wp:anchor distT="0" distB="0" distL="114300" distR="114300" simplePos="0" relativeHeight="251660288" behindDoc="0" locked="0" layoutInCell="1" allowOverlap="0" wp14:anchorId="575C5E25" wp14:editId="0D948B6F">
             <wp:simplePos x="0" y="0"/>
@@ -1916,11 +1919,9 @@
       <w:r>
         <w:t>模型完成实时人脸检测与关键点定位，为后续表情识别提供稳定输入。系统整体采用</w:t>
       </w:r>
-      <w:proofErr w:type="spellStart"/>
       <w:r>
         <w:t>PyTorch</w:t>
       </w:r>
-      <w:proofErr w:type="spellEnd"/>
       <w:r>
         <w:t>框架实现，并在个人计算机与树莓派嵌入式平台上完成部署与验证。</w:t>
       </w:r>
@@ -2024,23 +2025,7 @@
         <w:ind w:firstLineChars="0" w:firstLine="0"/>
       </w:pPr>
       <w:r>
-        <w:t xml:space="preserve">Aiming at the application requirements of intelligent human-computer interaction and emotional computing, a facial expression recognition system based on convolutional neural network and YuNet </w:t>
-      </w:r>
-      <w:proofErr w:type="gramStart"/>
-      <w:r>
-        <w:t>is designed</w:t>
-      </w:r>
-      <w:proofErr w:type="gramEnd"/>
-      <w:r>
-        <w:t xml:space="preserve"> and implemented. Aiming at the problem of insufficient recognition accuracy and real-time performance of traditional face detection and expression recognition methods on complex illumination, pose changes and embedded platforms, a technical scheme combining lightweight face detection model YuNet and efficient convolutional neural network model </w:t>
-      </w:r>
-      <w:proofErr w:type="gramStart"/>
-      <w:r>
-        <w:t>is introduced</w:t>
-      </w:r>
-      <w:proofErr w:type="gramEnd"/>
-      <w:r>
-        <w:t xml:space="preserve"> to achieve accurate face positioning and automatic expression classification. </w:t>
+        <w:t xml:space="preserve">Aiming at the application requirements of intelligent human-computer interaction and emotional computing, a facial expression recognition system based on convolutional neural network and YuNet is designed and implemented. Aiming at the problem of insufficient recognition accuracy and real-time performance of traditional face detection and expression recognition methods on complex illumination, pose changes and embedded platforms, a technical scheme combining lightweight face detection model YuNet and efficient convolutional neural network model is introduced to achieve accurate face positioning and automatic expression classification. </w:t>
       </w:r>
     </w:p>
     <w:p>
@@ -2049,55 +2034,7 @@
         <w:ind w:firstLineChars="0" w:firstLine="0"/>
       </w:pPr>
       <w:r>
-        <w:t xml:space="preserve">The system uses the FER2013 public data set as the basis for training and testing, constructs an expression recognition network based on MobileNetV3, and uses the deep feature extraction ability to enhance the adaptability of the model to different races, expression </w:t>
-      </w:r>
-      <w:proofErr w:type="gramStart"/>
-      <w:r>
-        <w:t>intensity</w:t>
-      </w:r>
-      <w:proofErr w:type="gramEnd"/>
-      <w:r>
-        <w:t xml:space="preserve"> and environmental changes. In the face detection stage, the YuNet model </w:t>
-      </w:r>
-      <w:proofErr w:type="gramStart"/>
-      <w:r>
-        <w:t>is used</w:t>
-      </w:r>
-      <w:proofErr w:type="gramEnd"/>
-      <w:r>
-        <w:t xml:space="preserve"> to complete real-time face detection and key point positioning, which provides stable input for subsequent expression recognition. The </w:t>
-      </w:r>
-      <w:proofErr w:type="gramStart"/>
-      <w:r>
-        <w:t>whole system</w:t>
-      </w:r>
-      <w:proofErr w:type="gramEnd"/>
-      <w:r>
-        <w:t xml:space="preserve"> </w:t>
-      </w:r>
-      <w:proofErr w:type="gramStart"/>
-      <w:r>
-        <w:t>is implemented</w:t>
-      </w:r>
-      <w:proofErr w:type="gramEnd"/>
-      <w:r>
-        <w:t xml:space="preserve"> by </w:t>
-      </w:r>
-      <w:proofErr w:type="spellStart"/>
-      <w:r>
-        <w:t>PyTorch</w:t>
-      </w:r>
-      <w:proofErr w:type="spellEnd"/>
-      <w:r>
-        <w:t xml:space="preserve"> </w:t>
-      </w:r>
-      <w:proofErr w:type="gramStart"/>
-      <w:r>
-        <w:t>framework, and</w:t>
-      </w:r>
-      <w:proofErr w:type="gramEnd"/>
-      <w:r>
-        <w:t xml:space="preserve"> deployed and verified on personal computer and Raspberry Pi embedded platform. </w:t>
+        <w:t xml:space="preserve">The system uses the FER2013 public data set as the basis for training and testing, constructs an expression recognition network based on MobileNetV3, and uses the deep feature extraction ability to enhance the adaptability of the model to different races, expression intensity and environmental changes. In the face detection stage, the YuNet model is used to complete real-time face detection and key point positioning, which provides stable input for subsequent expression recognition. The whole system is implemented by PyTorch framework, and deployed and verified on personal computer and Raspberry Pi embedded platform. </w:t>
       </w:r>
     </w:p>
     <w:p>
@@ -2106,23 +2043,7 @@
         <w:ind w:firstLineChars="0" w:firstLine="0"/>
       </w:pPr>
       <w:r>
-        <w:t xml:space="preserve">The experimental results show that the system achieves higher expression recognition accuracy on the FER2013 test </w:t>
-      </w:r>
-      <w:proofErr w:type="gramStart"/>
-      <w:r>
-        <w:t>set, and</w:t>
-      </w:r>
-      <w:proofErr w:type="gramEnd"/>
-      <w:r>
-        <w:t xml:space="preserve"> significantly reduces the number of model parameters and computational complexity while ensuring recognition accuracy. In the real-time test, the system can stably complete the task of face detection and expression recognition, the response speed meets the real-time application </w:t>
-      </w:r>
-      <w:proofErr w:type="gramStart"/>
-      <w:r>
-        <w:t>requirements, and</w:t>
-      </w:r>
-      <w:proofErr w:type="gramEnd"/>
-      <w:r>
-        <w:t xml:space="preserve"> has good running stability and resource utilization efficiency on the embedded platform. Compared with the traditional methods, the designed system shows stronger robustness and generalization ability in complex environments. </w:t>
+        <w:t xml:space="preserve">The experimental results show that the system achieves higher expression recognition accuracy on the FER2013 test set, and significantly reduces the number of model parameters and computational complexity while ensuring recognition accuracy. In the real-time test, the system can stably complete the task of face detection and expression recognition, the response speed meets the real-time application requirements, and has good running stability and resource utilization efficiency on the embedded platform. Compared with the traditional methods, the designed system shows stronger robustness and generalization ability in complex environments. </w:t>
       </w:r>
     </w:p>
     <w:p>
@@ -2131,15 +2052,7 @@
         <w:ind w:firstLineChars="0" w:firstLine="0"/>
       </w:pPr>
       <w:r>
-        <w:t xml:space="preserve">The research results show that the combination of lightweight face detection model and efficient convolutional neural network can effectively improve the comprehensive performance of facial expression recognition system. The system has certain engineering practical value in application scenarios such as intelligent security, human-computer </w:t>
-      </w:r>
-      <w:proofErr w:type="gramStart"/>
-      <w:r>
-        <w:t>interaction</w:t>
-      </w:r>
-      <w:proofErr w:type="gramEnd"/>
-      <w:r>
-        <w:t xml:space="preserve"> and education evaluation, and provides a reference for the design and implementation of embedded emotional computing system.</w:t>
+        <w:t>The research results show that the combination of lightweight face detection model and efficient convolutional neural network can effectively improve the comprehensive performance of facial expression recognition system. The system has certain engineering practical value in application scenarios such as intelligent security, human-computer interaction and education evaluation, and provides a reference for the design and implementation of embedded emotional computing system.</w:t>
       </w:r>
     </w:p>
     <w:p>
@@ -2200,16 +2113,7 @@
         <w:t>;</w:t>
       </w:r>
       <w:r>
-        <w:t xml:space="preserve"> deep learning; convolutional neural network; </w:t>
-      </w:r>
-      <w:proofErr w:type="spellStart"/>
-      <w:proofErr w:type="gramStart"/>
-      <w:r>
-        <w:t>yuNet</w:t>
-      </w:r>
-      <w:proofErr w:type="spellEnd"/>
-      <w:r>
-        <w:t>;</w:t>
+        <w:t xml:space="preserve"> deep learning; convolutional neural network; yuNet;</w:t>
       </w:r>
       <w:r>
         <w:rPr>
@@ -2218,11 +2122,7 @@
         <w:t xml:space="preserve"> </w:t>
       </w:r>
       <w:r>
-        <w:t xml:space="preserve"> mobileNetV</w:t>
-      </w:r>
-      <w:proofErr w:type="gramEnd"/>
-      <w:r>
-        <w:t>3; embedded system</w:t>
+        <w:t xml:space="preserve"> mobileNetV3; embedded system</w:t>
       </w:r>
     </w:p>
     <w:p>
@@ -3663,35 +3563,7 @@
         <w:rPr>
           <w:color w:val="000000"/>
         </w:rPr>
-        <w:t>）强调让计算机能够识别、理解并对人类情绪</w:t>
-      </w:r>
-      <w:proofErr w:type="gramStart"/>
-      <w:r>
-        <w:rPr>
-          <w:color w:val="000000"/>
-        </w:rPr>
-        <w:t>作出</w:t>
-      </w:r>
-      <w:proofErr w:type="gramEnd"/>
-      <w:r>
-        <w:rPr>
-          <w:color w:val="000000"/>
-        </w:rPr>
-        <w:t>响应，其研究框架与应用意义已在早期工作中得到系统阐述，并被广泛用于解释情绪在智能</w:t>
-      </w:r>
-      <w:proofErr w:type="gramStart"/>
-      <w:r>
-        <w:rPr>
-          <w:color w:val="000000"/>
-        </w:rPr>
-        <w:t>交互中</w:t>
-      </w:r>
-      <w:proofErr w:type="gramEnd"/>
-      <w:r>
-        <w:rPr>
-          <w:color w:val="000000"/>
-        </w:rPr>
-        <w:t>的重要作用</w:t>
+        <w:t>）强调让计算机能够识别、理解并对人类情绪作出响应，其研究框架与应用意义已在早期工作中得到系统阐述，并被广泛用于解释情绪在智能交互中的重要作用</w:t>
       </w:r>
       <w:r>
         <w:rPr>
@@ -4059,14 +3931,12 @@
         </w:rPr>
         <w:t>边缘端）上的实时推理面临挑战。为兼顾效率与性能，研究者提出了面向移动与嵌入式视觉任务的轻量化网络架构（如</w:t>
       </w:r>
-      <w:proofErr w:type="spellStart"/>
       <w:r>
         <w:rPr>
           <w:color w:val="000000"/>
         </w:rPr>
         <w:t>MobileNet</w:t>
       </w:r>
-      <w:proofErr w:type="spellEnd"/>
       <w:r>
         <w:rPr>
           <w:color w:val="000000"/>
@@ -4109,21 +3979,7 @@
         <w:rPr>
           <w:color w:val="000000"/>
         </w:rPr>
-        <w:t>。此外，在</w:t>
-      </w:r>
-      <w:proofErr w:type="gramStart"/>
-      <w:r>
-        <w:rPr>
-          <w:color w:val="000000"/>
-        </w:rPr>
-        <w:t>端侧部署</w:t>
-      </w:r>
-      <w:proofErr w:type="gramEnd"/>
-      <w:r>
-        <w:rPr>
-          <w:color w:val="000000"/>
-        </w:rPr>
-        <w:t>场景中，人脸检测作为前置模块直接影响系统端到端延迟与稳定性。</w:t>
+        <w:t>。此外，在端侧部署场景中，人脸检测作为前置模块直接影响系统端到端延迟与稳定性。</w:t>
       </w:r>
       <w:r>
         <w:rPr>
@@ -4135,21 +3991,7 @@
         <w:rPr>
           <w:color w:val="000000"/>
         </w:rPr>
-        <w:t>作为面向边缘设备的</w:t>
-      </w:r>
-      <w:proofErr w:type="gramStart"/>
-      <w:r>
-        <w:rPr>
-          <w:color w:val="000000"/>
-        </w:rPr>
-        <w:t>毫秒级轻量</w:t>
-      </w:r>
-      <w:proofErr w:type="gramEnd"/>
-      <w:r>
-        <w:rPr>
-          <w:color w:val="000000"/>
-        </w:rPr>
-        <w:t>人脸检测器，强调在速度与精度之间取得更优折中，可为后续表情识别提供稳定的人脸定位与对齐输入</w:t>
+        <w:t>作为面向边缘设备的毫秒级轻量人脸检测器，强调在速度与精度之间取得更优折中，可为后续表情识别提供稳定的人脸定位与对齐输入</w:t>
       </w:r>
       <w:r>
         <w:rPr>
@@ -4506,14 +4348,12 @@
         </w:rPr>
         <w:t>面向工程部署，轻量化与实时性逐渐成为研究重点。</w:t>
       </w:r>
-      <w:proofErr w:type="spellStart"/>
       <w:r>
         <w:rPr>
           <w:color w:val="000000"/>
         </w:rPr>
         <w:t>MobileNet</w:t>
       </w:r>
-      <w:proofErr w:type="spellEnd"/>
       <w:r>
         <w:rPr>
           <w:color w:val="000000"/>
@@ -4715,19 +4555,11 @@
           <w:color w:val="000000"/>
         </w:rPr>
       </w:pPr>
-      <w:proofErr w:type="gramStart"/>
-      <w:r>
-        <w:rPr>
-          <w:color w:val="000000"/>
-        </w:rPr>
-        <w:t>针对端侧表情</w:t>
-      </w:r>
-      <w:proofErr w:type="gramEnd"/>
-      <w:r>
-        <w:rPr>
-          <w:color w:val="000000"/>
-        </w:rPr>
-        <w:t>识别在实时性与准确率之间的矛盾，本文围绕轻量化</w:t>
+      <w:r>
+        <w:rPr>
+          <w:color w:val="000000"/>
+        </w:rPr>
+        <w:t>针对端侧表情识别在实时性与准确率之间的矛盾，本文围绕轻量化</w:t>
       </w:r>
       <w:r>
         <w:rPr>
@@ -4858,21 +4690,7 @@
         <w:rPr>
           <w:color w:val="000000"/>
         </w:rPr>
-        <w:t>的工程流程，完成系统需求分析与模块化架构设计，</w:t>
-      </w:r>
-      <w:proofErr w:type="gramStart"/>
-      <w:r>
-        <w:rPr>
-          <w:color w:val="000000"/>
-        </w:rPr>
-        <w:t>明确端侧</w:t>
-      </w:r>
-      <w:proofErr w:type="gramEnd"/>
-      <w:r>
-        <w:rPr>
-          <w:color w:val="000000"/>
-        </w:rPr>
-        <w:t>实时运行的关键约束与指标。</w:t>
+        <w:t>的工程流程，完成系统需求分析与模块化架构设计，明确端侧实时运行的关键约束与指标。</w:t>
       </w:r>
     </w:p>
     <w:p>
@@ -4941,30 +4759,14 @@
         <w:rPr>
           <w:color w:val="000000"/>
         </w:rPr>
-        <w:t>；在表情分类</w:t>
-      </w:r>
-      <w:proofErr w:type="gramStart"/>
-      <w:r>
-        <w:rPr>
-          <w:color w:val="000000"/>
-        </w:rPr>
-        <w:t>端采用</w:t>
-      </w:r>
-      <w:proofErr w:type="gramEnd"/>
-      <w:r>
-        <w:rPr>
-          <w:color w:val="000000"/>
-        </w:rPr>
-        <w:t>轻量化卷积网络（以</w:t>
-      </w:r>
-      <w:proofErr w:type="spellStart"/>
+        <w:t>；在表情分类端采用轻量化卷积网络（以</w:t>
+      </w:r>
       <w:r>
         <w:rPr>
           <w:color w:val="000000"/>
         </w:rPr>
         <w:t>MobileNet</w:t>
       </w:r>
-      <w:proofErr w:type="spellEnd"/>
       <w:r>
         <w:rPr>
           <w:color w:val="000000"/>
@@ -5021,19 +4823,11 @@
           <w:color w:val="000000"/>
         </w:rPr>
       </w:pPr>
-      <w:proofErr w:type="gramStart"/>
-      <w:r>
-        <w:rPr>
-          <w:color w:val="000000"/>
-        </w:rPr>
-        <w:t>完成端侧推理</w:t>
-      </w:r>
-      <w:proofErr w:type="gramEnd"/>
-      <w:r>
-        <w:rPr>
-          <w:color w:val="000000"/>
-        </w:rPr>
-        <w:t>与功能集成，实现实时表情识别与结果展示；通过实验对识别效果与运行性能（如准确率、</w:t>
+      <w:r>
+        <w:rPr>
+          <w:color w:val="000000"/>
+        </w:rPr>
+        <w:t>完成端侧推理与功能集成，实现实时表情识别与结果展示；通过实验对识别效果与运行性能（如准确率、</w:t>
       </w:r>
       <w:r>
         <w:rPr>
@@ -5218,21 +5012,7 @@
         <w:rPr>
           <w:color w:val="000000"/>
         </w:rPr>
-        <w:t>章说明系统实现与</w:t>
-      </w:r>
-      <w:proofErr w:type="gramStart"/>
-      <w:r>
-        <w:rPr>
-          <w:color w:val="000000"/>
-        </w:rPr>
-        <w:t>端侧部署</w:t>
-      </w:r>
-      <w:proofErr w:type="gramEnd"/>
-      <w:r>
-        <w:rPr>
-          <w:color w:val="000000"/>
-        </w:rPr>
-        <w:t>流程，给出性能测试与鲁棒性分析。</w:t>
+        <w:t>章说明系统实现与端侧部署流程，给出性能测试与鲁棒性分析。</w:t>
       </w:r>
     </w:p>
     <w:p>
@@ -5255,19 +5035,11 @@
         </w:rPr>
         <w:t>6</w:t>
       </w:r>
-      <w:proofErr w:type="gramStart"/>
-      <w:r>
-        <w:rPr>
-          <w:color w:val="000000"/>
-        </w:rPr>
-        <w:t>章总结</w:t>
-      </w:r>
-      <w:proofErr w:type="gramEnd"/>
-      <w:r>
-        <w:rPr>
-          <w:color w:val="000000"/>
-        </w:rPr>
-        <w:t>全文工作并展望后续研究方向。</w:t>
+      <w:r>
+        <w:rPr>
+          <w:color w:val="000000"/>
+        </w:rPr>
+        <w:t>章总结全文工作并展望后续研究方向。</w:t>
       </w:r>
     </w:p>
     <w:p>
@@ -5330,35 +5102,7 @@
         <w:rPr>
           <w:rFonts w:hint="eastAsia"/>
         </w:rPr>
-        <w:t>本毕业设计</w:t>
-      </w:r>
-      <w:proofErr w:type="gramStart"/>
-      <w:r>
-        <w:rPr>
-          <w:rFonts w:hint="eastAsia"/>
-        </w:rPr>
-        <w:t>围绕端侧人脸</w:t>
-      </w:r>
-      <w:proofErr w:type="gramEnd"/>
-      <w:r>
-        <w:rPr>
-          <w:rFonts w:hint="eastAsia"/>
-        </w:rPr>
-        <w:t>表情识别系统展开，结合嵌入式</w:t>
-      </w:r>
-      <w:proofErr w:type="gramStart"/>
-      <w:r>
-        <w:rPr>
-          <w:rFonts w:hint="eastAsia"/>
-        </w:rPr>
-        <w:t>设备算力受限</w:t>
-      </w:r>
-      <w:proofErr w:type="gramEnd"/>
-      <w:r>
-        <w:rPr>
-          <w:rFonts w:hint="eastAsia"/>
-        </w:rPr>
-        <w:t>、实时性要求高等特点，从应用场景、功能需求、性能需求及非功能性需求四个方面对系统需求进行分析。</w:t>
+        <w:t>本毕业设计围绕端侧人脸表情识别系统展开，结合嵌入式设备算力受限、实时性要求高等特点，从应用场景、功能需求、性能需求及非功能性需求四个方面对系统需求进行分析。</w:t>
       </w:r>
     </w:p>
     <w:p>
@@ -5379,46 +5123,18 @@
         <w:rPr>
           <w:rFonts w:hint="eastAsia"/>
         </w:rPr>
-        <w:t>本系统</w:t>
-      </w:r>
-      <w:proofErr w:type="gramStart"/>
-      <w:r>
-        <w:rPr>
-          <w:rFonts w:hint="eastAsia"/>
-        </w:rPr>
-        <w:t>面向端侧实时</w:t>
-      </w:r>
-      <w:proofErr w:type="gramEnd"/>
-      <w:r>
-        <w:rPr>
-          <w:rFonts w:hint="eastAsia"/>
-        </w:rPr>
-        <w:t>视频分析应用场景，主要部署于资源受限的嵌入式计算平台，通过摄像头对视频流进行实时采集，实现对视频中人脸表情的自动识别与分析。系统适用于室内监控、人机交互等对实时性和稳定性具有一定要求的应用环境。</w:t>
-      </w:r>
-    </w:p>
-    <w:p>
-      <w:pPr>
-        <w:ind w:firstLine="480"/>
-      </w:pPr>
-      <w:r>
-        <w:rPr>
-          <w:rFonts w:hint="eastAsia"/>
-        </w:rPr>
-        <w:t>系统的核心任务目标是：在不依赖高性能图形处理单元的条件下，对视频流中的人脸区域进行实时检测，并对人脸表情进行准确分类，最终以可视化形式输出识别结果。系统在设计过程中需在识别准确性、运行速度与模型复杂度之间取得平衡，以满足</w:t>
-      </w:r>
-      <w:proofErr w:type="gramStart"/>
-      <w:r>
-        <w:rPr>
-          <w:rFonts w:hint="eastAsia"/>
-        </w:rPr>
-        <w:t>端侧部署</w:t>
-      </w:r>
-      <w:proofErr w:type="gramEnd"/>
-      <w:r>
-        <w:rPr>
-          <w:rFonts w:hint="eastAsia"/>
-        </w:rPr>
-        <w:t>的实际需求。</w:t>
+        <w:t>本系统面向端侧实时视频分析应用场景，主要部署于资源受限的嵌入式计算平台，通过摄像头对视频流进行实时采集，实现对视频中人脸表情的自动识别与分析。系统适用于室内监控、人机交互等对实时性和稳定性具有一定要求的应用环境。</w:t>
+      </w:r>
+    </w:p>
+    <w:p>
+      <w:pPr>
+        <w:ind w:firstLine="480"/>
+      </w:pPr>
+      <w:r>
+        <w:rPr>
+          <w:rFonts w:hint="eastAsia"/>
+        </w:rPr>
+        <w:t>系统的核心任务目标是：在不依赖高性能图形处理单元的条件下，对视频流中的人脸区域进行实时检测，并对人脸表情进行准确分类，最终以可视化形式输出识别结果。系统在设计过程中需在识别准确性、运行速度与模型复杂度之间取得平衡，以满足端侧部署的实际需求。</w:t>
       </w:r>
     </w:p>
     <w:p>
@@ -5440,21 +5156,7 @@
         <w:rPr>
           <w:rFonts w:hint="eastAsia"/>
         </w:rPr>
-        <w:t>结合系统的应用目标和整体设计思路，</w:t>
-      </w:r>
-      <w:proofErr w:type="gramStart"/>
-      <w:r>
-        <w:rPr>
-          <w:rFonts w:hint="eastAsia"/>
-        </w:rPr>
-        <w:t>端侧人脸</w:t>
-      </w:r>
-      <w:proofErr w:type="gramEnd"/>
-      <w:r>
-        <w:rPr>
-          <w:rFonts w:hint="eastAsia"/>
-        </w:rPr>
-        <w:t>表情识别系统应具备以下基本功能：</w:t>
+        <w:t>结合系统的应用目标和整体设计思路，端侧人脸表情识别系统应具备以下基本功能：</w:t>
       </w:r>
     </w:p>
     <w:p>
@@ -5492,21 +5194,7 @@
         <w:rPr>
           <w:rFonts w:hint="eastAsia"/>
         </w:rPr>
-        <w:t>系统应能够通过摄像头设备实时获取视频流，并对采集到的视频数据</w:t>
-      </w:r>
-      <w:proofErr w:type="gramStart"/>
-      <w:r>
-        <w:rPr>
-          <w:rFonts w:hint="eastAsia"/>
-        </w:rPr>
-        <w:t>进行逐帧处理</w:t>
-      </w:r>
-      <w:proofErr w:type="gramEnd"/>
-      <w:r>
-        <w:rPr>
-          <w:rFonts w:hint="eastAsia"/>
-        </w:rPr>
-        <w:t>，为后续人脸检测与表情识别提供输入数据。</w:t>
+        <w:t>系统应能够通过摄像头设备实时获取视频流，并对采集到的视频数据进行逐帧处理，为后续人脸检测与表情识别提供输入数据。</w:t>
       </w:r>
     </w:p>
     <w:p>
@@ -5544,21 +5232,7 @@
         <w:rPr>
           <w:rFonts w:hint="eastAsia"/>
         </w:rPr>
-        <w:t>系统应具备从</w:t>
-      </w:r>
-      <w:proofErr w:type="gramStart"/>
-      <w:r>
-        <w:rPr>
-          <w:rFonts w:hint="eastAsia"/>
-        </w:rPr>
-        <w:t>视频帧中自动检测</w:t>
-      </w:r>
-      <w:proofErr w:type="gramEnd"/>
-      <w:r>
-        <w:rPr>
-          <w:rFonts w:hint="eastAsia"/>
-        </w:rPr>
-        <w:t>人脸区域的能力，能够在多人场景下准确定位多个人脸的位置。</w:t>
+        <w:t>系统应具备从视频帧中自动检测人脸区域的能力，能够在多人场景下准确定位多个人脸的位置。</w:t>
       </w:r>
     </w:p>
     <w:p>
@@ -5691,15 +5365,7 @@
         <w:ind w:firstLine="480"/>
       </w:pPr>
       <w:r>
-        <w:t>为保证系统在</w:t>
-      </w:r>
-      <w:proofErr w:type="gramStart"/>
-      <w:r>
-        <w:t>端侧环境</w:t>
-      </w:r>
-      <w:proofErr w:type="gramEnd"/>
-      <w:r>
-        <w:t>下的实际可用性，系统在性能方面需满足以下要求：</w:t>
+        <w:t>为保证系统在端侧环境下的实际可用性，系统在性能方面需满足以下要求：</w:t>
       </w:r>
     </w:p>
     <w:p>
@@ -5779,21 +5445,7 @@
         <w:rPr>
           <w:rFonts w:hint="eastAsia"/>
         </w:rPr>
-        <w:t>在标准人脸表情数据</w:t>
-      </w:r>
-      <w:proofErr w:type="gramStart"/>
-      <w:r>
-        <w:rPr>
-          <w:rFonts w:hint="eastAsia"/>
-        </w:rPr>
-        <w:t>集条件</w:t>
-      </w:r>
-      <w:proofErr w:type="gramEnd"/>
-      <w:r>
-        <w:rPr>
-          <w:rFonts w:hint="eastAsia"/>
-        </w:rPr>
-        <w:t>下，系统整体表情识别准确率应不低于</w:t>
+        <w:t>在标准人脸表情数据集条件下，系统整体表情识别准确率应不低于</w:t>
       </w:r>
       <w:r>
         <w:rPr>
@@ -5833,21 +5485,7 @@
         <w:rPr>
           <w:rFonts w:hint="eastAsia"/>
         </w:rPr>
-        <w:t>系统在</w:t>
-      </w:r>
-      <w:proofErr w:type="gramStart"/>
-      <w:r>
-        <w:rPr>
-          <w:rFonts w:hint="eastAsia"/>
-        </w:rPr>
-        <w:t>端侧设备</w:t>
-      </w:r>
-      <w:proofErr w:type="gramEnd"/>
-      <w:r>
-        <w:rPr>
-          <w:rFonts w:hint="eastAsia"/>
-        </w:rPr>
-        <w:t>上运行时，应能够对视频流进行连续处理，整体推理速度应满足实时性要求，保证识别结果与视频画面具有良好的同步性。</w:t>
+        <w:t>系统在端侧设备上运行时，应能够对视频流进行连续处理，整体推理速度应满足实时性要求，保证识别结果与视频画面具有良好的同步性。</w:t>
       </w:r>
     </w:p>
     <w:p>
@@ -5860,19 +5498,11 @@
         </w:rPr>
         <w:t xml:space="preserve">4. </w:t>
       </w:r>
-      <w:proofErr w:type="gramStart"/>
-      <w:r>
-        <w:rPr>
-          <w:rFonts w:hint="eastAsia"/>
-        </w:rPr>
-        <w:t>端侧资源</w:t>
-      </w:r>
-      <w:proofErr w:type="gramEnd"/>
-      <w:r>
-        <w:rPr>
-          <w:rFonts w:hint="eastAsia"/>
-        </w:rPr>
-        <w:t>约束要求</w:t>
+      <w:r>
+        <w:rPr>
+          <w:rFonts w:hint="eastAsia"/>
+        </w:rPr>
+        <w:t>端侧资源约束要求</w:t>
       </w:r>
     </w:p>
     <w:p>
@@ -5931,23 +5561,7 @@
           <w:rFonts w:hint="eastAsia"/>
           <w:color w:val="000000"/>
         </w:rPr>
-        <w:t>为实现</w:t>
-      </w:r>
-      <w:proofErr w:type="gramStart"/>
-      <w:r>
-        <w:rPr>
-          <w:rFonts w:hint="eastAsia"/>
-          <w:color w:val="000000"/>
-        </w:rPr>
-        <w:t>端侧环境</w:t>
-      </w:r>
-      <w:proofErr w:type="gramEnd"/>
-      <w:r>
-        <w:rPr>
-          <w:rFonts w:hint="eastAsia"/>
-          <w:color w:val="000000"/>
-        </w:rPr>
-        <w:t>下的人脸表情识别功能，并满足实时性与资源受限条件下的运行需求，本文在系统设计过程中采用模块化设计思想，对系统整体结构进行统一规划。系统总体架构的合理性直接影响后续模型部署、功能实现以及系统运行的稳定性，因此有必要对系统的总体结构进行详细说明。</w:t>
+        <w:t>为实现端侧环境下的人脸表情识别功能，并满足实时性与资源受限条件下的运行需求，本文在系统设计过程中采用模块化设计思想，对系统整体结构进行统一规划。系统总体架构的合理性直接影响后续模型部署、功能实现以及系统运行的稳定性，因此有必要对系统的总体结构进行详细说明。</w:t>
       </w:r>
     </w:p>
     <w:p>
@@ -6011,7 +5625,7 @@
           <v:shape id="_x0000_i1025" type="#_x0000_t75" style="width:462pt;height:39pt" o:ole="">
             <v:imagedata r:id="rId19" o:title=""/>
           </v:shape>
-          <o:OLEObject Type="Embed" ProgID="Visio.Drawing.15" ShapeID="_x0000_i1025" DrawAspect="Content" ObjectID="_1832240289" r:id="rId20"/>
+          <o:OLEObject Type="Embed" ProgID="Visio.Drawing.15" ShapeID="_x0000_i1025" DrawAspect="Content" ObjectID="_1832524810" r:id="rId20"/>
         </w:object>
       </w:r>
     </w:p>
@@ -6056,58 +5670,22 @@
       <w:pPr>
         <w:ind w:firstLine="480"/>
       </w:pPr>
-      <w:proofErr w:type="gramStart"/>
-      <w:r>
-        <w:rPr>
-          <w:rFonts w:hint="eastAsia"/>
-        </w:rPr>
-        <w:t>端侧人脸</w:t>
-      </w:r>
-      <w:proofErr w:type="gramEnd"/>
-      <w:r>
-        <w:rPr>
-          <w:rFonts w:hint="eastAsia"/>
-        </w:rPr>
-        <w:t>表情识别系统整体由图像采集模块、数据预处理模块、表情识别模块以及结果输出模块等部分组成。系统通过摄像头设备实时采集视频流数据，并在</w:t>
-      </w:r>
-      <w:proofErr w:type="gramStart"/>
-      <w:r>
-        <w:rPr>
-          <w:rFonts w:hint="eastAsia"/>
-        </w:rPr>
-        <w:t>端侧计算</w:t>
-      </w:r>
-      <w:proofErr w:type="gramEnd"/>
-      <w:r>
-        <w:rPr>
-          <w:rFonts w:hint="eastAsia"/>
-        </w:rPr>
-        <w:t>平台上完成数据处理与模型推理任务，最终输出人脸表情识别结果。</w:t>
-      </w:r>
-    </w:p>
-    <w:p>
-      <w:pPr>
-        <w:ind w:firstLine="480"/>
-      </w:pPr>
-      <w:r>
-        <w:rPr>
-          <w:rFonts w:hint="eastAsia"/>
-        </w:rPr>
-        <w:t>在系统运行过程中，各模块之间通过明确的数据接口进行连接，形成一条完整的数据处理链路。系统架构设计</w:t>
-      </w:r>
-      <w:proofErr w:type="gramStart"/>
-      <w:r>
-        <w:rPr>
-          <w:rFonts w:hint="eastAsia"/>
-        </w:rPr>
-        <w:t>遵循低</w:t>
-      </w:r>
-      <w:proofErr w:type="gramEnd"/>
-      <w:r>
-        <w:rPr>
-          <w:rFonts w:hint="eastAsia"/>
-        </w:rPr>
-        <w:t>耦合、高内聚的原则，使各功能模块相对独立，既便于系统调试与维护，也为后续功能扩展提供了良好的结构基础。</w:t>
+      <w:r>
+        <w:rPr>
+          <w:rFonts w:hint="eastAsia"/>
+        </w:rPr>
+        <w:t>端侧人脸表情识别系统整体由图像采集模块、数据预处理模块、表情识别模块以及结果输出模块等部分组成。系统通过摄像头设备实时采集视频流数据，并在端侧计算平台上完成数据处理与模型推理任务，最终输出人脸表情识别结果。</w:t>
+      </w:r>
+    </w:p>
+    <w:p>
+      <w:pPr>
+        <w:ind w:firstLine="480"/>
+      </w:pPr>
+      <w:r>
+        <w:rPr>
+          <w:rFonts w:hint="eastAsia"/>
+        </w:rPr>
+        <w:t>在系统运行过程中，各模块之间通过明确的数据接口进行连接，形成一条完整的数据处理链路。系统架构设计遵循低耦合、高内聚的原则，使各功能模块相对独立，既便于系统调试与维护，也为后续功能扩展提供了良好的结构基础。</w:t>
       </w:r>
     </w:p>
     <w:p>
@@ -6129,21 +5707,7 @@
         <w:rPr>
           <w:rFonts w:hint="eastAsia"/>
         </w:rPr>
-        <w:t>根据系统的功能需求，</w:t>
-      </w:r>
-      <w:proofErr w:type="gramStart"/>
-      <w:r>
-        <w:rPr>
-          <w:rFonts w:hint="eastAsia"/>
-        </w:rPr>
-        <w:t>端侧人脸</w:t>
-      </w:r>
-      <w:proofErr w:type="gramEnd"/>
-      <w:r>
-        <w:rPr>
-          <w:rFonts w:hint="eastAsia"/>
-        </w:rPr>
-        <w:t>表情识别系统主要划分为以下几个功能模块：</w:t>
+        <w:t>根据系统的功能需求，端侧人脸表情识别系统主要划分为以下几个功能模块：</w:t>
       </w:r>
     </w:p>
     <w:p>
@@ -6187,21 +5751,7 @@
         <w:rPr>
           <w:rFonts w:hint="eastAsia"/>
         </w:rPr>
-        <w:t>图像采集模块主要负责通过摄像头设备对外部环境进行实时视频采集，并将连续的视频</w:t>
-      </w:r>
-      <w:proofErr w:type="gramStart"/>
-      <w:r>
-        <w:rPr>
-          <w:rFonts w:hint="eastAsia"/>
-        </w:rPr>
-        <w:t>帧</w:t>
-      </w:r>
-      <w:proofErr w:type="gramEnd"/>
-      <w:r>
-        <w:rPr>
-          <w:rFonts w:hint="eastAsia"/>
-        </w:rPr>
-        <w:t>输入至系统中。该模块为后续的人脸检测与表情识别提供原始图像数据，是系统运行的基础。</w:t>
+        <w:t>图像采集模块主要负责通过摄像头设备对外部环境进行实时视频采集，并将连续的视频帧输入至系统中。该模块为后续的人脸检测与表情识别提供原始图像数据，是系统运行的基础。</w:t>
       </w:r>
     </w:p>
     <w:p>
@@ -6238,21 +5788,7 @@
         <w:rPr>
           <w:rFonts w:hint="eastAsia"/>
         </w:rPr>
-        <w:t>数据预处理模块主要对采集到的视频</w:t>
-      </w:r>
-      <w:proofErr w:type="gramStart"/>
-      <w:r>
-        <w:rPr>
-          <w:rFonts w:hint="eastAsia"/>
-        </w:rPr>
-        <w:t>帧</w:t>
-      </w:r>
-      <w:proofErr w:type="gramEnd"/>
-      <w:r>
-        <w:rPr>
-          <w:rFonts w:hint="eastAsia"/>
-        </w:rPr>
-        <w:t>进行预处理操作，包括人脸区域提取、图像尺寸调整以及数据归一化等处理。通过对输入数据进行规范化处理，可有效提升后续表情识别模型的稳定性和识别效果。</w:t>
+        <w:t>数据预处理模块主要对采集到的视频帧进行预处理操作，包括人脸区域提取、图像尺寸调整以及数据归一化等处理。通过对输入数据进行规范化处理，可有效提升后续表情识别模型的稳定性和识别效果。</w:t>
       </w:r>
     </w:p>
     <w:p>
@@ -6289,21 +5825,7 @@
         <w:rPr>
           <w:rFonts w:hint="eastAsia"/>
         </w:rPr>
-        <w:t>表情识别模块是系统的核心模块，主要负责对预处理后的人脸图像进行特征提取与表情分类。该模块基于轻量化卷积神经网络模型实现，在保证识别精度的同时降低模型的计算复杂度，以满足</w:t>
-      </w:r>
-      <w:proofErr w:type="gramStart"/>
-      <w:r>
-        <w:rPr>
-          <w:rFonts w:hint="eastAsia"/>
-        </w:rPr>
-        <w:t>端侧设备</w:t>
-      </w:r>
-      <w:proofErr w:type="gramEnd"/>
-      <w:r>
-        <w:rPr>
-          <w:rFonts w:hint="eastAsia"/>
-        </w:rPr>
-        <w:t>的运行需求。</w:t>
+        <w:t>表情识别模块是系统的核心模块，主要负责对预处理后的人脸图像进行特征提取与表情分类。该模块基于轻量化卷积神经网络模型实现，在保证识别精度的同时降低模型的计算复杂度，以满足端侧设备的运行需求。</w:t>
       </w:r>
     </w:p>
     <w:p>
@@ -6361,23 +5883,7 @@
         <w:ind w:firstLine="480"/>
       </w:pPr>
       <w:r>
-        <w:t>为</w:t>
-      </w:r>
-      <w:proofErr w:type="gramStart"/>
-      <w:r>
-        <w:t>满足端侧嵌入式</w:t>
-      </w:r>
-      <w:proofErr w:type="gramEnd"/>
-      <w:r>
-        <w:t>设备对人脸表情识别的实时性与资源受限要求，本文选取了与系统需求高度契合的关键技术手段，包括轻量化卷积神经网络、轻量级人脸检测方法以及半监督训练策略等，以提升模型在</w:t>
-      </w:r>
-      <w:proofErr w:type="gramStart"/>
-      <w:r>
-        <w:t>端侧部署</w:t>
-      </w:r>
-      <w:proofErr w:type="gramEnd"/>
-      <w:r>
-        <w:t>条件下的整体性能。</w:t>
+        <w:t>为满足端侧嵌入式设备对人脸表情识别的实时性与资源受限要求，本文选取了与系统需求高度契合的关键技术手段，包括轻量化卷积神经网络、轻量级人脸检测方法以及半监督训练策略等，以提升模型在端侧部署条件下的整体性能。</w:t>
       </w:r>
     </w:p>
     <w:p>
@@ -6433,21 +5939,7 @@
         <w:rPr>
           <w:rFonts w:hint="eastAsia"/>
         </w:rPr>
-        <w:t>在人脸表情识别任务中，卷积神经网络通常通过多层卷积结构对人脸图像中的局部纹理信息和整体结构特征进行逐层提取，从而实现对不同表情类别的有效区分。然而，随着网络层数和参数规模的不断增加，传统卷积神经网络模型在计算复杂度和存储开销方面逐渐增大，这在一定程度上限制了其在</w:t>
-      </w:r>
-      <w:proofErr w:type="gramStart"/>
-      <w:r>
-        <w:rPr>
-          <w:rFonts w:hint="eastAsia"/>
-        </w:rPr>
-        <w:t>端侧设备</w:t>
-      </w:r>
-      <w:proofErr w:type="gramEnd"/>
-      <w:r>
-        <w:rPr>
-          <w:rFonts w:hint="eastAsia"/>
-        </w:rPr>
-        <w:t>中的实际应用。</w:t>
+        <w:t>在人脸表情识别任务中，卷积神经网络通常通过多层卷积结构对人脸图像中的局部纹理信息和整体结构特征进行逐层提取，从而实现对不同表情类别的有效区分。然而，随着网络层数和参数规模的不断增加，传统卷积神经网络模型在计算复杂度和存储开销方面逐渐增大，这在一定程度上限制了其在端侧设备中的实际应用。</w:t>
       </w:r>
     </w:p>
     <w:p>
@@ -6468,21 +5960,7 @@
         <w:rPr>
           <w:rFonts w:hint="eastAsia"/>
         </w:rPr>
-        <w:t>人脸检测作为表情识别的前置模块，其检测速度和准确性直接影响后续识别效果和系统整体性能。</w:t>
-      </w:r>
-      <w:proofErr w:type="gramStart"/>
-      <w:r>
-        <w:rPr>
-          <w:rFonts w:hint="eastAsia"/>
-        </w:rPr>
-        <w:t>在端侧实时</w:t>
-      </w:r>
-      <w:proofErr w:type="gramEnd"/>
-      <w:r>
-        <w:rPr>
-          <w:rFonts w:hint="eastAsia"/>
-        </w:rPr>
-        <w:t>推理条件下，传统基于多阶段深度学习的人脸检测方法往往存在较高计算开销，不适合资源受限设备。</w:t>
+        <w:t>人脸检测作为表情识别的前置模块，其检测速度和准确性直接影响后续识别效果和系统整体性能。在端侧实时推理条件下，传统基于多阶段深度学习的人脸检测方法往往存在较高计算开销，不适合资源受限设备。</w:t>
       </w:r>
     </w:p>
     <w:p>
@@ -6688,21 +6166,7 @@
         <w:rPr>
           <w:rFonts w:hint="eastAsia"/>
         </w:rPr>
-        <w:t>为满足资源受限平台上的实时人脸表情识别应用需求，本文面向“视频采集—人脸检测与对齐—表情分类—结果展示与记录”</w:t>
-      </w:r>
-      <w:proofErr w:type="gramStart"/>
-      <w:r>
-        <w:rPr>
-          <w:rFonts w:hint="eastAsia"/>
-        </w:rPr>
-        <w:t>的端侧推理</w:t>
-      </w:r>
-      <w:proofErr w:type="gramEnd"/>
-      <w:r>
-        <w:rPr>
-          <w:rFonts w:hint="eastAsia"/>
-        </w:rPr>
-        <w:t>链路开展系统总体设计。系统设计目标需同时兼顾识别性能与部署可行性：一方面，系统应支持不少于</w:t>
+        <w:t>为满足资源受限平台上的实时人脸表情识别应用需求，本文面向“视频采集—人脸检测与对齐—表情分类—结果展示与记录”的端侧推理链路开展系统总体设计。系统设计目标需同时兼顾识别性能与部署可行性：一方面，系统应支持不少于</w:t>
       </w:r>
       <w:r>
         <w:t>7</w:t>
@@ -6711,49 +6175,7 @@
         <w:rPr>
           <w:rFonts w:hint="eastAsia"/>
         </w:rPr>
-        <w:t>类常见表情的识别任务，并在标准数据</w:t>
-      </w:r>
-      <w:proofErr w:type="gramStart"/>
-      <w:r>
-        <w:rPr>
-          <w:rFonts w:hint="eastAsia"/>
-        </w:rPr>
-        <w:t>集条件</w:t>
-      </w:r>
-      <w:proofErr w:type="gramEnd"/>
-      <w:r>
-        <w:rPr>
-          <w:rFonts w:hint="eastAsia"/>
-        </w:rPr>
-        <w:t>下保持稳定的识别精度；另一方面，系统</w:t>
-      </w:r>
-      <w:proofErr w:type="gramStart"/>
-      <w:r>
-        <w:rPr>
-          <w:rFonts w:hint="eastAsia"/>
-        </w:rPr>
-        <w:t>需能够</w:t>
-      </w:r>
-      <w:proofErr w:type="gramEnd"/>
-      <w:r>
-        <w:rPr>
-          <w:rFonts w:hint="eastAsia"/>
-        </w:rPr>
-        <w:t>在嵌入式</w:t>
-      </w:r>
-      <w:proofErr w:type="gramStart"/>
-      <w:r>
-        <w:rPr>
-          <w:rFonts w:hint="eastAsia"/>
-        </w:rPr>
-        <w:t>端侧环境</w:t>
-      </w:r>
-      <w:proofErr w:type="gramEnd"/>
-      <w:r>
-        <w:rPr>
-          <w:rFonts w:hint="eastAsia"/>
-        </w:rPr>
-        <w:t>下对连续视频流进行实时处理，在计算资源、存储资源和功耗受限的约束下实现可持续运行，从而满足实际部署需求。</w:t>
+        <w:t>类常见表情的识别任务，并在标准数据集条件下保持稳定的识别精度；另一方面，系统需能够在嵌入式端侧环境下对连续视频流进行实时处理，在计算资源、存储资源和功耗受限的约束下实现可持续运行，从而满足实际部署需求。</w:t>
       </w:r>
     </w:p>
     <w:p>
@@ -6773,21 +6195,7 @@
         <w:rPr>
           <w:rFonts w:hint="eastAsia"/>
         </w:rPr>
-        <w:t>视频流采集、人脸区域定位、表情类别预测及结果输出等流程，同时应提供识别结果的可视化展示与必要的信息记录能力，以支持结果追溯、性能评估及后续分析等需求。上述目标与约束将作为后续模型训练配置、</w:t>
-      </w:r>
-      <w:proofErr w:type="gramStart"/>
-      <w:r>
-        <w:rPr>
-          <w:rFonts w:hint="eastAsia"/>
-        </w:rPr>
-        <w:t>端侧部署</w:t>
-      </w:r>
-      <w:proofErr w:type="gramEnd"/>
-      <w:r>
-        <w:rPr>
-          <w:rFonts w:hint="eastAsia"/>
-        </w:rPr>
-        <w:t>策略与性能测试指标设定的依据。</w:t>
+        <w:t>视频流采集、人脸区域定位、表情类别预测及结果输出等流程，同时应提供识别结果的可视化展示与必要的信息记录能力，以支持结果追溯、性能评估及后续分析等需求。上述目标与约束将作为后续模型训练配置、端侧部署策略与性能测试指标设定的依据。</w:t>
       </w:r>
     </w:p>
     <w:p>
@@ -6864,19 +6272,11 @@
       <w:r>
         <w:t>PC</w:t>
       </w:r>
-      <w:proofErr w:type="gramStart"/>
-      <w:r>
-        <w:rPr>
-          <w:rFonts w:hint="eastAsia"/>
-        </w:rPr>
-        <w:t>端算力完成</w:t>
-      </w:r>
-      <w:proofErr w:type="gramEnd"/>
-      <w:r>
-        <w:rPr>
-          <w:rFonts w:hint="eastAsia"/>
-        </w:rPr>
-        <w:t>参数优化与模型选择，同时将推理环节下沉至边缘设备，降低系统对高性能</w:t>
+      <w:r>
+        <w:rPr>
+          <w:rFonts w:hint="eastAsia"/>
+        </w:rPr>
+        <w:t>端算力完成参数优化与模型选择，同时将推理环节下沉至边缘设备，降低系统对高性能</w:t>
       </w:r>
       <w:r>
         <w:t>GPU</w:t>
@@ -6896,21 +6296,7 @@
         <w:rPr>
           <w:rFonts w:hint="eastAsia"/>
         </w:rPr>
-        <w:t>此外，系统整体采用分层组织方式，将硬件资源、数据组织、模型训练与评估、在线推理等环节进行逻辑解耦，保证训练链路与推理链路相对独立：训练链路负责模型能力提升，推理链路</w:t>
-      </w:r>
-      <w:proofErr w:type="gramStart"/>
-      <w:r>
-        <w:rPr>
-          <w:rFonts w:hint="eastAsia"/>
-        </w:rPr>
-        <w:t>负责端侧实时</w:t>
-      </w:r>
-      <w:proofErr w:type="gramEnd"/>
-      <w:r>
-        <w:rPr>
-          <w:rFonts w:hint="eastAsia"/>
-        </w:rPr>
-        <w:t>服务。</w:t>
+        <w:t>此外，系统整体采用分层组织方式，将硬件资源、数据组织、模型训练与评估、在线推理等环节进行逻辑解耦，保证训练链路与推理链路相对独立：训练链路负责模型能力提升，推理链路负责端侧实时服务。</w:t>
       </w:r>
     </w:p>
     <w:p>
@@ -6946,21 +6332,7 @@
         <w:rPr>
           <w:rFonts w:hint="eastAsia"/>
         </w:rPr>
-        <w:t>为避免系统叙述出现“结构与流程混写、内容重复”的问题，本文在总体设计中遵循模块化设计思想，</w:t>
-      </w:r>
-      <w:proofErr w:type="gramStart"/>
-      <w:r>
-        <w:rPr>
-          <w:rFonts w:hint="eastAsia"/>
-        </w:rPr>
-        <w:t>将端侧</w:t>
-      </w:r>
-      <w:proofErr w:type="gramEnd"/>
-      <w:r>
-        <w:rPr>
-          <w:rFonts w:hint="eastAsia"/>
-        </w:rPr>
-        <w:t>实时推理过程划分为图像采集模块、人脸检测与对齐模块、表情识别模块、结果输出模块等，并通过清晰的数据接口组织各模块协同工作。模块化结构能够降低功能耦合度，提升系统可维护性与可扩展性，同时为后续性能定位与鲁棒性优化提供便利。</w:t>
+        <w:t>为避免系统叙述出现“结构与流程混写、内容重复”的问题，本文在总体设计中遵循模块化设计思想，将端侧实时推理过程划分为图像采集模块、人脸检测与对齐模块、表情识别模块、结果输出模块等，并通过清晰的数据接口组织各模块协同工作。模块化结构能够降低功能耦合度，提升系统可维护性与可扩展性，同时为后续性能定位与鲁棒性优化提供便利。</w:t>
       </w:r>
       <w:r>
         <w:t>如图</w:t>
@@ -6991,11 +6363,11 @@
         <w:jc w:val="center"/>
       </w:pPr>
       <w:r>
-        <w:object w:dxaOrig="10668" w:dyaOrig="11412" w14:anchorId="6AEF381E">
-          <v:shape id="_x0000_i1026" type="#_x0000_t75" style="width:343pt;height:367pt" o:ole="">
+        <w:object w:dxaOrig="10667" w:dyaOrig="11411" w14:anchorId="6AEF381E">
+          <v:shape id="_x0000_i1028" type="#_x0000_t75" style="width:343pt;height:367pt" o:ole="">
             <v:imagedata r:id="rId21" o:title=""/>
           </v:shape>
-          <o:OLEObject Type="Embed" ProgID="Visio.Drawing.15" ShapeID="_x0000_i1026" DrawAspect="Content" ObjectID="_1832240290" r:id="rId22"/>
+          <o:OLEObject Type="Embed" ProgID="Visio.Drawing.15" ShapeID="_x0000_i1028" DrawAspect="Content" ObjectID="_1832524811" r:id="rId22"/>
         </w:object>
       </w:r>
     </w:p>
@@ -7087,21 +6459,7 @@
         <w:rPr>
           <w:rFonts w:hint="eastAsia"/>
         </w:rPr>
-        <w:t>为满足</w:t>
-      </w:r>
-      <w:proofErr w:type="gramStart"/>
-      <w:r>
-        <w:rPr>
-          <w:rFonts w:hint="eastAsia"/>
-        </w:rPr>
-        <w:t>端侧设备算力</w:t>
-      </w:r>
-      <w:proofErr w:type="gramEnd"/>
-      <w:r>
-        <w:rPr>
-          <w:rFonts w:hint="eastAsia"/>
-        </w:rPr>
-        <w:t>受限条件下的实时人脸表情识别需求，本文系统按照“数据—训练—评估—端侧推理”的工程闭环进行模块化设计。系统整体遵循“检测</w:t>
+        <w:t>为满足端侧设备算力受限条件下的实时人脸表情识别需求，本文系统按照“数据—训练—评估—端侧推理”的工程闭环进行模块化设计。系统整体遵循“检测</w:t>
       </w:r>
       <w:r>
         <w:rPr>
@@ -7125,21 +6483,7 @@
         <w:rPr>
           <w:rFonts w:hint="eastAsia"/>
         </w:rPr>
-        <w:t>记录”的处理链路，以保证从离线训练到</w:t>
-      </w:r>
-      <w:proofErr w:type="gramStart"/>
-      <w:r>
-        <w:rPr>
-          <w:rFonts w:hint="eastAsia"/>
-        </w:rPr>
-        <w:t>端侧部署</w:t>
-      </w:r>
-      <w:proofErr w:type="gramEnd"/>
-      <w:r>
-        <w:rPr>
-          <w:rFonts w:hint="eastAsia"/>
-        </w:rPr>
-        <w:t>的流程一致性与可复现性</w:t>
+        <w:t>记录”的处理链路，以保证从离线训练到端侧部署的流程一致性与可复现性</w:t>
       </w:r>
       <w:r>
         <w:rPr>
@@ -7180,21 +6524,7 @@
         <w:rPr>
           <w:rFonts w:hint="eastAsia"/>
         </w:rPr>
-        <w:t>数据</w:t>
-      </w:r>
-      <w:proofErr w:type="gramStart"/>
-      <w:r>
-        <w:rPr>
-          <w:rFonts w:hint="eastAsia"/>
-        </w:rPr>
-        <w:t>层负责</w:t>
-      </w:r>
-      <w:proofErr w:type="gramEnd"/>
-      <w:r>
-        <w:rPr>
-          <w:rFonts w:hint="eastAsia"/>
-        </w:rPr>
-        <w:t>统一管理训练与评测所需的数据资源，并以结构化文件（</w:t>
+        <w:t>数据层负责统一管理训练与评测所需的数据资源，并以结构化文件（</w:t>
       </w:r>
       <w:r>
         <w:rPr>
@@ -7405,41 +6735,13 @@
         <w:rPr>
           <w:rFonts w:hint="eastAsia"/>
         </w:rPr>
-        <w:t>train/</w:t>
-      </w:r>
-      <w:proofErr w:type="spellStart"/>
-      <w:r>
-        <w:rPr>
-          <w:rFonts w:hint="eastAsia"/>
-        </w:rPr>
-        <w:t>val</w:t>
-      </w:r>
-      <w:proofErr w:type="spellEnd"/>
-      <w:r>
-        <w:rPr>
-          <w:rFonts w:hint="eastAsia"/>
-        </w:rPr>
-        <w:t>/test</w:t>
-      </w:r>
-      <w:r>
-        <w:rPr>
-          <w:rFonts w:hint="eastAsia"/>
-        </w:rPr>
-        <w:t>，</w:t>
-      </w:r>
-      <w:proofErr w:type="gramStart"/>
-      <w:r>
-        <w:rPr>
-          <w:rFonts w:hint="eastAsia"/>
-        </w:rPr>
-        <w:t>不</w:t>
-      </w:r>
-      <w:proofErr w:type="gramEnd"/>
-      <w:r>
-        <w:rPr>
-          <w:rFonts w:hint="eastAsia"/>
-        </w:rPr>
-        <w:t>加载</w:t>
+        <w:t>train/val/test</w:t>
+      </w:r>
+      <w:r>
+        <w:rPr>
+          <w:rFonts w:hint="eastAsia"/>
+        </w:rPr>
+        <w:t>，不加载</w:t>
       </w:r>
       <w:r>
         <w:rPr>
@@ -7603,35 +6905,7 @@
         <w:rPr>
           <w:rFonts w:hint="eastAsia"/>
         </w:rPr>
-        <w:t>后通过</w:t>
-      </w:r>
-      <w:proofErr w:type="gramStart"/>
-      <w:r>
-        <w:rPr>
-          <w:rFonts w:hint="eastAsia"/>
-        </w:rPr>
-        <w:t>幂</w:t>
-      </w:r>
-      <w:proofErr w:type="gramEnd"/>
-      <w:r>
-        <w:rPr>
-          <w:rFonts w:hint="eastAsia"/>
-        </w:rPr>
-        <w:t>次变换与缩放得到样本权重，从而降低</w:t>
-      </w:r>
-      <w:proofErr w:type="gramStart"/>
-      <w:r>
-        <w:rPr>
-          <w:rFonts w:hint="eastAsia"/>
-        </w:rPr>
-        <w:t>低置信度伪标签</w:t>
-      </w:r>
-      <w:proofErr w:type="gramEnd"/>
-      <w:r>
-        <w:rPr>
-          <w:rFonts w:hint="eastAsia"/>
-        </w:rPr>
-        <w:t>对模型的负面影响。同时，在训练配置中提供了伪标签渐进引入（</w:t>
+        <w:t>后通过幂次变换与缩放得到样本权重，从而降低低置信度伪标签对模型的负面影响。同时，在训练配置中提供了伪标签渐进引入（</w:t>
       </w:r>
       <w:r>
         <w:rPr>
@@ -7643,21 +6917,7 @@
         <w:rPr>
           <w:rFonts w:hint="eastAsia"/>
         </w:rPr>
-        <w:t>）、置信度</w:t>
-      </w:r>
-      <w:proofErr w:type="gramStart"/>
-      <w:r>
-        <w:rPr>
-          <w:rFonts w:hint="eastAsia"/>
-        </w:rPr>
-        <w:t>幂</w:t>
-      </w:r>
-      <w:proofErr w:type="gramEnd"/>
-      <w:r>
-        <w:rPr>
-          <w:rFonts w:hint="eastAsia"/>
-        </w:rPr>
-        <w:t>次与整体损失权重等参数，用于在性能提升与训练稳定性之间取得平衡。</w:t>
+        <w:t>）、置信度幂次与整体损失权重等参数，用于在性能提升与训练稳定性之间取得平衡。</w:t>
       </w:r>
     </w:p>
     <w:p>
@@ -7680,21 +6940,7 @@
         <w:rPr>
           <w:rFonts w:hint="eastAsia"/>
         </w:rPr>
-        <w:t>模型评估与分析</w:t>
-      </w:r>
-      <w:proofErr w:type="gramStart"/>
-      <w:r>
-        <w:rPr>
-          <w:rFonts w:hint="eastAsia"/>
-        </w:rPr>
-        <w:t>层用于</w:t>
-      </w:r>
-      <w:proofErr w:type="gramEnd"/>
-      <w:r>
-        <w:rPr>
-          <w:rFonts w:hint="eastAsia"/>
-        </w:rPr>
-        <w:t>在验证集与测试集上对训练得到的模型进行定量评估，并输出可用于论文撰写的分析材料。该层的功能包括：</w:t>
+        <w:t>模型评估与分析层用于在验证集与测试集上对训练得到的模型进行定量评估，并输出可用于论文撰写的分析材料。该层的功能包括：</w:t>
       </w:r>
     </w:p>
     <w:p>
@@ -7713,19 +6959,11 @@
         </w:rPr>
         <w:t>对模型在</w:t>
       </w:r>
-      <w:proofErr w:type="spellStart"/>
-      <w:r>
-        <w:rPr>
-          <w:rFonts w:hint="eastAsia"/>
-        </w:rPr>
-        <w:t>val</w:t>
-      </w:r>
-      <w:proofErr w:type="spellEnd"/>
-      <w:r>
-        <w:rPr>
-          <w:rFonts w:hint="eastAsia"/>
-        </w:rPr>
-        <w:t>/test</w:t>
+      <w:r>
+        <w:rPr>
+          <w:rFonts w:hint="eastAsia"/>
+        </w:rPr>
+        <w:t>val/test</w:t>
       </w:r>
       <w:r>
         <w:rPr>
@@ -7799,35 +7037,7 @@
         <w:rPr>
           <w:rFonts w:hint="eastAsia"/>
         </w:rPr>
-        <w:t>在线推理与应用层面</w:t>
-      </w:r>
-      <w:proofErr w:type="gramStart"/>
-      <w:r>
-        <w:rPr>
-          <w:rFonts w:hint="eastAsia"/>
-        </w:rPr>
-        <w:t>向端侧</w:t>
-      </w:r>
-      <w:proofErr w:type="gramEnd"/>
-      <w:r>
-        <w:rPr>
-          <w:rFonts w:hint="eastAsia"/>
-        </w:rPr>
-        <w:t>实时场景运行，负责把离线训练得到的模型部署到嵌入式设备上，实现“视频采集—人脸检测—表情分类—结果展示”的闭环。</w:t>
-      </w:r>
-      <w:proofErr w:type="gramStart"/>
-      <w:r>
-        <w:rPr>
-          <w:rFonts w:hint="eastAsia"/>
-        </w:rPr>
-        <w:t>结合毕设的</w:t>
-      </w:r>
-      <w:proofErr w:type="gramEnd"/>
-      <w:r>
-        <w:rPr>
-          <w:rFonts w:hint="eastAsia"/>
-        </w:rPr>
-        <w:t>总体目标，该层主要包含以下关键功能：</w:t>
+        <w:t>在线推理与应用层面向端侧实时场景运行，负责把离线训练得到的模型部署到嵌入式设备上，实现“视频采集—人脸检测—表情分类—结果展示”的闭环。结合毕设的总体目标，该层主要包含以下关键功能：</w:t>
       </w:r>
     </w:p>
     <w:p>
@@ -7873,21 +7083,7 @@
         <w:rPr>
           <w:rFonts w:hint="eastAsia"/>
         </w:rPr>
-        <w:t>裁剪：对输入</w:t>
-      </w:r>
-      <w:proofErr w:type="gramStart"/>
-      <w:r>
-        <w:rPr>
-          <w:rFonts w:hint="eastAsia"/>
-        </w:rPr>
-        <w:t>帧</w:t>
-      </w:r>
-      <w:proofErr w:type="gramEnd"/>
-      <w:r>
-        <w:rPr>
-          <w:rFonts w:hint="eastAsia"/>
-        </w:rPr>
-        <w:t>进行人脸定位并裁剪出人脸区域，为表情分类提供更纯净的输入（检测是表情识别的前置基础环节，直接影响后续分类可靠性）；</w:t>
+        <w:t>裁剪：对输入帧进行人脸定位并裁剪出人脸区域，为表情分类提供更纯净的输入（检测是表情识别的前置基础环节，直接影响后续分类可靠性）；</w:t>
       </w:r>
     </w:p>
     <w:p>
@@ -7918,19 +7114,11 @@
         </w:rPr>
         <w:t>类表情预测。分类模型构建接口采用统一的</w:t>
       </w:r>
-      <w:proofErr w:type="spellStart"/>
-      <w:r>
-        <w:rPr>
-          <w:rFonts w:hint="eastAsia"/>
-        </w:rPr>
-        <w:t>get_model</w:t>
-      </w:r>
-      <w:proofErr w:type="spellEnd"/>
-      <w:r>
-        <w:rPr>
-          <w:rFonts w:hint="eastAsia"/>
-        </w:rPr>
-        <w:t>()</w:t>
+      <w:r>
+        <w:rPr>
+          <w:rFonts w:hint="eastAsia"/>
+        </w:rPr>
+        <w:t>get_model()</w:t>
       </w:r>
       <w:r>
         <w:rPr>
@@ -8012,21 +7200,7 @@
         <w:rPr>
           <w:rFonts w:hint="eastAsia"/>
         </w:rPr>
-        <w:t>3.2.5 模块</w:t>
-      </w:r>
-      <w:proofErr w:type="gramStart"/>
-      <w:r>
-        <w:rPr>
-          <w:rFonts w:hint="eastAsia"/>
-        </w:rPr>
-        <w:t>间关键</w:t>
-      </w:r>
-      <w:proofErr w:type="gramEnd"/>
-      <w:r>
-        <w:rPr>
-          <w:rFonts w:hint="eastAsia"/>
-        </w:rPr>
-        <w:t>接口与数据流说明</w:t>
+        <w:t>3.2.5 模块间关键接口与数据流说明</w:t>
       </w:r>
     </w:p>
     <w:p>
@@ -8214,33 +7388,11 @@
         <w:lastRenderedPageBreak/>
         <w:t>模型构建接口：通过</w:t>
       </w:r>
-      <w:proofErr w:type="spellStart"/>
-      <w:r>
-        <w:rPr>
-          <w:rFonts w:hint="eastAsia"/>
-        </w:rPr>
-        <w:t>get_model</w:t>
-      </w:r>
-      <w:proofErr w:type="spellEnd"/>
-      <w:r>
-        <w:rPr>
-          <w:rFonts w:hint="eastAsia"/>
-        </w:rPr>
-        <w:t>(</w:t>
-      </w:r>
-      <w:proofErr w:type="spellStart"/>
-      <w:r>
-        <w:rPr>
-          <w:rFonts w:hint="eastAsia"/>
-        </w:rPr>
-        <w:t>variant,num_classes,pretrained,device</w:t>
-      </w:r>
-      <w:proofErr w:type="spellEnd"/>
-      <w:r>
-        <w:rPr>
-          <w:rFonts w:hint="eastAsia"/>
-        </w:rPr>
-        <w:t>)</w:t>
+      <w:r>
+        <w:rPr>
+          <w:rFonts w:hint="eastAsia"/>
+        </w:rPr>
+        <w:t>get_model(variant,num_classes,pretrained,device)</w:t>
       </w:r>
       <w:r>
         <w:rPr>
@@ -8339,21 +7491,7 @@
         <w:rPr>
           <w:rFonts w:hint="eastAsia"/>
         </w:rPr>
-        <w:t>在线推理流程</w:t>
-      </w:r>
-      <w:proofErr w:type="gramStart"/>
-      <w:r>
-        <w:rPr>
-          <w:rFonts w:hint="eastAsia"/>
-        </w:rPr>
-        <w:t>面向端侧实时</w:t>
-      </w:r>
-      <w:proofErr w:type="gramEnd"/>
-      <w:r>
-        <w:rPr>
-          <w:rFonts w:hint="eastAsia"/>
-        </w:rPr>
-        <w:t>应用场景，以摄像头视频流为输入，在树莓派</w:t>
+        <w:t>在线推理流程面向端侧实时应用场景，以摄像头视频流为输入，在树莓派</w:t>
       </w:r>
       <w:r>
         <w:rPr>
@@ -8365,21 +7503,7 @@
         <w:rPr>
           <w:rFonts w:hint="eastAsia"/>
         </w:rPr>
-        <w:t>上完成“人脸检测—人脸区域提取—表情分类—结果输出”的连续处理。为</w:t>
-      </w:r>
-      <w:proofErr w:type="gramStart"/>
-      <w:r>
-        <w:rPr>
-          <w:rFonts w:hint="eastAsia"/>
-        </w:rPr>
-        <w:t>保证端侧推理</w:t>
-      </w:r>
-      <w:proofErr w:type="gramEnd"/>
-      <w:r>
-        <w:rPr>
-          <w:rFonts w:hint="eastAsia"/>
-        </w:rPr>
-        <w:t>链路具备可解释性与可复现性，本文将在线推理过程抽象为若干顺序执行的步骤，并以模块间数据流作为主线组织叙述。</w:t>
+        <w:t>上完成“人脸检测—人脸区域提取—表情分类—结果输出”的连续处理。为保证端侧推理链路具备可解释性与可复现性，本文将在线推理过程抽象为若干顺序执行的步骤，并以模块间数据流作为主线组织叙述。</w:t>
       </w:r>
     </w:p>
     <w:p>
@@ -8413,21 +7537,7 @@
         <w:rPr>
           <w:rFonts w:hint="eastAsia"/>
         </w:rPr>
-        <w:t>视频</w:t>
-      </w:r>
-      <w:proofErr w:type="gramStart"/>
-      <w:r>
-        <w:rPr>
-          <w:rFonts w:hint="eastAsia"/>
-        </w:rPr>
-        <w:t>帧</w:t>
-      </w:r>
-      <w:proofErr w:type="gramEnd"/>
-      <w:r>
-        <w:rPr>
-          <w:rFonts w:hint="eastAsia"/>
-        </w:rPr>
-        <w:t>采集：从摄像头持续获取视频帧，作为后续检测模块的输入。</w:t>
+        <w:t>视频帧采集：从摄像头持续获取视频帧，作为后续检测模块的输入。</w:t>
       </w:r>
     </w:p>
     <w:p>
@@ -8482,21 +7592,7 @@
         <w:rPr>
           <w:rFonts w:hint="eastAsia"/>
         </w:rPr>
-        <w:t>提取与预处理：根据检测输出在</w:t>
-      </w:r>
-      <w:proofErr w:type="gramStart"/>
-      <w:r>
-        <w:rPr>
-          <w:rFonts w:hint="eastAsia"/>
-        </w:rPr>
-        <w:t>原始帧中裁剪</w:t>
-      </w:r>
-      <w:proofErr w:type="gramEnd"/>
-      <w:r>
-        <w:rPr>
-          <w:rFonts w:hint="eastAsia"/>
-        </w:rPr>
-        <w:t>人脸区域，进行尺寸变换与归一化处理，生成表情分类网络需要的输入张量。为保证训练与推理的一致性，预处理阶段采用与训练阶段相同的归一化规范，以减小域偏移对分类性能的影响。</w:t>
+        <w:t>提取与预处理：根据检测输出在原始帧中裁剪人脸区域，进行尺寸变换与归一化处理，生成表情分类网络需要的输入张量。为保证训练与推理的一致性，预处理阶段采用与训练阶段相同的归一化规范，以减小域偏移对分类性能的影响。</w:t>
       </w:r>
     </w:p>
     <w:p>
@@ -8539,15 +7635,7 @@
         <w:t xml:space="preserve"> </w:t>
       </w:r>
       <w:r>
-        <w:t>结果展示与记录：在</w:t>
-      </w:r>
-      <w:proofErr w:type="gramStart"/>
-      <w:r>
-        <w:t>视频帧上叠加</w:t>
-      </w:r>
-      <w:proofErr w:type="gramEnd"/>
-      <w:r>
-        <w:t>绘制人脸框、表情类别、置信度，并可选写入日志用于回放分析。</w:t>
+        <w:t>结果展示与记录：在视频帧上叠加绘制人脸框、表情类别、置信度，并可选写入日志用于回放分析。</w:t>
       </w:r>
     </w:p>
     <w:p>
@@ -8753,19 +7841,11 @@
         </w:rPr>
         <w:t>测试评估与结果导出：在</w:t>
       </w:r>
-      <w:proofErr w:type="spellStart"/>
-      <w:r>
-        <w:rPr>
-          <w:rFonts w:hint="eastAsia"/>
-        </w:rPr>
-        <w:t>val</w:t>
-      </w:r>
-      <w:proofErr w:type="spellEnd"/>
-      <w:r>
-        <w:rPr>
-          <w:rFonts w:hint="eastAsia"/>
-        </w:rPr>
-        <w:t>/test</w:t>
+      <w:r>
+        <w:rPr>
+          <w:rFonts w:hint="eastAsia"/>
+        </w:rPr>
+        <w:t>val/test</w:t>
       </w:r>
       <w:r>
         <w:rPr>
@@ -8817,21 +7897,7 @@
         <w:rPr>
           <w:rFonts w:hint="eastAsia"/>
         </w:rPr>
-        <w:t>为主要端侧推理平台，采用“图像采集—人脸检测—表情识别—结果展示”的在线流水线方式运行。</w:t>
-      </w:r>
-      <w:proofErr w:type="gramStart"/>
-      <w:r>
-        <w:rPr>
-          <w:rFonts w:hint="eastAsia"/>
-        </w:rPr>
-        <w:t>根据端侧实时</w:t>
-      </w:r>
-      <w:proofErr w:type="gramEnd"/>
-      <w:r>
-        <w:rPr>
-          <w:rFonts w:hint="eastAsia"/>
-        </w:rPr>
-        <w:t>性要求，系统在每帧图像到达后按以下步骤执行：</w:t>
+        <w:t>为主要端侧推理平台，采用“图像采集—人脸检测—表情识别—结果展示”的在线流水线方式运行。根据端侧实时性要求，系统在每帧图像到达后按以下步骤执行：</w:t>
       </w:r>
     </w:p>
     <w:p>
@@ -8860,21 +7926,7 @@
         <w:rPr>
           <w:rFonts w:hint="eastAsia"/>
         </w:rPr>
-        <w:t>初始化摄像头并在主循环</w:t>
-      </w:r>
-      <w:proofErr w:type="gramStart"/>
-      <w:r>
-        <w:rPr>
-          <w:rFonts w:hint="eastAsia"/>
-        </w:rPr>
-        <w:t>中逐帧读取</w:t>
-      </w:r>
-      <w:proofErr w:type="gramEnd"/>
-      <w:r>
-        <w:rPr>
-          <w:rFonts w:hint="eastAsia"/>
-        </w:rPr>
-        <w:t>图像帧。</w:t>
+        <w:t>初始化摄像头并在主循环中逐帧读取图像帧。</w:t>
       </w:r>
     </w:p>
     <w:p>
@@ -8888,21 +7940,7 @@
         <w:rPr>
           <w:rFonts w:hint="eastAsia"/>
         </w:rPr>
-        <w:t>人脸检测与定位：对当前</w:t>
-      </w:r>
-      <w:proofErr w:type="gramStart"/>
-      <w:r>
-        <w:rPr>
-          <w:rFonts w:hint="eastAsia"/>
-        </w:rPr>
-        <w:t>帧</w:t>
-      </w:r>
-      <w:proofErr w:type="gramEnd"/>
-      <w:r>
-        <w:rPr>
-          <w:rFonts w:hint="eastAsia"/>
-        </w:rPr>
-        <w:t>进行人脸检测，输出人脸框坐标集合。系统优先采用</w:t>
+        <w:t>人脸检测与定位：对当前帧进行人脸检测，输出人脸框坐标集合。系统优先采用</w:t>
       </w:r>
       <w:r>
         <w:t xml:space="preserve"> YuNet</w:t>
@@ -8914,13 +7952,8 @@
         <w:t>检测器（</w:t>
       </w:r>
       <w:r>
-        <w:t xml:space="preserve">OpenCV </w:t>
-      </w:r>
-      <w:proofErr w:type="spellStart"/>
-      <w:r>
-        <w:t>FaceDetectorYN</w:t>
-      </w:r>
-      <w:proofErr w:type="spellEnd"/>
+        <w:t>OpenCV FaceDetectorYN</w:t>
+      </w:r>
       <w:r>
         <w:rPr>
           <w:rFonts w:hint="eastAsia"/>
@@ -8954,21 +7987,7 @@
         <w:rPr>
           <w:rFonts w:hint="eastAsia"/>
         </w:rPr>
-        <w:t>时，系统将输入尺寸动态设置为当前</w:t>
-      </w:r>
-      <w:proofErr w:type="gramStart"/>
-      <w:r>
-        <w:rPr>
-          <w:rFonts w:hint="eastAsia"/>
-        </w:rPr>
-        <w:t>帧</w:t>
-      </w:r>
-      <w:proofErr w:type="gramEnd"/>
-      <w:r>
-        <w:rPr>
-          <w:rFonts w:hint="eastAsia"/>
-        </w:rPr>
-        <w:t>大小，并设置检测阈值与</w:t>
+        <w:t>时，系统将输入尺寸动态设置为当前帧大小，并设置检测阈值与</w:t>
       </w:r>
       <w:r>
         <w:t>NMS</w:t>
@@ -8977,21 +7996,7 @@
         <w:rPr>
           <w:rFonts w:hint="eastAsia"/>
         </w:rPr>
-        <w:t>阈值，过滤低置信度或过小的人脸框，从而</w:t>
-      </w:r>
-      <w:proofErr w:type="gramStart"/>
-      <w:r>
-        <w:rPr>
-          <w:rFonts w:hint="eastAsia"/>
-        </w:rPr>
-        <w:t>提升端侧推理</w:t>
-      </w:r>
-      <w:proofErr w:type="gramEnd"/>
-      <w:r>
-        <w:rPr>
-          <w:rFonts w:hint="eastAsia"/>
-        </w:rPr>
-        <w:t>稳定性。</w:t>
+        <w:t>阈值，过滤低置信度或过小的人脸框，从而提升端侧推理稳定性。</w:t>
       </w:r>
     </w:p>
     <w:p>
@@ -9057,30 +8062,14 @@
         </w:rPr>
         <w:t>，并经</w:t>
       </w:r>
-      <w:proofErr w:type="spellStart"/>
       <w:r>
         <w:t>Softmax</w:t>
       </w:r>
-      <w:proofErr w:type="spellEnd"/>
-      <w:r>
-        <w:rPr>
-          <w:rFonts w:hint="eastAsia"/>
-        </w:rPr>
-        <w:t>得到类别概率，取最大概率对应类别作为预测表情，同时保留置信</w:t>
-      </w:r>
-      <w:proofErr w:type="gramStart"/>
-      <w:r>
-        <w:rPr>
-          <w:rFonts w:hint="eastAsia"/>
-        </w:rPr>
-        <w:t>度用于</w:t>
-      </w:r>
-      <w:proofErr w:type="gramEnd"/>
-      <w:r>
-        <w:rPr>
-          <w:rFonts w:hint="eastAsia"/>
-        </w:rPr>
-        <w:t>后续稳定策略。</w:t>
+      <w:r>
+        <w:rPr>
+          <w:rFonts w:hint="eastAsia"/>
+        </w:rPr>
+        <w:t>得到类别概率，取最大概率对应类别作为预测表情，同时保留置信度用于后续稳定策略。</w:t>
       </w:r>
     </w:p>
     <w:p>
@@ -9094,27 +8083,11 @@
         <w:rPr>
           <w:rFonts w:hint="eastAsia"/>
         </w:rPr>
-        <w:t>结果稳定与输出显示：针对视频流</w:t>
-      </w:r>
-      <w:proofErr w:type="gramStart"/>
-      <w:r>
-        <w:rPr>
-          <w:rFonts w:hint="eastAsia"/>
-        </w:rPr>
-        <w:t>逐帧预测易</w:t>
-      </w:r>
-      <w:proofErr w:type="gramEnd"/>
-      <w:r>
-        <w:rPr>
-          <w:rFonts w:hint="eastAsia"/>
-        </w:rPr>
-        <w:t>出现抖动的问题，系统设计表情追踪稳定器（</w:t>
-      </w:r>
-      <w:proofErr w:type="spellStart"/>
+        <w:t>结果稳定与输出显示：针对视频流逐帧预测易出现抖动的问题，系统设计表情追踪稳定器（</w:t>
+      </w:r>
       <w:r>
         <w:t>EmotionTracker</w:t>
       </w:r>
-      <w:proofErr w:type="spellEnd"/>
       <w:r>
         <w:rPr>
           <w:rFonts w:hint="eastAsia"/>
@@ -9274,16 +8247,8 @@
         <w:rPr>
           <w:rFonts w:hint="eastAsia"/>
         </w:rPr>
-        <w:t>输入：当前</w:t>
-      </w:r>
-      <w:proofErr w:type="gramStart"/>
-      <w:r>
-        <w:rPr>
-          <w:rFonts w:hint="eastAsia"/>
-        </w:rPr>
-        <w:t>帧</w:t>
-      </w:r>
-      <w:proofErr w:type="gramEnd"/>
+        <w:t>输入：当前帧</w:t>
+      </w:r>
       <w:r>
         <w:rPr>
           <w:rFonts w:hint="eastAsia"/>
@@ -9305,21 +8270,7 @@
         <w:rPr>
           <w:rFonts w:hint="eastAsia"/>
         </w:rPr>
-        <w:t>faces=[(</w:t>
-      </w:r>
-      <w:proofErr w:type="spellStart"/>
-      <w:r>
-        <w:rPr>
-          <w:rFonts w:hint="eastAsia"/>
-        </w:rPr>
-        <w:t>x,y,w,h</w:t>
-      </w:r>
-      <w:proofErr w:type="spellEnd"/>
-      <w:r>
-        <w:rPr>
-          <w:rFonts w:hint="eastAsia"/>
-        </w:rPr>
-        <w:t>),...]</w:t>
+        <w:t>faces=[(x,y,w,h),...]</w:t>
       </w:r>
     </w:p>
     <w:p>
@@ -9344,19 +8295,11 @@
       <w:r>
         <w:t>YuNet</w:t>
       </w:r>
-      <w:proofErr w:type="gramStart"/>
-      <w:r>
-        <w:rPr>
-          <w:rFonts w:hint="eastAsia"/>
-        </w:rPr>
-        <w:t>不</w:t>
-      </w:r>
-      <w:proofErr w:type="gramEnd"/>
-      <w:r>
-        <w:rPr>
-          <w:rFonts w:hint="eastAsia"/>
-        </w:rPr>
-        <w:t>可用时切换</w:t>
+      <w:r>
+        <w:rPr>
+          <w:rFonts w:hint="eastAsia"/>
+        </w:rPr>
+        <w:t>不可用时切换</w:t>
       </w:r>
       <w:r>
         <w:t>Haar</w:t>
@@ -9458,14 +8401,12 @@
         </w:rPr>
         <w:t>图像</w:t>
       </w:r>
-      <w:proofErr w:type="spellStart"/>
       <w:r>
         <w:rPr>
           <w:rFonts w:hint="eastAsia"/>
         </w:rPr>
         <w:t>face_img</w:t>
       </w:r>
-      <w:proofErr w:type="spellEnd"/>
     </w:p>
     <w:p>
       <w:pPr>
@@ -9477,89 +8418,274 @@
         </w:rPr>
         <w:t>输出：模型输入张量</w:t>
       </w:r>
-      <w:proofErr w:type="spellStart"/>
+      <w:r>
+        <w:rPr>
+          <w:rFonts w:hint="eastAsia"/>
+        </w:rPr>
+        <w:t>img_tensor(1</w:t>
+      </w:r>
+      <w:r>
+        <w:rPr>
+          <w:rFonts w:hint="eastAsia"/>
+        </w:rPr>
+        <w:t>×</w:t>
+      </w:r>
+      <w:r>
+        <w:rPr>
+          <w:rFonts w:hint="eastAsia"/>
+        </w:rPr>
+        <w:t>3</w:t>
+      </w:r>
+      <w:r>
+        <w:rPr>
+          <w:rFonts w:hint="eastAsia"/>
+        </w:rPr>
+        <w:t>×</w:t>
+      </w:r>
+      <w:r>
+        <w:rPr>
+          <w:rFonts w:hint="eastAsia"/>
+        </w:rPr>
+        <w:t>224</w:t>
+      </w:r>
+      <w:r>
+        <w:rPr>
+          <w:rFonts w:hint="eastAsia"/>
+        </w:rPr>
+        <w:t>×</w:t>
+      </w:r>
+      <w:r>
+        <w:rPr>
+          <w:rFonts w:hint="eastAsia"/>
+        </w:rPr>
+        <w:t>224)</w:t>
+      </w:r>
+    </w:p>
+    <w:p>
+      <w:pPr>
+        <w:ind w:firstLine="480"/>
+      </w:pPr>
+      <w:r>
+        <w:rPr>
+          <w:rFonts w:hint="eastAsia"/>
+        </w:rPr>
+        <w:t>说明：包含</w:t>
+      </w:r>
+      <w:r>
+        <w:t>Resize</w:t>
+      </w:r>
+      <w:r>
+        <w:rPr>
+          <w:rFonts w:hint="eastAsia"/>
+        </w:rPr>
+        <w:t>、</w:t>
+      </w:r>
+      <w:r>
+        <w:t>ToTensor</w:t>
+      </w:r>
+      <w:r>
+        <w:rPr>
+          <w:rFonts w:hint="eastAsia"/>
+        </w:rPr>
+        <w:t>与</w:t>
+      </w:r>
+      <w:r>
+        <w:t>Normalize</w:t>
+      </w:r>
+      <w:r>
+        <w:rPr>
+          <w:rFonts w:hint="eastAsia"/>
+        </w:rPr>
+        <w:t>，尽量与训练阶段预处理保持一致，以降低部署域偏移风险。</w:t>
+      </w:r>
+    </w:p>
+    <w:p>
+      <w:pPr>
+        <w:ind w:firstLine="480"/>
+      </w:pPr>
+      <w:r>
+        <w:rPr>
+          <w:rFonts w:hint="eastAsia"/>
+        </w:rPr>
+        <w:t xml:space="preserve">4. </w:t>
+      </w:r>
+      <w:r>
+        <w:rPr>
+          <w:rFonts w:hint="eastAsia"/>
+        </w:rPr>
+        <w:t>表情识别接口（</w:t>
+      </w:r>
+      <w:r>
+        <w:rPr>
+          <w:rFonts w:hint="eastAsia"/>
+        </w:rPr>
+        <w:t>Expression Inference Interface</w:t>
+      </w:r>
+      <w:r>
+        <w:rPr>
+          <w:rFonts w:hint="eastAsia"/>
+        </w:rPr>
+        <w:t>）</w:t>
+      </w:r>
+    </w:p>
+    <w:p>
+      <w:pPr>
+        <w:ind w:firstLine="480"/>
+      </w:pPr>
+      <w:r>
+        <w:rPr>
+          <w:rFonts w:hint="eastAsia"/>
+        </w:rPr>
+        <w:t>输入：</w:t>
+      </w:r>
       <w:r>
         <w:rPr>
           <w:rFonts w:hint="eastAsia"/>
         </w:rPr>
         <w:t>img_tensor</w:t>
       </w:r>
-      <w:proofErr w:type="spellEnd"/>
-      <w:r>
-        <w:rPr>
-          <w:rFonts w:hint="eastAsia"/>
-        </w:rPr>
-        <w:t>(1</w:t>
-      </w:r>
-      <w:r>
-        <w:rPr>
-          <w:rFonts w:hint="eastAsia"/>
-        </w:rPr>
-        <w:t>×</w:t>
-      </w:r>
-      <w:r>
-        <w:rPr>
-          <w:rFonts w:hint="eastAsia"/>
-        </w:rPr>
-        <w:t>3</w:t>
-      </w:r>
-      <w:proofErr w:type="gramStart"/>
-      <w:r>
-        <w:rPr>
-          <w:rFonts w:hint="eastAsia"/>
-        </w:rPr>
-        <w:t>×</w:t>
-      </w:r>
-      <w:r>
-        <w:rPr>
-          <w:rFonts w:hint="eastAsia"/>
-        </w:rPr>
-        <w:t>224</w:t>
-      </w:r>
-      <w:r>
-        <w:rPr>
-          <w:rFonts w:hint="eastAsia"/>
-        </w:rPr>
-        <w:t>×</w:t>
-      </w:r>
-      <w:r>
-        <w:rPr>
-          <w:rFonts w:hint="eastAsia"/>
-        </w:rPr>
-        <w:t>224</w:t>
-      </w:r>
-      <w:proofErr w:type="gramEnd"/>
-      <w:r>
-        <w:rPr>
-          <w:rFonts w:hint="eastAsia"/>
-        </w:rPr>
-        <w:t>)</w:t>
-      </w:r>
-    </w:p>
-    <w:p>
-      <w:pPr>
-        <w:ind w:firstLine="480"/>
-      </w:pPr>
-      <w:r>
-        <w:rPr>
-          <w:rFonts w:hint="eastAsia"/>
-        </w:rPr>
-        <w:t>说明：包含</w:t>
-      </w:r>
-      <w:r>
-        <w:t>Resize</w:t>
-      </w:r>
-      <w:r>
-        <w:rPr>
-          <w:rFonts w:hint="eastAsia"/>
-        </w:rPr>
-        <w:t>、</w:t>
-      </w:r>
-      <w:proofErr w:type="spellStart"/>
-      <w:r>
-        <w:t>ToTensor</w:t>
-      </w:r>
-      <w:proofErr w:type="spellEnd"/>
+    </w:p>
+    <w:p>
+      <w:pPr>
+        <w:ind w:firstLine="480"/>
+      </w:pPr>
+      <w:r>
+        <w:rPr>
+          <w:rFonts w:hint="eastAsia"/>
+        </w:rPr>
+        <w:t>输出：预测类别</w:t>
+      </w:r>
+      <w:r>
+        <w:rPr>
+          <w:rFonts w:hint="eastAsia"/>
+        </w:rPr>
+        <w:t>pred_label</w:t>
+      </w:r>
+      <w:r>
+        <w:rPr>
+          <w:rFonts w:hint="eastAsia"/>
+        </w:rPr>
+        <w:t>与置信度</w:t>
+      </w:r>
+      <w:r>
+        <w:rPr>
+          <w:rFonts w:hint="eastAsia"/>
+        </w:rPr>
+        <w:t>conf</w:t>
+      </w:r>
+    </w:p>
+    <w:p>
+      <w:pPr>
+        <w:ind w:firstLine="480"/>
+      </w:pPr>
+      <w:r>
+        <w:rPr>
+          <w:rFonts w:hint="eastAsia"/>
+        </w:rPr>
+        <w:t>说明：模型输出</w:t>
+      </w:r>
+      <w:r>
+        <w:t>logits</w:t>
+      </w:r>
+      <w:r>
+        <w:rPr>
+          <w:rFonts w:hint="eastAsia"/>
+        </w:rPr>
+        <w:t>，经</w:t>
+      </w:r>
+      <w:r>
+        <w:t>Softmax</w:t>
+      </w:r>
+      <w:r>
+        <w:rPr>
+          <w:rFonts w:hint="eastAsia"/>
+        </w:rPr>
+        <w:t>得到概率并取</w:t>
+      </w:r>
+      <w:r>
+        <w:t>argmax</w:t>
+      </w:r>
+      <w:r>
+        <w:rPr>
+          <w:rFonts w:hint="eastAsia"/>
+        </w:rPr>
+        <w:t>作为预测。</w:t>
+      </w:r>
+    </w:p>
+    <w:p>
+      <w:pPr>
+        <w:ind w:firstLine="480"/>
+      </w:pPr>
+      <w:r>
+        <w:rPr>
+          <w:rFonts w:hint="eastAsia"/>
+        </w:rPr>
+        <w:t xml:space="preserve">5. </w:t>
+      </w:r>
+      <w:r>
+        <w:rPr>
+          <w:rFonts w:hint="eastAsia"/>
+        </w:rPr>
+        <w:t>结果稳定接口（</w:t>
+      </w:r>
+      <w:r>
+        <w:rPr>
+          <w:rFonts w:hint="eastAsia"/>
+        </w:rPr>
+        <w:t>Temporal Smoothing Interface</w:t>
+      </w:r>
+      <w:r>
+        <w:rPr>
+          <w:rFonts w:hint="eastAsia"/>
+        </w:rPr>
+        <w:t>）</w:t>
+      </w:r>
+    </w:p>
+    <w:p>
+      <w:pPr>
+        <w:ind w:firstLine="480"/>
+      </w:pPr>
+      <w:r>
+        <w:rPr>
+          <w:rFonts w:hint="eastAsia"/>
+        </w:rPr>
+        <w:t>输入：当前帧预测表情</w:t>
+      </w:r>
+      <w:r>
+        <w:rPr>
+          <w:rFonts w:hint="eastAsia"/>
+        </w:rPr>
+        <w:t>emotion</w:t>
+      </w:r>
+      <w:r>
+        <w:rPr>
+          <w:rFonts w:hint="eastAsia"/>
+        </w:rPr>
+        <w:t>与置信度</w:t>
+      </w:r>
+      <w:r>
+        <w:rPr>
+          <w:rFonts w:hint="eastAsia"/>
+        </w:rPr>
+        <w:t>conf</w:t>
+      </w:r>
+    </w:p>
+    <w:p>
+      <w:pPr>
+        <w:ind w:firstLine="480"/>
+      </w:pPr>
+      <w:r>
+        <w:rPr>
+          <w:rFonts w:hint="eastAsia"/>
+        </w:rPr>
+        <w:t>输出：稳定后的表情</w:t>
+      </w:r>
+      <w:r>
+        <w:rPr>
+          <w:rFonts w:hint="eastAsia"/>
+        </w:rPr>
+        <w:t>stable_emotion</w:t>
+      </w:r>
       <w:r>
         <w:rPr>
           <w:rFonts w:hint="eastAsia"/>
@@ -9567,238 +8693,11 @@
         <w:t>与</w:t>
       </w:r>
       <w:r>
-        <w:t>Normalize</w:t>
-      </w:r>
-      <w:r>
-        <w:rPr>
-          <w:rFonts w:hint="eastAsia"/>
-        </w:rPr>
-        <w:t>，尽量与训练阶段预处理保持一致，以降低部署域偏移风险。</w:t>
-      </w:r>
-    </w:p>
-    <w:p>
-      <w:pPr>
-        <w:ind w:firstLine="480"/>
-      </w:pPr>
-      <w:r>
-        <w:rPr>
-          <w:rFonts w:hint="eastAsia"/>
-        </w:rPr>
-        <w:t xml:space="preserve">4. </w:t>
-      </w:r>
-      <w:r>
-        <w:rPr>
-          <w:rFonts w:hint="eastAsia"/>
-        </w:rPr>
-        <w:t>表情识别接口（</w:t>
-      </w:r>
-      <w:r>
-        <w:rPr>
-          <w:rFonts w:hint="eastAsia"/>
-        </w:rPr>
-        <w:t>Expression Inference Interface</w:t>
-      </w:r>
-      <w:r>
-        <w:rPr>
-          <w:rFonts w:hint="eastAsia"/>
-        </w:rPr>
-        <w:t>）</w:t>
-      </w:r>
-    </w:p>
-    <w:p>
-      <w:pPr>
-        <w:ind w:firstLine="480"/>
-      </w:pPr>
-      <w:r>
-        <w:rPr>
-          <w:rFonts w:hint="eastAsia"/>
-        </w:rPr>
-        <w:t>输入：</w:t>
-      </w:r>
-      <w:proofErr w:type="spellStart"/>
-      <w:r>
-        <w:rPr>
-          <w:rFonts w:hint="eastAsia"/>
-        </w:rPr>
-        <w:t>img_tensor</w:t>
-      </w:r>
-      <w:proofErr w:type="spellEnd"/>
-    </w:p>
-    <w:p>
-      <w:pPr>
-        <w:ind w:firstLine="480"/>
-      </w:pPr>
-      <w:r>
-        <w:rPr>
-          <w:rFonts w:hint="eastAsia"/>
-        </w:rPr>
-        <w:t>输出：预测类别</w:t>
-      </w:r>
-      <w:proofErr w:type="spellStart"/>
-      <w:r>
-        <w:rPr>
-          <w:rFonts w:hint="eastAsia"/>
-        </w:rPr>
-        <w:t>pred_label</w:t>
-      </w:r>
-      <w:proofErr w:type="spellEnd"/>
-      <w:r>
-        <w:rPr>
-          <w:rFonts w:hint="eastAsia"/>
-        </w:rPr>
-        <w:t>与置信度</w:t>
-      </w:r>
-      <w:r>
-        <w:rPr>
-          <w:rFonts w:hint="eastAsia"/>
-        </w:rPr>
-        <w:t>conf</w:t>
-      </w:r>
-    </w:p>
-    <w:p>
-      <w:pPr>
-        <w:ind w:firstLine="480"/>
-      </w:pPr>
-      <w:r>
-        <w:rPr>
-          <w:rFonts w:hint="eastAsia"/>
-        </w:rPr>
-        <w:t>说明：模型输出</w:t>
-      </w:r>
-      <w:r>
-        <w:t>logits</w:t>
-      </w:r>
-      <w:r>
-        <w:rPr>
-          <w:rFonts w:hint="eastAsia"/>
-        </w:rPr>
-        <w:t>，经</w:t>
-      </w:r>
-      <w:proofErr w:type="spellStart"/>
-      <w:r>
-        <w:t>Softmax</w:t>
-      </w:r>
-      <w:proofErr w:type="spellEnd"/>
-      <w:r>
-        <w:rPr>
-          <w:rFonts w:hint="eastAsia"/>
-        </w:rPr>
-        <w:t>得到概率并取</w:t>
-      </w:r>
-      <w:r>
-        <w:t>argmax</w:t>
-      </w:r>
-      <w:r>
-        <w:rPr>
-          <w:rFonts w:hint="eastAsia"/>
-        </w:rPr>
-        <w:t>作为预测。</w:t>
-      </w:r>
-    </w:p>
-    <w:p>
-      <w:pPr>
-        <w:ind w:firstLine="480"/>
-      </w:pPr>
-      <w:r>
-        <w:rPr>
-          <w:rFonts w:hint="eastAsia"/>
-        </w:rPr>
-        <w:t xml:space="preserve">5. </w:t>
-      </w:r>
-      <w:r>
-        <w:rPr>
-          <w:rFonts w:hint="eastAsia"/>
-        </w:rPr>
-        <w:t>结果稳定接口（</w:t>
-      </w:r>
-      <w:r>
-        <w:rPr>
-          <w:rFonts w:hint="eastAsia"/>
-        </w:rPr>
-        <w:t>Temporal Smoothing Interface</w:t>
-      </w:r>
-      <w:r>
-        <w:rPr>
-          <w:rFonts w:hint="eastAsia"/>
-        </w:rPr>
-        <w:t>）</w:t>
-      </w:r>
-    </w:p>
-    <w:p>
-      <w:pPr>
-        <w:ind w:firstLine="480"/>
-      </w:pPr>
-      <w:r>
-        <w:rPr>
-          <w:rFonts w:hint="eastAsia"/>
-        </w:rPr>
-        <w:t>输入：当前</w:t>
-      </w:r>
-      <w:proofErr w:type="gramStart"/>
-      <w:r>
-        <w:rPr>
-          <w:rFonts w:hint="eastAsia"/>
-        </w:rPr>
-        <w:t>帧</w:t>
-      </w:r>
-      <w:proofErr w:type="gramEnd"/>
-      <w:r>
-        <w:rPr>
-          <w:rFonts w:hint="eastAsia"/>
-        </w:rPr>
-        <w:t>预测表情</w:t>
-      </w:r>
-      <w:r>
-        <w:rPr>
-          <w:rFonts w:hint="eastAsia"/>
-        </w:rPr>
-        <w:t>emotion</w:t>
-      </w:r>
-      <w:r>
-        <w:rPr>
-          <w:rFonts w:hint="eastAsia"/>
-        </w:rPr>
-        <w:t>与置信度</w:t>
-      </w:r>
-      <w:r>
-        <w:rPr>
-          <w:rFonts w:hint="eastAsia"/>
-        </w:rPr>
-        <w:t>conf</w:t>
-      </w:r>
-    </w:p>
-    <w:p>
-      <w:pPr>
-        <w:ind w:firstLine="480"/>
-      </w:pPr>
-      <w:r>
-        <w:rPr>
-          <w:rFonts w:hint="eastAsia"/>
-        </w:rPr>
-        <w:t>输出：稳定后的表情</w:t>
-      </w:r>
-      <w:proofErr w:type="spellStart"/>
-      <w:r>
-        <w:rPr>
-          <w:rFonts w:hint="eastAsia"/>
-        </w:rPr>
-        <w:t>stable_emotion</w:t>
-      </w:r>
-      <w:proofErr w:type="spellEnd"/>
-      <w:r>
-        <w:rPr>
-          <w:rFonts w:hint="eastAsia"/>
-        </w:rPr>
-        <w:t>与</w:t>
-      </w:r>
-      <w:proofErr w:type="spellStart"/>
-      <w:r>
         <w:rPr>
           <w:rFonts w:hint="eastAsia"/>
         </w:rPr>
         <w:t>stable_conf</w:t>
       </w:r>
-      <w:proofErr w:type="spellEnd"/>
     </w:p>
     <w:p>
       <w:pPr>
@@ -9817,21 +8716,7 @@
         <w:rPr>
           <w:rFonts w:hint="eastAsia"/>
         </w:rPr>
-        <w:t>置信度约束”时才更新显示结果，从而</w:t>
-      </w:r>
-      <w:proofErr w:type="gramStart"/>
-      <w:r>
-        <w:rPr>
-          <w:rFonts w:hint="eastAsia"/>
-        </w:rPr>
-        <w:t>提升端侧体验</w:t>
-      </w:r>
-      <w:proofErr w:type="gramEnd"/>
-      <w:r>
-        <w:rPr>
-          <w:rFonts w:hint="eastAsia"/>
-        </w:rPr>
-        <w:t>。</w:t>
+        <w:t>置信度约束”时才更新显示结果，从而提升端侧体验。</w:t>
       </w:r>
     </w:p>
     <w:p>
@@ -9848,6 +8733,7 @@
         <w:br w:type="page"/>
       </w:r>
     </w:p>
+    <w:bookmarkStart w:id="22" w:name="_Toc220591858"/>
     <w:p>
       <w:pPr>
         <w:pStyle w:val="1"/>
@@ -9857,11 +8743,11 @@
           <w:b/>
         </w:rPr>
       </w:pPr>
-      <w:bookmarkStart w:id="22" w:name="_Toc220591858"/>
-      <w:r>
-        <w:rPr>
-          <w:rFonts w:hint="eastAsia"/>
-          <w:b/>
+      <w:r>
+        <w:rPr>
+          <w:rFonts w:hint="eastAsia"/>
+          <w:b/>
+          <w:noProof/>
         </w:rPr>
         <w:lastRenderedPageBreak/>
         <mc:AlternateContent>
@@ -9977,16 +8863,7 @@
                                 <w:sz w:val="21"/>
                                 <w:szCs w:val="21"/>
                               </w:rPr>
-                              <w:t>磅，</w:t>
-                            </w:r>
-                            <w:proofErr w:type="gramStart"/>
-                            <w:r>
-                              <w:rPr>
-                                <w:color w:val="000000"/>
-                                <w:sz w:val="21"/>
-                                <w:szCs w:val="21"/>
-                              </w:rPr>
-                              <w:t>段前</w:t>
+                              <w:t>磅，段前</w:t>
                             </w:r>
                             <w:r>
                               <w:rPr>
@@ -10002,16 +8879,7 @@
                                 <w:sz w:val="21"/>
                                 <w:szCs w:val="21"/>
                               </w:rPr>
-                              <w:t>磅</w:t>
-                            </w:r>
-                            <w:proofErr w:type="gramEnd"/>
-                            <w:r>
-                              <w:rPr>
-                                <w:color w:val="000000"/>
-                                <w:sz w:val="21"/>
-                                <w:szCs w:val="21"/>
-                              </w:rPr>
-                              <w:t>，段后</w:t>
+                              <w:t>磅，段后</w:t>
                             </w:r>
                             <w:r>
                               <w:rPr>
@@ -10565,6 +9433,7 @@
         <w:rPr>
           <w:rFonts w:hint="eastAsia"/>
           <w:b/>
+          <w:noProof/>
         </w:rPr>
         <w:lastRenderedPageBreak/>
         <mc:AlternateContent>
@@ -11409,14 +10278,12 @@
         </w:rPr>
         <w:t xml:space="preserve">[2] </w:t>
       </w:r>
-      <w:proofErr w:type="gramStart"/>
       <w:r>
         <w:rPr>
           <w:color w:val="000000"/>
         </w:rPr>
         <w:t>徐滨士</w:t>
       </w:r>
-      <w:proofErr w:type="gramEnd"/>
       <w:r>
         <w:rPr>
           <w:color w:val="000000"/>
@@ -11430,19 +10297,11 @@
         </w:rPr>
         <w:t xml:space="preserve"> </w:t>
       </w:r>
-      <w:proofErr w:type="gramStart"/>
-      <w:r>
-        <w:rPr>
-          <w:color w:val="000000"/>
-        </w:rPr>
-        <w:t>欧忠文</w:t>
-      </w:r>
-      <w:proofErr w:type="gramEnd"/>
-      <w:r>
-        <w:rPr>
-          <w:color w:val="000000"/>
-        </w:rPr>
-        <w:t>等</w:t>
+      <w:r>
+        <w:rPr>
+          <w:color w:val="000000"/>
+        </w:rPr>
+        <w:t>欧忠文等</w:t>
       </w:r>
       <w:r>
         <w:rPr>
@@ -11555,35 +10414,7 @@
         <w:rPr>
           <w:color w:val="000000"/>
         </w:rPr>
-        <w:t xml:space="preserve">[3] </w:t>
-      </w:r>
-      <w:proofErr w:type="spellStart"/>
-      <w:r>
-        <w:rPr>
-          <w:color w:val="000000"/>
-        </w:rPr>
-        <w:t>Kuehnlw</w:t>
-      </w:r>
-      <w:proofErr w:type="spellEnd"/>
-      <w:r>
-        <w:rPr>
-          <w:color w:val="000000"/>
-        </w:rPr>
-        <w:t xml:space="preserve"> M R, </w:t>
-      </w:r>
-      <w:proofErr w:type="spellStart"/>
-      <w:r>
-        <w:rPr>
-          <w:color w:val="000000"/>
-        </w:rPr>
-        <w:t>Peeken</w:t>
-      </w:r>
-      <w:proofErr w:type="spellEnd"/>
-      <w:r>
-        <w:rPr>
-          <w:color w:val="000000"/>
-        </w:rPr>
-        <w:t xml:space="preserve"> H, et al. The Toroid</w:t>
+        <w:t>[3] Kuehnlw M R, Peeken H, et al. The Toroid</w:t>
       </w:r>
       <w:r>
         <w:t>al Drive</w:t>
@@ -13254,21 +12085,7 @@
         <w:rPr>
           <w:color w:val="3366FF"/>
         </w:rPr>
-        <w:t>篇以上。指导教师认定为特殊类型的设计（论文），可以</w:t>
-      </w:r>
-      <w:proofErr w:type="gramStart"/>
-      <w:r>
-        <w:rPr>
-          <w:color w:val="3366FF"/>
-        </w:rPr>
-        <w:t>不列外</w:t>
-      </w:r>
-      <w:proofErr w:type="gramEnd"/>
-      <w:r>
-        <w:rPr>
-          <w:color w:val="3366FF"/>
-        </w:rPr>
-        <w:t>文参考文献。</w:t>
+        <w:t>篇以上。指导教师认定为特殊类型的设计（论文），可以不列外文参考文献。</w:t>
       </w:r>
     </w:p>
     <w:p>
@@ -13283,6 +12100,7 @@
       <w:r>
         <w:rPr>
           <w:rFonts w:ascii="宋体" w:hAnsi="宋体"/>
+          <w:noProof/>
           <w:color w:val="000000"/>
         </w:rPr>
         <mc:AlternateContent>
@@ -13425,6 +12243,7 @@
         <w:rPr>
           <w:rFonts w:hint="eastAsia"/>
           <w:b/>
+          <w:noProof/>
         </w:rPr>
         <mc:AlternateContent>
           <mc:Choice Requires="wps">
@@ -13806,6 +12625,7 @@
         </w:sectPr>
       </w:pPr>
     </w:p>
+    <w:bookmarkStart w:id="33" w:name="_Toc220591863"/>
     <w:p>
       <w:pPr>
         <w:pStyle w:val="1"/>
@@ -13814,11 +12634,11 @@
           <w:b/>
         </w:rPr>
       </w:pPr>
-      <w:bookmarkStart w:id="33" w:name="_Toc220591863"/>
-      <w:r>
-        <w:rPr>
-          <w:rFonts w:hint="eastAsia"/>
-          <w:b/>
+      <w:r>
+        <w:rPr>
+          <w:rFonts w:hint="eastAsia"/>
+          <w:b/>
+          <w:noProof/>
         </w:rPr>
         <w:lastRenderedPageBreak/>
         <mc:AlternateContent>
@@ -13941,6 +12761,7 @@
         <w:rPr>
           <w:rFonts w:hint="eastAsia"/>
           <w:b/>
+          <w:noProof/>
         </w:rPr>
         <mc:AlternateContent>
           <mc:Choice Requires="wps">
@@ -14343,39 +13164,7 @@
           <w:rFonts w:hint="eastAsia"/>
           <w:color w:val="000000"/>
         </w:rPr>
-        <w:t>绪论部分</w:t>
-      </w:r>
-      <w:proofErr w:type="gramStart"/>
-      <w:r>
-        <w:rPr>
-          <w:rFonts w:hint="eastAsia"/>
-          <w:color w:val="000000"/>
-        </w:rPr>
-        <w:t>需介绍</w:t>
-      </w:r>
-      <w:proofErr w:type="gramEnd"/>
-      <w:r>
-        <w:rPr>
-          <w:rFonts w:hint="eastAsia"/>
-          <w:color w:val="000000"/>
-        </w:rPr>
-        <w:t>研究背景、研究的目的及意义等，对课题的研究前提、国内外研究情况、本课题研究内容等做出总</w:t>
-      </w:r>
-      <w:proofErr w:type="gramStart"/>
-      <w:r>
-        <w:rPr>
-          <w:rFonts w:hint="eastAsia"/>
-          <w:color w:val="000000"/>
-        </w:rPr>
-        <w:t>览</w:t>
-      </w:r>
-      <w:proofErr w:type="gramEnd"/>
-      <w:r>
-        <w:rPr>
-          <w:rFonts w:hint="eastAsia"/>
-          <w:color w:val="000000"/>
-        </w:rPr>
-        <w:t>性的介绍和说明。</w:t>
+        <w:t>绪论部分需介绍研究背景、研究的目的及意义等，对课题的研究前提、国内外研究情况、本课题研究内容等做出总览性的介绍和说明。</w:t>
       </w:r>
     </w:p>
     <w:p>
@@ -14434,23 +13223,7 @@
           <w:rFonts w:hint="eastAsia"/>
           <w:color w:val="000000"/>
         </w:rPr>
-        <w:t>）文字部分要求：</w:t>
-      </w:r>
-      <w:proofErr w:type="gramStart"/>
-      <w:r>
-        <w:rPr>
-          <w:rFonts w:hint="eastAsia"/>
-          <w:color w:val="000000"/>
-        </w:rPr>
-        <w:t>需包括</w:t>
-      </w:r>
-      <w:proofErr w:type="gramEnd"/>
-      <w:r>
-        <w:rPr>
-          <w:rFonts w:hint="eastAsia"/>
-          <w:color w:val="000000"/>
-        </w:rPr>
-        <w:t>系统整体的说明、设计方案的论证等内容，对设计内容、关键知识点等做出明确说明，可对必要的知识点做出名词解释；</w:t>
+        <w:t>）文字部分要求：需包括系统整体的说明、设计方案的论证等内容，对设计内容、关键知识点等做出明确说明，可对必要的知识点做出名词解释；</w:t>
       </w:r>
     </w:p>
     <w:p>
@@ -14768,23 +13541,7 @@
           <w:color w:val="000000"/>
         </w:rPr>
         <w:lastRenderedPageBreak/>
-        <w:t>毕业设计（论文）中所有配图、</w:t>
-      </w:r>
-      <w:proofErr w:type="gramStart"/>
-      <w:r>
-        <w:rPr>
-          <w:rFonts w:hint="eastAsia"/>
-          <w:color w:val="000000"/>
-        </w:rPr>
-        <w:t>配表均须</w:t>
-      </w:r>
-      <w:proofErr w:type="gramEnd"/>
-      <w:r>
-        <w:rPr>
-          <w:rFonts w:hint="eastAsia"/>
-          <w:color w:val="000000"/>
-        </w:rPr>
-        <w:t>有相应的文字说明作支撑，并在原文中有“如图</w:t>
+        <w:t>毕业设计（论文）中所有配图、配表均须有相应的文字说明作支撑，并在原文中有“如图</w:t>
       </w:r>
       <w:r>
         <w:rPr>
@@ -14896,6 +13653,9 @@
         </w:sectPr>
       </w:pPr>
       <w:r>
+        <w:rPr>
+          <w:noProof/>
+        </w:rPr>
         <w:lastRenderedPageBreak/>
         <w:drawing>
           <wp:inline distT="0" distB="0" distL="0" distR="0" wp14:anchorId="560669DC" wp14:editId="4F180C0A">
@@ -14962,6 +13722,9 @@
         </w:rPr>
       </w:pPr>
       <w:r>
+        <w:rPr>
+          <w:noProof/>
+        </w:rPr>
         <w:drawing>
           <wp:inline distT="0" distB="0" distL="0" distR="0" wp14:anchorId="6892C3C8" wp14:editId="616DBBED">
             <wp:extent cx="5274310" cy="5112385"/>
@@ -15041,19 +13804,11 @@
           <w:sz w:val="21"/>
         </w:rPr>
       </w:pPr>
-      <w:proofErr w:type="gramStart"/>
       <w:r>
         <w:rPr>
           <w:sz w:val="21"/>
         </w:rPr>
-        <w:t>#include</w:t>
-      </w:r>
-      <w:proofErr w:type="gramEnd"/>
-      <w:r>
-        <w:rPr>
-          <w:sz w:val="21"/>
-        </w:rPr>
-        <w:t>&lt;reg52.h&gt;</w:t>
+        <w:t>#include&lt;reg52.h&gt;</w:t>
       </w:r>
     </w:p>
     <w:p>
@@ -15064,33 +13819,11 @@
           <w:sz w:val="21"/>
         </w:rPr>
       </w:pPr>
-      <w:proofErr w:type="gramStart"/>
       <w:r>
         <w:rPr>
           <w:sz w:val="21"/>
         </w:rPr>
-        <w:t>#include</w:t>
-      </w:r>
-      <w:proofErr w:type="gramEnd"/>
-      <w:r>
-        <w:rPr>
-          <w:sz w:val="21"/>
-        </w:rPr>
-        <w:t>&lt;intrins</w:t>
-      </w:r>
-      <w:proofErr w:type="gramStart"/>
-      <w:r>
-        <w:rPr>
-          <w:sz w:val="21"/>
-        </w:rPr>
-        <w:t>.h</w:t>
-      </w:r>
-      <w:proofErr w:type="gramEnd"/>
-      <w:r>
-        <w:rPr>
-          <w:sz w:val="21"/>
-        </w:rPr>
-        <w:t>&gt;</w:t>
+        <w:t>#include&lt;intrins.h&gt;</w:t>
       </w:r>
     </w:p>
     <w:p>
@@ -15114,30 +13847,8 @@
         <w:rPr>
           <w:sz w:val="21"/>
         </w:rPr>
-        <w:t xml:space="preserve">unsigned </w:t>
-      </w:r>
-      <w:proofErr w:type="gramStart"/>
-      <w:r>
-        <w:rPr>
-          <w:sz w:val="21"/>
-        </w:rPr>
-        <w:t>char</w:t>
-      </w:r>
-      <w:proofErr w:type="gramEnd"/>
-      <w:r>
-        <w:rPr>
-          <w:sz w:val="21"/>
-        </w:rPr>
-        <w:t xml:space="preserve"> </w:t>
-      </w:r>
-      <w:proofErr w:type="gramStart"/>
-      <w:r>
-        <w:rPr>
-          <w:sz w:val="21"/>
-        </w:rPr>
-        <w:t>data1;</w:t>
-      </w:r>
-      <w:proofErr w:type="gramEnd"/>
+        <w:t>unsigned char data1;</w:t>
+      </w:r>
     </w:p>
     <w:p>
       <w:pPr>
@@ -15151,16 +13862,8 @@
         <w:rPr>
           <w:sz w:val="21"/>
         </w:rPr>
-        <w:t xml:space="preserve">long </w:t>
-      </w:r>
-      <w:proofErr w:type="gramStart"/>
-      <w:r>
-        <w:rPr>
-          <w:sz w:val="21"/>
-        </w:rPr>
-        <w:t>Value;</w:t>
-      </w:r>
-      <w:proofErr w:type="gramEnd"/>
+        <w:t>long Value;</w:t>
+      </w:r>
     </w:p>
     <w:p>
       <w:pPr>
@@ -15183,21 +13886,7 @@
         <w:rPr>
           <w:sz w:val="21"/>
         </w:rPr>
-        <w:t>#define LCD1602_</w:t>
-      </w:r>
-      <w:proofErr w:type="gramStart"/>
-      <w:r>
-        <w:rPr>
-          <w:sz w:val="21"/>
-        </w:rPr>
-        <w:t>DB  P</w:t>
-      </w:r>
-      <w:proofErr w:type="gramEnd"/>
-      <w:r>
-        <w:rPr>
-          <w:sz w:val="21"/>
-        </w:rPr>
-        <w:t>0</w:t>
+        <w:t>#define LCD1602_DB  P0</w:t>
       </w:r>
     </w:p>
     <w:p>
@@ -15208,28 +13897,12 @@
           <w:sz w:val="21"/>
         </w:rPr>
       </w:pPr>
-      <w:proofErr w:type="spellStart"/>
       <w:r>
         <w:rPr>
           <w:sz w:val="21"/>
         </w:rPr>
-        <w:t>sbit</w:t>
-      </w:r>
-      <w:proofErr w:type="spellEnd"/>
-      <w:r>
-        <w:rPr>
-          <w:sz w:val="21"/>
-        </w:rPr>
-        <w:t xml:space="preserve"> LCD1602_RS = P1^</w:t>
-      </w:r>
-      <w:proofErr w:type="gramStart"/>
-      <w:r>
-        <w:rPr>
-          <w:sz w:val="21"/>
-        </w:rPr>
-        <w:t>0;</w:t>
-      </w:r>
-      <w:proofErr w:type="gramEnd"/>
+        <w:t>sbit LCD1602_RS = P1^0;</w:t>
+      </w:r>
     </w:p>
     <w:p>
       <w:pPr>
@@ -15239,28 +13912,12 @@
           <w:sz w:val="21"/>
         </w:rPr>
       </w:pPr>
-      <w:proofErr w:type="spellStart"/>
       <w:r>
         <w:rPr>
           <w:sz w:val="21"/>
         </w:rPr>
-        <w:t>sbit</w:t>
-      </w:r>
-      <w:proofErr w:type="spellEnd"/>
-      <w:r>
-        <w:rPr>
-          <w:sz w:val="21"/>
-        </w:rPr>
-        <w:t xml:space="preserve"> LCD1602_RW = P1^</w:t>
-      </w:r>
-      <w:proofErr w:type="gramStart"/>
-      <w:r>
-        <w:rPr>
-          <w:sz w:val="21"/>
-        </w:rPr>
-        <w:t>1;</w:t>
-      </w:r>
-      <w:proofErr w:type="gramEnd"/>
+        <w:t>sbit LCD1602_RW = P1^1;</w:t>
+      </w:r>
     </w:p>
     <w:p>
       <w:pPr>
@@ -15270,42 +13927,12 @@
           <w:sz w:val="21"/>
         </w:rPr>
       </w:pPr>
-      <w:proofErr w:type="spellStart"/>
       <w:r>
         <w:rPr>
           <w:sz w:val="21"/>
         </w:rPr>
-        <w:t>sbit</w:t>
-      </w:r>
-      <w:proofErr w:type="spellEnd"/>
-      <w:r>
-        <w:rPr>
-          <w:sz w:val="21"/>
-        </w:rPr>
-        <w:t xml:space="preserve"> LCD1602_</w:t>
-      </w:r>
-      <w:proofErr w:type="gramStart"/>
-      <w:r>
-        <w:rPr>
-          <w:sz w:val="21"/>
-        </w:rPr>
-        <w:t>E  =</w:t>
-      </w:r>
-      <w:proofErr w:type="gramEnd"/>
-      <w:r>
-        <w:rPr>
-          <w:sz w:val="21"/>
-        </w:rPr>
-        <w:t xml:space="preserve"> P1^</w:t>
-      </w:r>
-      <w:proofErr w:type="gramStart"/>
-      <w:r>
-        <w:rPr>
-          <w:sz w:val="21"/>
-        </w:rPr>
-        <w:t>2;</w:t>
-      </w:r>
-      <w:proofErr w:type="gramEnd"/>
+        <w:t>sbit LCD1602_E  = P1^2;</w:t>
+      </w:r>
     </w:p>
     <w:p>
       <w:pPr>
@@ -15315,47 +13942,11 @@
           <w:sz w:val="21"/>
         </w:rPr>
       </w:pPr>
-      <w:proofErr w:type="spellStart"/>
       <w:r>
         <w:rPr>
           <w:sz w:val="21"/>
         </w:rPr>
-        <w:t>sbit</w:t>
-      </w:r>
-      <w:proofErr w:type="spellEnd"/>
-      <w:r>
-        <w:rPr>
-          <w:sz w:val="21"/>
-        </w:rPr>
-        <w:t xml:space="preserve"> </w:t>
-      </w:r>
-      <w:proofErr w:type="spellStart"/>
-      <w:r>
-        <w:rPr>
-          <w:sz w:val="21"/>
-        </w:rPr>
-        <w:t>bADcs</w:t>
-      </w:r>
-      <w:proofErr w:type="spellEnd"/>
-      <w:r>
-        <w:rPr>
-          <w:sz w:val="21"/>
-        </w:rPr>
-        <w:t>=P2^</w:t>
-      </w:r>
-      <w:proofErr w:type="gramStart"/>
-      <w:r>
-        <w:rPr>
-          <w:sz w:val="21"/>
-        </w:rPr>
-        <w:t>7;</w:t>
-      </w:r>
-      <w:proofErr w:type="gramEnd"/>
-      <w:r>
-        <w:rPr>
-          <w:sz w:val="21"/>
-        </w:rPr>
-        <w:t xml:space="preserve">   </w:t>
+        <w:t xml:space="preserve">sbit bADcs=P2^7;   </w:t>
       </w:r>
       <w:r>
         <w:rPr>
@@ -15390,42 +13981,12 @@
           <w:sz w:val="21"/>
         </w:rPr>
       </w:pPr>
-      <w:proofErr w:type="spellStart"/>
       <w:r>
         <w:rPr>
           <w:sz w:val="21"/>
         </w:rPr>
-        <w:t>sbit</w:t>
-      </w:r>
-      <w:proofErr w:type="spellEnd"/>
-      <w:r>
-        <w:rPr>
-          <w:sz w:val="21"/>
-        </w:rPr>
-        <w:t xml:space="preserve"> </w:t>
-      </w:r>
-      <w:proofErr w:type="spellStart"/>
-      <w:r>
-        <w:rPr>
-          <w:sz w:val="21"/>
-        </w:rPr>
-        <w:t>bADcl</w:t>
-      </w:r>
-      <w:proofErr w:type="spellEnd"/>
-      <w:r>
-        <w:rPr>
-          <w:sz w:val="21"/>
-        </w:rPr>
-        <w:t>=P2^</w:t>
-      </w:r>
-      <w:proofErr w:type="gramStart"/>
-      <w:r>
-        <w:rPr>
-          <w:sz w:val="21"/>
-        </w:rPr>
-        <w:t>6;</w:t>
-      </w:r>
-      <w:proofErr w:type="gramEnd"/>
+        <w:t>sbit bADcl=P2^6;</w:t>
+      </w:r>
     </w:p>
     <w:p>
       <w:pPr>
@@ -15435,42 +13996,12 @@
           <w:sz w:val="21"/>
         </w:rPr>
       </w:pPr>
-      <w:proofErr w:type="spellStart"/>
       <w:r>
         <w:rPr>
           <w:sz w:val="21"/>
         </w:rPr>
-        <w:t>sbit</w:t>
-      </w:r>
-      <w:proofErr w:type="spellEnd"/>
-      <w:r>
-        <w:rPr>
-          <w:sz w:val="21"/>
-        </w:rPr>
-        <w:t xml:space="preserve"> </w:t>
-      </w:r>
-      <w:proofErr w:type="spellStart"/>
-      <w:r>
-        <w:rPr>
-          <w:sz w:val="21"/>
-        </w:rPr>
-        <w:t>bADda</w:t>
-      </w:r>
-      <w:proofErr w:type="spellEnd"/>
-      <w:r>
-        <w:rPr>
-          <w:sz w:val="21"/>
-        </w:rPr>
-        <w:t>=P2^</w:t>
-      </w:r>
-      <w:proofErr w:type="gramStart"/>
-      <w:r>
-        <w:rPr>
-          <w:sz w:val="21"/>
-        </w:rPr>
-        <w:t>5;</w:t>
-      </w:r>
-      <w:proofErr w:type="gramEnd"/>
+        <w:t>sbit bADda=P2^5;</w:t>
+      </w:r>
     </w:p>
     <w:p>
       <w:pPr>

</xml_diff>

<commit_message>
Add mid-term report presentation for CNN and YuNet-based facial expression recognition system
</commit_message>
<xml_diff>
--- a/docs/张吉鹏-毕设.docx
+++ b/docs/张吉鹏-毕设.docx
@@ -2267,7 +2267,7 @@
           <w:pPr>
             <w:pStyle w:val="TOC1"/>
             <w:rPr>
-              <w:rFonts w:asciiTheme="minorHAnsi" w:eastAsiaTheme="minorEastAsia" w:hAnsiTheme="minorHAnsi" w:cstheme="minorBidi" w:hint="eastAsia"/>
+              <w:rFonts w:asciiTheme="minorHAnsi" w:eastAsiaTheme="minorEastAsia" w:hAnsiTheme="minorHAnsi" w:cstheme="minorBidi"/>
               <w:sz w:val="22"/>
               <w14:ligatures w14:val="standardContextual"/>
             </w:rPr>
@@ -2364,7 +2364,7 @@
             </w:tabs>
             <w:ind w:left="480" w:firstLine="480"/>
             <w:rPr>
-              <w:rFonts w:asciiTheme="minorHAnsi" w:eastAsiaTheme="minorEastAsia" w:hAnsiTheme="minorHAnsi" w:cstheme="minorBidi" w:hint="eastAsia"/>
+              <w:rFonts w:asciiTheme="minorHAnsi" w:eastAsiaTheme="minorEastAsia" w:hAnsiTheme="minorHAnsi" w:cstheme="minorBidi"/>
               <w:noProof/>
               <w:sz w:val="22"/>
               <w:szCs w:val="24"/>
@@ -2458,7 +2458,7 @@
             </w:tabs>
             <w:ind w:left="480" w:firstLine="480"/>
             <w:rPr>
-              <w:rFonts w:asciiTheme="minorHAnsi" w:eastAsiaTheme="minorEastAsia" w:hAnsiTheme="minorHAnsi" w:cstheme="minorBidi" w:hint="eastAsia"/>
+              <w:rFonts w:asciiTheme="minorHAnsi" w:eastAsiaTheme="minorEastAsia" w:hAnsiTheme="minorHAnsi" w:cstheme="minorBidi"/>
               <w:noProof/>
               <w:sz w:val="22"/>
               <w:szCs w:val="24"/>
@@ -2552,7 +2552,7 @@
             </w:tabs>
             <w:ind w:left="480" w:firstLine="480"/>
             <w:rPr>
-              <w:rFonts w:asciiTheme="minorHAnsi" w:eastAsiaTheme="minorEastAsia" w:hAnsiTheme="minorHAnsi" w:cstheme="minorBidi" w:hint="eastAsia"/>
+              <w:rFonts w:asciiTheme="minorHAnsi" w:eastAsiaTheme="minorEastAsia" w:hAnsiTheme="minorHAnsi" w:cstheme="minorBidi"/>
               <w:noProof/>
               <w:sz w:val="22"/>
               <w:szCs w:val="24"/>
@@ -2646,7 +2646,7 @@
             </w:tabs>
             <w:ind w:left="480" w:firstLine="480"/>
             <w:rPr>
-              <w:rFonts w:asciiTheme="minorHAnsi" w:eastAsiaTheme="minorEastAsia" w:hAnsiTheme="minorHAnsi" w:cstheme="minorBidi" w:hint="eastAsia"/>
+              <w:rFonts w:asciiTheme="minorHAnsi" w:eastAsiaTheme="minorEastAsia" w:hAnsiTheme="minorHAnsi" w:cstheme="minorBidi"/>
               <w:noProof/>
               <w:sz w:val="22"/>
               <w:szCs w:val="24"/>
@@ -2736,7 +2736,7 @@
           <w:pPr>
             <w:pStyle w:val="TOC1"/>
             <w:rPr>
-              <w:rFonts w:asciiTheme="minorHAnsi" w:eastAsiaTheme="minorEastAsia" w:hAnsiTheme="minorHAnsi" w:cstheme="minorBidi" w:hint="eastAsia"/>
+              <w:rFonts w:asciiTheme="minorHAnsi" w:eastAsiaTheme="minorEastAsia" w:hAnsiTheme="minorHAnsi" w:cstheme="minorBidi"/>
               <w:sz w:val="22"/>
               <w14:ligatures w14:val="standardContextual"/>
             </w:rPr>
@@ -2809,7 +2809,7 @@
             </w:tabs>
             <w:ind w:left="480" w:firstLine="480"/>
             <w:rPr>
-              <w:rFonts w:asciiTheme="minorHAnsi" w:eastAsiaTheme="minorEastAsia" w:hAnsiTheme="minorHAnsi" w:cstheme="minorBidi" w:hint="eastAsia"/>
+              <w:rFonts w:asciiTheme="minorHAnsi" w:eastAsiaTheme="minorEastAsia" w:hAnsiTheme="minorHAnsi" w:cstheme="minorBidi"/>
               <w:noProof/>
               <w:sz w:val="22"/>
               <w:szCs w:val="24"/>
@@ -2903,7 +2903,7 @@
             </w:tabs>
             <w:ind w:left="960" w:firstLine="480"/>
             <w:rPr>
-              <w:rFonts w:asciiTheme="minorHAnsi" w:eastAsiaTheme="minorEastAsia" w:hAnsiTheme="minorHAnsi" w:cstheme="minorBidi" w:hint="eastAsia"/>
+              <w:rFonts w:asciiTheme="minorHAnsi" w:eastAsiaTheme="minorEastAsia" w:hAnsiTheme="minorHAnsi" w:cstheme="minorBidi"/>
               <w:noProof/>
               <w:sz w:val="22"/>
               <w:szCs w:val="24"/>
@@ -2997,7 +2997,7 @@
             </w:tabs>
             <w:ind w:left="960" w:firstLine="480"/>
             <w:rPr>
-              <w:rFonts w:asciiTheme="minorHAnsi" w:eastAsiaTheme="minorEastAsia" w:hAnsiTheme="minorHAnsi" w:cstheme="minorBidi" w:hint="eastAsia"/>
+              <w:rFonts w:asciiTheme="minorHAnsi" w:eastAsiaTheme="minorEastAsia" w:hAnsiTheme="minorHAnsi" w:cstheme="minorBidi"/>
               <w:noProof/>
               <w:sz w:val="22"/>
               <w:szCs w:val="24"/>
@@ -3091,7 +3091,7 @@
             </w:tabs>
             <w:ind w:left="960" w:firstLine="480"/>
             <w:rPr>
-              <w:rFonts w:asciiTheme="minorHAnsi" w:eastAsiaTheme="minorEastAsia" w:hAnsiTheme="minorHAnsi" w:cstheme="minorBidi" w:hint="eastAsia"/>
+              <w:rFonts w:asciiTheme="minorHAnsi" w:eastAsiaTheme="minorEastAsia" w:hAnsiTheme="minorHAnsi" w:cstheme="minorBidi"/>
               <w:noProof/>
               <w:sz w:val="22"/>
               <w:szCs w:val="24"/>
@@ -3185,7 +3185,7 @@
             </w:tabs>
             <w:ind w:left="480" w:firstLine="480"/>
             <w:rPr>
-              <w:rFonts w:asciiTheme="minorHAnsi" w:eastAsiaTheme="minorEastAsia" w:hAnsiTheme="minorHAnsi" w:cstheme="minorBidi" w:hint="eastAsia"/>
+              <w:rFonts w:asciiTheme="minorHAnsi" w:eastAsiaTheme="minorEastAsia" w:hAnsiTheme="minorHAnsi" w:cstheme="minorBidi"/>
               <w:noProof/>
               <w:sz w:val="22"/>
               <w:szCs w:val="24"/>
@@ -3279,7 +3279,7 @@
             </w:tabs>
             <w:ind w:left="960" w:firstLine="480"/>
             <w:rPr>
-              <w:rFonts w:asciiTheme="minorHAnsi" w:eastAsiaTheme="minorEastAsia" w:hAnsiTheme="minorHAnsi" w:cstheme="minorBidi" w:hint="eastAsia"/>
+              <w:rFonts w:asciiTheme="minorHAnsi" w:eastAsiaTheme="minorEastAsia" w:hAnsiTheme="minorHAnsi" w:cstheme="minorBidi"/>
               <w:noProof/>
               <w:sz w:val="22"/>
               <w:szCs w:val="24"/>
@@ -3373,7 +3373,7 @@
             </w:tabs>
             <w:ind w:left="960" w:firstLine="480"/>
             <w:rPr>
-              <w:rFonts w:asciiTheme="minorHAnsi" w:eastAsiaTheme="minorEastAsia" w:hAnsiTheme="minorHAnsi" w:cstheme="minorBidi" w:hint="eastAsia"/>
+              <w:rFonts w:asciiTheme="minorHAnsi" w:eastAsiaTheme="minorEastAsia" w:hAnsiTheme="minorHAnsi" w:cstheme="minorBidi"/>
               <w:noProof/>
               <w:sz w:val="22"/>
               <w:szCs w:val="24"/>
@@ -3467,7 +3467,7 @@
             </w:tabs>
             <w:ind w:left="480" w:firstLine="480"/>
             <w:rPr>
-              <w:rFonts w:asciiTheme="minorHAnsi" w:eastAsiaTheme="minorEastAsia" w:hAnsiTheme="minorHAnsi" w:cstheme="minorBidi" w:hint="eastAsia"/>
+              <w:rFonts w:asciiTheme="minorHAnsi" w:eastAsiaTheme="minorEastAsia" w:hAnsiTheme="minorHAnsi" w:cstheme="minorBidi"/>
               <w:noProof/>
               <w:sz w:val="22"/>
               <w:szCs w:val="24"/>
@@ -3561,7 +3561,7 @@
             </w:tabs>
             <w:ind w:left="960" w:firstLine="480"/>
             <w:rPr>
-              <w:rFonts w:asciiTheme="minorHAnsi" w:eastAsiaTheme="minorEastAsia" w:hAnsiTheme="minorHAnsi" w:cstheme="minorBidi" w:hint="eastAsia"/>
+              <w:rFonts w:asciiTheme="minorHAnsi" w:eastAsiaTheme="minorEastAsia" w:hAnsiTheme="minorHAnsi" w:cstheme="minorBidi"/>
               <w:noProof/>
               <w:sz w:val="22"/>
               <w:szCs w:val="24"/>
@@ -3655,7 +3655,7 @@
             </w:tabs>
             <w:ind w:left="960" w:firstLine="480"/>
             <w:rPr>
-              <w:rFonts w:asciiTheme="minorHAnsi" w:eastAsiaTheme="minorEastAsia" w:hAnsiTheme="minorHAnsi" w:cstheme="minorBidi" w:hint="eastAsia"/>
+              <w:rFonts w:asciiTheme="minorHAnsi" w:eastAsiaTheme="minorEastAsia" w:hAnsiTheme="minorHAnsi" w:cstheme="minorBidi"/>
               <w:noProof/>
               <w:sz w:val="22"/>
               <w:szCs w:val="24"/>
@@ -3749,7 +3749,7 @@
             </w:tabs>
             <w:ind w:left="960" w:firstLine="480"/>
             <w:rPr>
-              <w:rFonts w:asciiTheme="minorHAnsi" w:eastAsiaTheme="minorEastAsia" w:hAnsiTheme="minorHAnsi" w:cstheme="minorBidi" w:hint="eastAsia"/>
+              <w:rFonts w:asciiTheme="minorHAnsi" w:eastAsiaTheme="minorEastAsia" w:hAnsiTheme="minorHAnsi" w:cstheme="minorBidi"/>
               <w:noProof/>
               <w:sz w:val="22"/>
               <w:szCs w:val="24"/>
@@ -3843,7 +3843,7 @@
             </w:tabs>
             <w:ind w:left="480" w:firstLine="480"/>
             <w:rPr>
-              <w:rFonts w:asciiTheme="minorHAnsi" w:eastAsiaTheme="minorEastAsia" w:hAnsiTheme="minorHAnsi" w:cstheme="minorBidi" w:hint="eastAsia"/>
+              <w:rFonts w:asciiTheme="minorHAnsi" w:eastAsiaTheme="minorEastAsia" w:hAnsiTheme="minorHAnsi" w:cstheme="minorBidi"/>
               <w:noProof/>
               <w:sz w:val="22"/>
               <w:szCs w:val="24"/>
@@ -3933,7 +3933,7 @@
           <w:pPr>
             <w:pStyle w:val="TOC1"/>
             <w:rPr>
-              <w:rFonts w:asciiTheme="minorHAnsi" w:eastAsiaTheme="minorEastAsia" w:hAnsiTheme="minorHAnsi" w:cstheme="minorBidi" w:hint="eastAsia"/>
+              <w:rFonts w:asciiTheme="minorHAnsi" w:eastAsiaTheme="minorEastAsia" w:hAnsiTheme="minorHAnsi" w:cstheme="minorBidi"/>
               <w:sz w:val="22"/>
               <w14:ligatures w14:val="standardContextual"/>
             </w:rPr>
@@ -4006,7 +4006,7 @@
             </w:tabs>
             <w:ind w:left="480" w:firstLine="480"/>
             <w:rPr>
-              <w:rFonts w:asciiTheme="minorHAnsi" w:eastAsiaTheme="minorEastAsia" w:hAnsiTheme="minorHAnsi" w:cstheme="minorBidi" w:hint="eastAsia"/>
+              <w:rFonts w:asciiTheme="minorHAnsi" w:eastAsiaTheme="minorEastAsia" w:hAnsiTheme="minorHAnsi" w:cstheme="minorBidi"/>
               <w:noProof/>
               <w:sz w:val="22"/>
               <w:szCs w:val="24"/>
@@ -4100,7 +4100,7 @@
             </w:tabs>
             <w:ind w:left="960" w:firstLine="480"/>
             <w:rPr>
-              <w:rFonts w:asciiTheme="minorHAnsi" w:eastAsiaTheme="minorEastAsia" w:hAnsiTheme="minorHAnsi" w:cstheme="minorBidi" w:hint="eastAsia"/>
+              <w:rFonts w:asciiTheme="minorHAnsi" w:eastAsiaTheme="minorEastAsia" w:hAnsiTheme="minorHAnsi" w:cstheme="minorBidi"/>
               <w:noProof/>
               <w:sz w:val="22"/>
               <w:szCs w:val="24"/>
@@ -4194,7 +4194,7 @@
             </w:tabs>
             <w:ind w:left="960" w:firstLine="480"/>
             <w:rPr>
-              <w:rFonts w:asciiTheme="minorHAnsi" w:eastAsiaTheme="minorEastAsia" w:hAnsiTheme="minorHAnsi" w:cstheme="minorBidi" w:hint="eastAsia"/>
+              <w:rFonts w:asciiTheme="minorHAnsi" w:eastAsiaTheme="minorEastAsia" w:hAnsiTheme="minorHAnsi" w:cstheme="minorBidi"/>
               <w:noProof/>
               <w:sz w:val="22"/>
               <w:szCs w:val="24"/>
@@ -4288,7 +4288,7 @@
             </w:tabs>
             <w:ind w:left="960" w:firstLine="480"/>
             <w:rPr>
-              <w:rFonts w:asciiTheme="minorHAnsi" w:eastAsiaTheme="minorEastAsia" w:hAnsiTheme="minorHAnsi" w:cstheme="minorBidi" w:hint="eastAsia"/>
+              <w:rFonts w:asciiTheme="minorHAnsi" w:eastAsiaTheme="minorEastAsia" w:hAnsiTheme="minorHAnsi" w:cstheme="minorBidi"/>
               <w:noProof/>
               <w:sz w:val="22"/>
               <w:szCs w:val="24"/>
@@ -4382,7 +4382,7 @@
             </w:tabs>
             <w:ind w:left="480" w:firstLine="480"/>
             <w:rPr>
-              <w:rFonts w:asciiTheme="minorHAnsi" w:eastAsiaTheme="minorEastAsia" w:hAnsiTheme="minorHAnsi" w:cstheme="minorBidi" w:hint="eastAsia"/>
+              <w:rFonts w:asciiTheme="minorHAnsi" w:eastAsiaTheme="minorEastAsia" w:hAnsiTheme="minorHAnsi" w:cstheme="minorBidi"/>
               <w:noProof/>
               <w:sz w:val="22"/>
               <w:szCs w:val="24"/>
@@ -4476,7 +4476,7 @@
             </w:tabs>
             <w:ind w:left="960" w:firstLine="480"/>
             <w:rPr>
-              <w:rFonts w:asciiTheme="minorHAnsi" w:eastAsiaTheme="minorEastAsia" w:hAnsiTheme="minorHAnsi" w:cstheme="minorBidi" w:hint="eastAsia"/>
+              <w:rFonts w:asciiTheme="minorHAnsi" w:eastAsiaTheme="minorEastAsia" w:hAnsiTheme="minorHAnsi" w:cstheme="minorBidi"/>
               <w:noProof/>
               <w:sz w:val="22"/>
               <w:szCs w:val="24"/>
@@ -4570,7 +4570,7 @@
             </w:tabs>
             <w:ind w:left="960" w:firstLine="480"/>
             <w:rPr>
-              <w:rFonts w:asciiTheme="minorHAnsi" w:eastAsiaTheme="minorEastAsia" w:hAnsiTheme="minorHAnsi" w:cstheme="minorBidi" w:hint="eastAsia"/>
+              <w:rFonts w:asciiTheme="minorHAnsi" w:eastAsiaTheme="minorEastAsia" w:hAnsiTheme="minorHAnsi" w:cstheme="minorBidi"/>
               <w:noProof/>
               <w:sz w:val="22"/>
               <w:szCs w:val="24"/>
@@ -4664,7 +4664,7 @@
             </w:tabs>
             <w:ind w:left="480" w:firstLine="480"/>
             <w:rPr>
-              <w:rFonts w:asciiTheme="minorHAnsi" w:eastAsiaTheme="minorEastAsia" w:hAnsiTheme="minorHAnsi" w:cstheme="minorBidi" w:hint="eastAsia"/>
+              <w:rFonts w:asciiTheme="minorHAnsi" w:eastAsiaTheme="minorEastAsia" w:hAnsiTheme="minorHAnsi" w:cstheme="minorBidi"/>
               <w:noProof/>
               <w:sz w:val="22"/>
               <w:szCs w:val="24"/>
@@ -4758,7 +4758,7 @@
             </w:tabs>
             <w:ind w:left="960" w:firstLine="480"/>
             <w:rPr>
-              <w:rFonts w:asciiTheme="minorHAnsi" w:eastAsiaTheme="minorEastAsia" w:hAnsiTheme="minorHAnsi" w:cstheme="minorBidi" w:hint="eastAsia"/>
+              <w:rFonts w:asciiTheme="minorHAnsi" w:eastAsiaTheme="minorEastAsia" w:hAnsiTheme="minorHAnsi" w:cstheme="minorBidi"/>
               <w:noProof/>
               <w:sz w:val="22"/>
               <w:szCs w:val="24"/>
@@ -4852,7 +4852,7 @@
             </w:tabs>
             <w:ind w:left="960" w:firstLine="480"/>
             <w:rPr>
-              <w:rFonts w:asciiTheme="minorHAnsi" w:eastAsiaTheme="minorEastAsia" w:hAnsiTheme="minorHAnsi" w:cstheme="minorBidi" w:hint="eastAsia"/>
+              <w:rFonts w:asciiTheme="minorHAnsi" w:eastAsiaTheme="minorEastAsia" w:hAnsiTheme="minorHAnsi" w:cstheme="minorBidi"/>
               <w:noProof/>
               <w:sz w:val="22"/>
               <w:szCs w:val="24"/>
@@ -4946,7 +4946,7 @@
             </w:tabs>
             <w:ind w:left="960" w:firstLine="480"/>
             <w:rPr>
-              <w:rFonts w:asciiTheme="minorHAnsi" w:eastAsiaTheme="minorEastAsia" w:hAnsiTheme="minorHAnsi" w:cstheme="minorBidi" w:hint="eastAsia"/>
+              <w:rFonts w:asciiTheme="minorHAnsi" w:eastAsiaTheme="minorEastAsia" w:hAnsiTheme="minorHAnsi" w:cstheme="minorBidi"/>
               <w:noProof/>
               <w:sz w:val="22"/>
               <w:szCs w:val="24"/>
@@ -5040,7 +5040,7 @@
             </w:tabs>
             <w:ind w:left="960" w:firstLine="480"/>
             <w:rPr>
-              <w:rFonts w:asciiTheme="minorHAnsi" w:eastAsiaTheme="minorEastAsia" w:hAnsiTheme="minorHAnsi" w:cstheme="minorBidi" w:hint="eastAsia"/>
+              <w:rFonts w:asciiTheme="minorHAnsi" w:eastAsiaTheme="minorEastAsia" w:hAnsiTheme="minorHAnsi" w:cstheme="minorBidi"/>
               <w:noProof/>
               <w:sz w:val="22"/>
               <w:szCs w:val="24"/>
@@ -5130,7 +5130,7 @@
           <w:pPr>
             <w:pStyle w:val="TOC1"/>
             <w:rPr>
-              <w:rFonts w:asciiTheme="minorHAnsi" w:eastAsiaTheme="minorEastAsia" w:hAnsiTheme="minorHAnsi" w:cstheme="minorBidi" w:hint="eastAsia"/>
+              <w:rFonts w:asciiTheme="minorHAnsi" w:eastAsiaTheme="minorEastAsia" w:hAnsiTheme="minorHAnsi" w:cstheme="minorBidi"/>
               <w:sz w:val="22"/>
               <w14:ligatures w14:val="standardContextual"/>
             </w:rPr>
@@ -5203,7 +5203,7 @@
             </w:tabs>
             <w:ind w:left="480" w:firstLine="480"/>
             <w:rPr>
-              <w:rFonts w:asciiTheme="minorHAnsi" w:eastAsiaTheme="minorEastAsia" w:hAnsiTheme="minorHAnsi" w:cstheme="minorBidi" w:hint="eastAsia"/>
+              <w:rFonts w:asciiTheme="minorHAnsi" w:eastAsiaTheme="minorEastAsia" w:hAnsiTheme="minorHAnsi" w:cstheme="minorBidi"/>
               <w:noProof/>
               <w:sz w:val="22"/>
               <w:szCs w:val="24"/>
@@ -5297,7 +5297,7 @@
             </w:tabs>
             <w:ind w:left="480" w:firstLine="480"/>
             <w:rPr>
-              <w:rFonts w:asciiTheme="minorHAnsi" w:eastAsiaTheme="minorEastAsia" w:hAnsiTheme="minorHAnsi" w:cstheme="minorBidi" w:hint="eastAsia"/>
+              <w:rFonts w:asciiTheme="minorHAnsi" w:eastAsiaTheme="minorEastAsia" w:hAnsiTheme="minorHAnsi" w:cstheme="minorBidi"/>
               <w:noProof/>
               <w:sz w:val="22"/>
               <w:szCs w:val="24"/>
@@ -5391,7 +5391,7 @@
             </w:tabs>
             <w:ind w:left="960" w:firstLine="480"/>
             <w:rPr>
-              <w:rFonts w:asciiTheme="minorHAnsi" w:eastAsiaTheme="minorEastAsia" w:hAnsiTheme="minorHAnsi" w:cstheme="minorBidi" w:hint="eastAsia"/>
+              <w:rFonts w:asciiTheme="minorHAnsi" w:eastAsiaTheme="minorEastAsia" w:hAnsiTheme="minorHAnsi" w:cstheme="minorBidi"/>
               <w:noProof/>
               <w:sz w:val="22"/>
               <w:szCs w:val="24"/>
@@ -5485,7 +5485,7 @@
             </w:tabs>
             <w:ind w:left="960" w:firstLine="480"/>
             <w:rPr>
-              <w:rFonts w:asciiTheme="minorHAnsi" w:eastAsiaTheme="minorEastAsia" w:hAnsiTheme="minorHAnsi" w:cstheme="minorBidi" w:hint="eastAsia"/>
+              <w:rFonts w:asciiTheme="minorHAnsi" w:eastAsiaTheme="minorEastAsia" w:hAnsiTheme="minorHAnsi" w:cstheme="minorBidi"/>
               <w:noProof/>
               <w:sz w:val="22"/>
               <w:szCs w:val="24"/>
@@ -5579,7 +5579,7 @@
             </w:tabs>
             <w:ind w:left="960" w:firstLine="480"/>
             <w:rPr>
-              <w:rFonts w:asciiTheme="minorHAnsi" w:eastAsiaTheme="minorEastAsia" w:hAnsiTheme="minorHAnsi" w:cstheme="minorBidi" w:hint="eastAsia"/>
+              <w:rFonts w:asciiTheme="minorHAnsi" w:eastAsiaTheme="minorEastAsia" w:hAnsiTheme="minorHAnsi" w:cstheme="minorBidi"/>
               <w:noProof/>
               <w:sz w:val="22"/>
               <w:szCs w:val="24"/>
@@ -5673,7 +5673,7 @@
             </w:tabs>
             <w:ind w:left="960" w:firstLine="480"/>
             <w:rPr>
-              <w:rFonts w:asciiTheme="minorHAnsi" w:eastAsiaTheme="minorEastAsia" w:hAnsiTheme="minorHAnsi" w:cstheme="minorBidi" w:hint="eastAsia"/>
+              <w:rFonts w:asciiTheme="minorHAnsi" w:eastAsiaTheme="minorEastAsia" w:hAnsiTheme="minorHAnsi" w:cstheme="minorBidi"/>
               <w:noProof/>
               <w:sz w:val="22"/>
               <w:szCs w:val="24"/>
@@ -5767,7 +5767,7 @@
             </w:tabs>
             <w:ind w:left="960" w:firstLine="480"/>
             <w:rPr>
-              <w:rFonts w:asciiTheme="minorHAnsi" w:eastAsiaTheme="minorEastAsia" w:hAnsiTheme="minorHAnsi" w:cstheme="minorBidi" w:hint="eastAsia"/>
+              <w:rFonts w:asciiTheme="minorHAnsi" w:eastAsiaTheme="minorEastAsia" w:hAnsiTheme="minorHAnsi" w:cstheme="minorBidi"/>
               <w:noProof/>
               <w:sz w:val="22"/>
               <w:szCs w:val="24"/>
@@ -5861,7 +5861,7 @@
             </w:tabs>
             <w:ind w:left="480" w:firstLine="480"/>
             <w:rPr>
-              <w:rFonts w:asciiTheme="minorHAnsi" w:eastAsiaTheme="minorEastAsia" w:hAnsiTheme="minorHAnsi" w:cstheme="minorBidi" w:hint="eastAsia"/>
+              <w:rFonts w:asciiTheme="minorHAnsi" w:eastAsiaTheme="minorEastAsia" w:hAnsiTheme="minorHAnsi" w:cstheme="minorBidi"/>
               <w:noProof/>
               <w:sz w:val="22"/>
               <w:szCs w:val="24"/>
@@ -5955,7 +5955,7 @@
             </w:tabs>
             <w:ind w:left="960" w:firstLine="480"/>
             <w:rPr>
-              <w:rFonts w:asciiTheme="minorHAnsi" w:eastAsiaTheme="minorEastAsia" w:hAnsiTheme="minorHAnsi" w:cstheme="minorBidi" w:hint="eastAsia"/>
+              <w:rFonts w:asciiTheme="minorHAnsi" w:eastAsiaTheme="minorEastAsia" w:hAnsiTheme="minorHAnsi" w:cstheme="minorBidi"/>
               <w:noProof/>
               <w:sz w:val="22"/>
               <w:szCs w:val="24"/>
@@ -6049,7 +6049,7 @@
             </w:tabs>
             <w:ind w:left="960" w:firstLine="480"/>
             <w:rPr>
-              <w:rFonts w:asciiTheme="minorHAnsi" w:eastAsiaTheme="minorEastAsia" w:hAnsiTheme="minorHAnsi" w:cstheme="minorBidi" w:hint="eastAsia"/>
+              <w:rFonts w:asciiTheme="minorHAnsi" w:eastAsiaTheme="minorEastAsia" w:hAnsiTheme="minorHAnsi" w:cstheme="minorBidi"/>
               <w:noProof/>
               <w:sz w:val="22"/>
               <w:szCs w:val="24"/>
@@ -6143,7 +6143,7 @@
             </w:tabs>
             <w:ind w:left="480" w:firstLine="480"/>
             <w:rPr>
-              <w:rFonts w:asciiTheme="minorHAnsi" w:eastAsiaTheme="minorEastAsia" w:hAnsiTheme="minorHAnsi" w:cstheme="minorBidi" w:hint="eastAsia"/>
+              <w:rFonts w:asciiTheme="minorHAnsi" w:eastAsiaTheme="minorEastAsia" w:hAnsiTheme="minorHAnsi" w:cstheme="minorBidi"/>
               <w:noProof/>
               <w:sz w:val="22"/>
               <w:szCs w:val="24"/>
@@ -6237,7 +6237,7 @@
             </w:tabs>
             <w:ind w:left="960" w:firstLine="480"/>
             <w:rPr>
-              <w:rFonts w:asciiTheme="minorHAnsi" w:eastAsiaTheme="minorEastAsia" w:hAnsiTheme="minorHAnsi" w:cstheme="minorBidi" w:hint="eastAsia"/>
+              <w:rFonts w:asciiTheme="minorHAnsi" w:eastAsiaTheme="minorEastAsia" w:hAnsiTheme="minorHAnsi" w:cstheme="minorBidi"/>
               <w:noProof/>
               <w:sz w:val="22"/>
               <w:szCs w:val="24"/>
@@ -6331,7 +6331,7 @@
             </w:tabs>
             <w:ind w:left="960" w:firstLine="480"/>
             <w:rPr>
-              <w:rFonts w:asciiTheme="minorHAnsi" w:eastAsiaTheme="minorEastAsia" w:hAnsiTheme="minorHAnsi" w:cstheme="minorBidi" w:hint="eastAsia"/>
+              <w:rFonts w:asciiTheme="minorHAnsi" w:eastAsiaTheme="minorEastAsia" w:hAnsiTheme="minorHAnsi" w:cstheme="minorBidi"/>
               <w:noProof/>
               <w:sz w:val="22"/>
               <w:szCs w:val="24"/>
@@ -6425,7 +6425,7 @@
             </w:tabs>
             <w:ind w:left="960" w:firstLine="480"/>
             <w:rPr>
-              <w:rFonts w:asciiTheme="minorHAnsi" w:eastAsiaTheme="minorEastAsia" w:hAnsiTheme="minorHAnsi" w:cstheme="minorBidi" w:hint="eastAsia"/>
+              <w:rFonts w:asciiTheme="minorHAnsi" w:eastAsiaTheme="minorEastAsia" w:hAnsiTheme="minorHAnsi" w:cstheme="minorBidi"/>
               <w:noProof/>
               <w:sz w:val="22"/>
               <w:szCs w:val="24"/>
@@ -6519,7 +6519,7 @@
             </w:tabs>
             <w:ind w:left="480" w:firstLine="480"/>
             <w:rPr>
-              <w:rFonts w:asciiTheme="minorHAnsi" w:eastAsiaTheme="minorEastAsia" w:hAnsiTheme="minorHAnsi" w:cstheme="minorBidi" w:hint="eastAsia"/>
+              <w:rFonts w:asciiTheme="minorHAnsi" w:eastAsiaTheme="minorEastAsia" w:hAnsiTheme="minorHAnsi" w:cstheme="minorBidi"/>
               <w:noProof/>
               <w:sz w:val="22"/>
               <w:szCs w:val="24"/>
@@ -6609,7 +6609,7 @@
           <w:pPr>
             <w:pStyle w:val="TOC1"/>
             <w:rPr>
-              <w:rFonts w:asciiTheme="minorHAnsi" w:eastAsiaTheme="minorEastAsia" w:hAnsiTheme="minorHAnsi" w:cstheme="minorBidi" w:hint="eastAsia"/>
+              <w:rFonts w:asciiTheme="minorHAnsi" w:eastAsiaTheme="minorEastAsia" w:hAnsiTheme="minorHAnsi" w:cstheme="minorBidi"/>
               <w:sz w:val="22"/>
               <w14:ligatures w14:val="standardContextual"/>
             </w:rPr>
@@ -6682,7 +6682,7 @@
             </w:tabs>
             <w:ind w:left="480" w:firstLine="480"/>
             <w:rPr>
-              <w:rFonts w:asciiTheme="minorHAnsi" w:eastAsiaTheme="minorEastAsia" w:hAnsiTheme="minorHAnsi" w:cstheme="minorBidi" w:hint="eastAsia"/>
+              <w:rFonts w:asciiTheme="minorHAnsi" w:eastAsiaTheme="minorEastAsia" w:hAnsiTheme="minorHAnsi" w:cstheme="minorBidi"/>
               <w:noProof/>
               <w:sz w:val="22"/>
               <w:szCs w:val="24"/>
@@ -6776,7 +6776,7 @@
             </w:tabs>
             <w:ind w:left="480" w:firstLine="480"/>
             <w:rPr>
-              <w:rFonts w:asciiTheme="minorHAnsi" w:eastAsiaTheme="minorEastAsia" w:hAnsiTheme="minorHAnsi" w:cstheme="minorBidi" w:hint="eastAsia"/>
+              <w:rFonts w:asciiTheme="minorHAnsi" w:eastAsiaTheme="minorEastAsia" w:hAnsiTheme="minorHAnsi" w:cstheme="minorBidi"/>
               <w:noProof/>
               <w:sz w:val="22"/>
               <w:szCs w:val="24"/>
@@ -6870,7 +6870,7 @@
             </w:tabs>
             <w:ind w:left="960" w:firstLine="480"/>
             <w:rPr>
-              <w:rFonts w:asciiTheme="minorHAnsi" w:eastAsiaTheme="minorEastAsia" w:hAnsiTheme="minorHAnsi" w:cstheme="minorBidi" w:hint="eastAsia"/>
+              <w:rFonts w:asciiTheme="minorHAnsi" w:eastAsiaTheme="minorEastAsia" w:hAnsiTheme="minorHAnsi" w:cstheme="minorBidi"/>
               <w:noProof/>
               <w:sz w:val="22"/>
               <w:szCs w:val="24"/>
@@ -6964,7 +6964,7 @@
             </w:tabs>
             <w:ind w:left="960" w:firstLine="480"/>
             <w:rPr>
-              <w:rFonts w:asciiTheme="minorHAnsi" w:eastAsiaTheme="minorEastAsia" w:hAnsiTheme="minorHAnsi" w:cstheme="minorBidi" w:hint="eastAsia"/>
+              <w:rFonts w:asciiTheme="minorHAnsi" w:eastAsiaTheme="minorEastAsia" w:hAnsiTheme="minorHAnsi" w:cstheme="minorBidi"/>
               <w:noProof/>
               <w:sz w:val="22"/>
               <w:szCs w:val="24"/>
@@ -7058,7 +7058,7 @@
             </w:tabs>
             <w:ind w:left="480" w:firstLine="480"/>
             <w:rPr>
-              <w:rFonts w:asciiTheme="minorHAnsi" w:eastAsiaTheme="minorEastAsia" w:hAnsiTheme="minorHAnsi" w:cstheme="minorBidi" w:hint="eastAsia"/>
+              <w:rFonts w:asciiTheme="minorHAnsi" w:eastAsiaTheme="minorEastAsia" w:hAnsiTheme="minorHAnsi" w:cstheme="minorBidi"/>
               <w:noProof/>
               <w:sz w:val="22"/>
               <w:szCs w:val="24"/>
@@ -7152,7 +7152,7 @@
             </w:tabs>
             <w:ind w:left="960" w:firstLine="480"/>
             <w:rPr>
-              <w:rFonts w:asciiTheme="minorHAnsi" w:eastAsiaTheme="minorEastAsia" w:hAnsiTheme="minorHAnsi" w:cstheme="minorBidi" w:hint="eastAsia"/>
+              <w:rFonts w:asciiTheme="minorHAnsi" w:eastAsiaTheme="minorEastAsia" w:hAnsiTheme="minorHAnsi" w:cstheme="minorBidi"/>
               <w:noProof/>
               <w:sz w:val="22"/>
               <w:szCs w:val="24"/>
@@ -7246,7 +7246,7 @@
             </w:tabs>
             <w:ind w:left="960" w:firstLine="480"/>
             <w:rPr>
-              <w:rFonts w:asciiTheme="minorHAnsi" w:eastAsiaTheme="minorEastAsia" w:hAnsiTheme="minorHAnsi" w:cstheme="minorBidi" w:hint="eastAsia"/>
+              <w:rFonts w:asciiTheme="minorHAnsi" w:eastAsiaTheme="minorEastAsia" w:hAnsiTheme="minorHAnsi" w:cstheme="minorBidi"/>
               <w:noProof/>
               <w:sz w:val="22"/>
               <w:szCs w:val="24"/>
@@ -7340,7 +7340,7 @@
             </w:tabs>
             <w:ind w:left="960" w:firstLine="480"/>
             <w:rPr>
-              <w:rFonts w:asciiTheme="minorHAnsi" w:eastAsiaTheme="minorEastAsia" w:hAnsiTheme="minorHAnsi" w:cstheme="minorBidi" w:hint="eastAsia"/>
+              <w:rFonts w:asciiTheme="minorHAnsi" w:eastAsiaTheme="minorEastAsia" w:hAnsiTheme="minorHAnsi" w:cstheme="minorBidi"/>
               <w:noProof/>
               <w:sz w:val="22"/>
               <w:szCs w:val="24"/>
@@ -7434,7 +7434,7 @@
             </w:tabs>
             <w:ind w:left="480" w:firstLine="480"/>
             <w:rPr>
-              <w:rFonts w:asciiTheme="minorHAnsi" w:eastAsiaTheme="minorEastAsia" w:hAnsiTheme="minorHAnsi" w:cstheme="minorBidi" w:hint="eastAsia"/>
+              <w:rFonts w:asciiTheme="minorHAnsi" w:eastAsiaTheme="minorEastAsia" w:hAnsiTheme="minorHAnsi" w:cstheme="minorBidi"/>
               <w:noProof/>
               <w:sz w:val="22"/>
               <w:szCs w:val="24"/>
@@ -7528,7 +7528,7 @@
             </w:tabs>
             <w:ind w:left="960" w:firstLine="480"/>
             <w:rPr>
-              <w:rFonts w:asciiTheme="minorHAnsi" w:eastAsiaTheme="minorEastAsia" w:hAnsiTheme="minorHAnsi" w:cstheme="minorBidi" w:hint="eastAsia"/>
+              <w:rFonts w:asciiTheme="minorHAnsi" w:eastAsiaTheme="minorEastAsia" w:hAnsiTheme="minorHAnsi" w:cstheme="minorBidi"/>
               <w:noProof/>
               <w:sz w:val="22"/>
               <w:szCs w:val="24"/>
@@ -7622,7 +7622,7 @@
             </w:tabs>
             <w:ind w:left="960" w:firstLine="480"/>
             <w:rPr>
-              <w:rFonts w:asciiTheme="minorHAnsi" w:eastAsiaTheme="minorEastAsia" w:hAnsiTheme="minorHAnsi" w:cstheme="minorBidi" w:hint="eastAsia"/>
+              <w:rFonts w:asciiTheme="minorHAnsi" w:eastAsiaTheme="minorEastAsia" w:hAnsiTheme="minorHAnsi" w:cstheme="minorBidi"/>
               <w:noProof/>
               <w:sz w:val="22"/>
               <w:szCs w:val="24"/>
@@ -7716,7 +7716,7 @@
             </w:tabs>
             <w:ind w:left="960" w:firstLine="480"/>
             <w:rPr>
-              <w:rFonts w:asciiTheme="minorHAnsi" w:eastAsiaTheme="minorEastAsia" w:hAnsiTheme="minorHAnsi" w:cstheme="minorBidi" w:hint="eastAsia"/>
+              <w:rFonts w:asciiTheme="minorHAnsi" w:eastAsiaTheme="minorEastAsia" w:hAnsiTheme="minorHAnsi" w:cstheme="minorBidi"/>
               <w:noProof/>
               <w:sz w:val="22"/>
               <w:szCs w:val="24"/>
@@ -7810,7 +7810,7 @@
             </w:tabs>
             <w:ind w:left="960" w:firstLine="480"/>
             <w:rPr>
-              <w:rFonts w:asciiTheme="minorHAnsi" w:eastAsiaTheme="minorEastAsia" w:hAnsiTheme="minorHAnsi" w:cstheme="minorBidi" w:hint="eastAsia"/>
+              <w:rFonts w:asciiTheme="minorHAnsi" w:eastAsiaTheme="minorEastAsia" w:hAnsiTheme="minorHAnsi" w:cstheme="minorBidi"/>
               <w:noProof/>
               <w:sz w:val="22"/>
               <w:szCs w:val="24"/>
@@ -7904,7 +7904,7 @@
             </w:tabs>
             <w:ind w:left="480" w:firstLine="480"/>
             <w:rPr>
-              <w:rFonts w:asciiTheme="minorHAnsi" w:eastAsiaTheme="minorEastAsia" w:hAnsiTheme="minorHAnsi" w:cstheme="minorBidi" w:hint="eastAsia"/>
+              <w:rFonts w:asciiTheme="minorHAnsi" w:eastAsiaTheme="minorEastAsia" w:hAnsiTheme="minorHAnsi" w:cstheme="minorBidi"/>
               <w:noProof/>
               <w:sz w:val="22"/>
               <w:szCs w:val="24"/>
@@ -7994,7 +7994,7 @@
           <w:pPr>
             <w:pStyle w:val="TOC1"/>
             <w:rPr>
-              <w:rFonts w:asciiTheme="minorHAnsi" w:eastAsiaTheme="minorEastAsia" w:hAnsiTheme="minorHAnsi" w:cstheme="minorBidi" w:hint="eastAsia"/>
+              <w:rFonts w:asciiTheme="minorHAnsi" w:eastAsiaTheme="minorEastAsia" w:hAnsiTheme="minorHAnsi" w:cstheme="minorBidi"/>
               <w:sz w:val="22"/>
               <w14:ligatures w14:val="standardContextual"/>
             </w:rPr>
@@ -8067,7 +8067,7 @@
             </w:tabs>
             <w:ind w:left="480" w:firstLine="480"/>
             <w:rPr>
-              <w:rFonts w:asciiTheme="minorHAnsi" w:eastAsiaTheme="minorEastAsia" w:hAnsiTheme="minorHAnsi" w:cstheme="minorBidi" w:hint="eastAsia"/>
+              <w:rFonts w:asciiTheme="minorHAnsi" w:eastAsiaTheme="minorEastAsia" w:hAnsiTheme="minorHAnsi" w:cstheme="minorBidi"/>
               <w:noProof/>
               <w:sz w:val="22"/>
               <w:szCs w:val="24"/>
@@ -8161,7 +8161,7 @@
             </w:tabs>
             <w:ind w:left="480" w:firstLine="480"/>
             <w:rPr>
-              <w:rFonts w:asciiTheme="minorHAnsi" w:eastAsiaTheme="minorEastAsia" w:hAnsiTheme="minorHAnsi" w:cstheme="minorBidi" w:hint="eastAsia"/>
+              <w:rFonts w:asciiTheme="minorHAnsi" w:eastAsiaTheme="minorEastAsia" w:hAnsiTheme="minorHAnsi" w:cstheme="minorBidi"/>
               <w:noProof/>
               <w:sz w:val="22"/>
               <w:szCs w:val="24"/>
@@ -8251,7 +8251,7 @@
           <w:pPr>
             <w:pStyle w:val="TOC1"/>
             <w:rPr>
-              <w:rFonts w:asciiTheme="minorHAnsi" w:eastAsiaTheme="minorEastAsia" w:hAnsiTheme="minorHAnsi" w:cstheme="minorBidi" w:hint="eastAsia"/>
+              <w:rFonts w:asciiTheme="minorHAnsi" w:eastAsiaTheme="minorEastAsia" w:hAnsiTheme="minorHAnsi" w:cstheme="minorBidi"/>
               <w:sz w:val="22"/>
               <w14:ligatures w14:val="standardContextual"/>
             </w:rPr>
@@ -8320,7 +8320,7 @@
           <w:pPr>
             <w:pStyle w:val="TOC1"/>
             <w:rPr>
-              <w:rFonts w:asciiTheme="minorHAnsi" w:eastAsiaTheme="minorEastAsia" w:hAnsiTheme="minorHAnsi" w:cstheme="minorBidi" w:hint="eastAsia"/>
+              <w:rFonts w:asciiTheme="minorHAnsi" w:eastAsiaTheme="minorEastAsia" w:hAnsiTheme="minorHAnsi" w:cstheme="minorBidi"/>
               <w:sz w:val="22"/>
               <w14:ligatures w14:val="standardContextual"/>
             </w:rPr>
@@ -8389,7 +8389,7 @@
           <w:pPr>
             <w:pStyle w:val="TOC1"/>
             <w:rPr>
-              <w:rFonts w:asciiTheme="minorHAnsi" w:eastAsiaTheme="minorEastAsia" w:hAnsiTheme="minorHAnsi" w:cstheme="minorBidi" w:hint="eastAsia"/>
+              <w:rFonts w:asciiTheme="minorHAnsi" w:eastAsiaTheme="minorEastAsia" w:hAnsiTheme="minorHAnsi" w:cstheme="minorBidi"/>
               <w:sz w:val="22"/>
               <w14:ligatures w14:val="standardContextual"/>
             </w:rPr>
@@ -8545,8 +8545,8 @@
         </w:rPr>
       </w:pPr>
       <w:bookmarkStart w:id="1" w:name="_Toc218606034"/>
-      <w:bookmarkStart w:id="2" w:name="_Toc165367946"/>
-      <w:bookmarkStart w:id="3" w:name="_Toc226811183"/>
+      <w:bookmarkStart w:id="2" w:name="_Toc226811183"/>
+      <w:bookmarkStart w:id="3" w:name="_Toc165367946"/>
       <w:r>
         <w:rPr>
           <w:rFonts w:hint="eastAsia"/>
@@ -8560,7 +8560,7 @@
         <w:t>研究背景与意义</w:t>
       </w:r>
       <w:bookmarkEnd w:id="1"/>
-      <w:bookmarkEnd w:id="3"/>
+      <w:bookmarkEnd w:id="2"/>
     </w:p>
     <w:p>
       <w:pPr>
@@ -9350,7 +9350,7 @@
         <w:lastRenderedPageBreak/>
         <w:t>第2章</w:t>
       </w:r>
-      <w:bookmarkEnd w:id="2"/>
+      <w:bookmarkEnd w:id="3"/>
       <w:r>
         <w:rPr>
           <w:rFonts w:hint="eastAsia"/>
@@ -10211,10 +10211,10 @@
             <v:path o:extrusionok="f" gradientshapeok="t" o:connecttype="rect"/>
             <o:lock v:ext="edit" aspectratio="t"/>
           </v:shapetype>
-          <v:shape id="_x0000_i1025" type="#_x0000_t75" style="width:424pt;height:85.35pt" o:ole="">
+          <v:shape id="_x0000_i1025" type="#_x0000_t75" style="width:424.3pt;height:85.3pt" o:ole="">
             <v:imagedata r:id="rId19" o:title=""/>
           </v:shape>
-          <o:OLEObject Type="Embed" ProgID="Visio.Drawing.15" ShapeID="_x0000_i1025" DrawAspect="Content" ObjectID="_1837426466" r:id="rId20"/>
+          <o:OLEObject Type="Embed" ProgID="Visio.Drawing.15" ShapeID="_x0000_i1025" DrawAspect="Content" ObjectID="_1838053138" r:id="rId20"/>
         </w:object>
       </w:r>
     </w:p>
@@ -10819,30 +10819,27 @@
     <w:p>
       <w:pPr>
         <w:ind w:firstLine="480"/>
+      </w:pPr>
+      <w:r>
+        <w:t>最后，从系统实现需求出发，对关键技术的选型理由进行了简要说明，明确了后续将采用轻量化卷积神经网络完成表情分类、采用</w:t>
+      </w:r>
+      <w:r>
+        <w:t>YuNet</w:t>
+      </w:r>
+      <w:r>
+        <w:t>完成前端人脸检测，并结合半监督训练思路提升模型性能。具体的模型构建、训练方法和实验分析将在后续章节中进一步展开。</w:t>
+      </w:r>
+    </w:p>
+    <w:p>
+      <w:pPr>
+        <w:pStyle w:val="1"/>
         <w:rPr>
           <w:rFonts w:hint="eastAsia"/>
         </w:rPr>
       </w:pPr>
-      <w:r>
-        <w:t>最后，从系统实现需求出发，对关键技术的选型理由进行了简要说明，明确了后续将采用轻量化卷积神经网络完成表情分类、采用</w:t>
-      </w:r>
-      <w:r>
-        <w:t>YuNet</w:t>
-      </w:r>
-      <w:r>
-        <w:t>完成前端人脸检测，并结合半监督训练思路提升模型性能。具体的模型构建、训练方法和实验分析将在后续章节中进一步展开。</w:t>
-      </w:r>
-    </w:p>
-    <w:p>
-      <w:pPr>
-        <w:pStyle w:val="1"/>
-        <w:rPr>
-          <w:rFonts w:hint="eastAsia"/>
-        </w:rPr>
-      </w:pPr>
-      <w:bookmarkStart w:id="20" w:name="_Toc103343760"/>
-      <w:bookmarkStart w:id="21" w:name="_Toc165367969"/>
-      <w:bookmarkStart w:id="22" w:name="_Toc226811200"/>
+      <w:bookmarkStart w:id="20" w:name="_Toc226811200"/>
+      <w:bookmarkStart w:id="21" w:name="_Toc103343760"/>
+      <w:bookmarkStart w:id="22" w:name="_Toc165367969"/>
       <w:r>
         <w:rPr>
           <w:rFonts w:hint="eastAsia"/>
@@ -10853,7 +10850,7 @@
       <w:r>
         <w:t>表情识别模型构建与训练</w:t>
       </w:r>
-      <w:bookmarkEnd w:id="22"/>
+      <w:bookmarkEnd w:id="20"/>
     </w:p>
     <w:p>
       <w:pPr>
@@ -12693,9 +12690,6 @@
     <w:p>
       <w:pPr>
         <w:ind w:firstLine="480"/>
-        <w:rPr>
-          <w:rFonts w:hint="eastAsia"/>
-        </w:rPr>
       </w:pPr>
     </w:p>
     <w:p>
@@ -15262,9 +15256,6 @@
     <w:p>
       <w:pPr>
         <w:ind w:firstLine="480"/>
-        <w:rPr>
-          <w:rFonts w:hint="eastAsia"/>
-        </w:rPr>
       </w:pPr>
     </w:p>
     <w:p>
@@ -16500,9 +16491,6 @@
     <w:p>
       <w:pPr>
         <w:ind w:firstLine="480"/>
-        <w:rPr>
-          <w:rFonts w:hint="eastAsia"/>
-        </w:rPr>
       </w:pPr>
     </w:p>
     <w:p>
@@ -17467,9 +17455,6 @@
     <w:p>
       <w:pPr>
         <w:ind w:firstLine="480"/>
-        <w:rPr>
-          <w:rFonts w:hint="eastAsia"/>
-        </w:rPr>
       </w:pPr>
     </w:p>
     <w:p>
@@ -17826,7 +17811,6 @@
       <w:pPr>
         <w:ind w:firstLine="480"/>
         <w:rPr>
-          <w:rFonts w:hint="eastAsia"/>
           <w:iCs/>
         </w:rPr>
       </w:pPr>
@@ -18120,7 +18104,6 @@
         <w:spacing w:line="240" w:lineRule="auto"/>
         <w:ind w:firstLine="480"/>
         <w:rPr>
-          <w:rFonts w:hint="eastAsia"/>
           <w:iCs/>
         </w:rPr>
       </w:pPr>
@@ -19282,67 +19265,109 @@
     <w:p>
       <w:pPr>
         <w:pStyle w:val="ae"/>
-        <w:ind w:firstLine="400"/>
+        <w:ind w:firstLine="420"/>
         <w:jc w:val="center"/>
+        <w:rPr>
+          <w:sz w:val="21"/>
+          <w:szCs w:val="21"/>
+        </w:rPr>
       </w:pPr>
       <w:r>
         <w:rPr>
           <w:rFonts w:hint="eastAsia"/>
+          <w:sz w:val="21"/>
+          <w:szCs w:val="21"/>
         </w:rPr>
         <w:t>图</w:t>
       </w:r>
       <w:r>
         <w:rPr>
           <w:rFonts w:hint="eastAsia"/>
+          <w:sz w:val="21"/>
+          <w:szCs w:val="21"/>
         </w:rPr>
         <w:t xml:space="preserve"> 4-</w:t>
       </w:r>
       <w:r>
+        <w:rPr>
+          <w:sz w:val="21"/>
+          <w:szCs w:val="21"/>
+        </w:rPr>
         <w:fldChar w:fldCharType="begin"/>
       </w:r>
       <w:r>
+        <w:rPr>
+          <w:sz w:val="21"/>
+          <w:szCs w:val="21"/>
+        </w:rPr>
         <w:instrText xml:space="preserve"> </w:instrText>
       </w:r>
       <w:r>
         <w:rPr>
           <w:rFonts w:hint="eastAsia"/>
+          <w:sz w:val="21"/>
+          <w:szCs w:val="21"/>
         </w:rPr>
         <w:instrText xml:space="preserve">SEQ </w:instrText>
       </w:r>
       <w:r>
         <w:rPr>
           <w:rFonts w:hint="eastAsia"/>
+          <w:sz w:val="21"/>
+          <w:szCs w:val="21"/>
         </w:rPr>
         <w:instrText>图</w:instrText>
       </w:r>
       <w:r>
         <w:rPr>
           <w:rFonts w:hint="eastAsia"/>
+          <w:sz w:val="21"/>
+          <w:szCs w:val="21"/>
         </w:rPr>
         <w:instrText xml:space="preserve"> \* ARABIC</w:instrText>
       </w:r>
       <w:r>
+        <w:rPr>
+          <w:sz w:val="21"/>
+          <w:szCs w:val="21"/>
+        </w:rPr>
         <w:instrText xml:space="preserve"> </w:instrText>
       </w:r>
       <w:r>
+        <w:rPr>
+          <w:sz w:val="21"/>
+          <w:szCs w:val="21"/>
+        </w:rPr>
         <w:fldChar w:fldCharType="separate"/>
       </w:r>
       <w:r>
         <w:rPr>
           <w:noProof/>
+          <w:sz w:val="21"/>
+          <w:szCs w:val="21"/>
         </w:rPr>
         <w:t>1</w:t>
       </w:r>
       <w:r>
+        <w:rPr>
+          <w:sz w:val="21"/>
+          <w:szCs w:val="21"/>
+        </w:rPr>
         <w:fldChar w:fldCharType="end"/>
       </w:r>
       <w:r>
         <w:rPr>
           <w:rFonts w:hint="eastAsia"/>
+          <w:sz w:val="21"/>
+          <w:szCs w:val="21"/>
         </w:rPr>
         <w:t>测试集和验证集的</w:t>
       </w:r>
       <w:r>
+        <w:rPr>
+          <w:sz w:val="21"/>
+          <w:szCs w:val="21"/>
+        </w:rPr>
         <w:t>混淆矩阵</w:t>
       </w:r>
     </w:p>
@@ -19484,22 +19509,34 @@
       <w:pPr>
         <w:pStyle w:val="ae"/>
         <w:keepNext/>
-        <w:ind w:firstLine="400"/>
+        <w:ind w:firstLine="420"/>
         <w:jc w:val="center"/>
+        <w:rPr>
+          <w:sz w:val="21"/>
+          <w:szCs w:val="21"/>
+        </w:rPr>
       </w:pPr>
       <w:r>
         <w:rPr>
           <w:rFonts w:hint="eastAsia"/>
+          <w:sz w:val="21"/>
+          <w:szCs w:val="21"/>
         </w:rPr>
         <w:t>表</w:t>
       </w:r>
       <w:r>
         <w:rPr>
           <w:rFonts w:hint="eastAsia"/>
+          <w:sz w:val="21"/>
+          <w:szCs w:val="21"/>
         </w:rPr>
         <w:t xml:space="preserve"> 4-2 </w:t>
       </w:r>
       <w:r>
+        <w:rPr>
+          <w:sz w:val="21"/>
+          <w:szCs w:val="21"/>
+        </w:rPr>
         <w:t>最终模型在各类别上的评价指标</w:t>
       </w:r>
     </w:p>
@@ -20832,7 +20869,11 @@
       </w:r>
       <w:proofErr w:type="gramEnd"/>
       <w:r>
-        <w:t>运行过程展开说明。这样的章节分工也更符合毕业设计</w:t>
+        <w:t>运行过程展开说明。这样的</w:t>
+      </w:r>
+      <w:r>
+        <w:lastRenderedPageBreak/>
+        <w:t>章节分工也更符合毕业设计</w:t>
       </w:r>
       <w:r>
         <w:t>“</w:t>
@@ -20856,29 +20897,7 @@
         <w:t>”</w:t>
       </w:r>
       <w:r>
-        <w:t>相互衔接的整体逻</w:t>
-      </w:r>
-      <w:r>
-        <w:lastRenderedPageBreak/>
-        <w:t>辑。老师对你也专门提醒过，这类</w:t>
-      </w:r>
-      <w:r>
-        <w:t>“</w:t>
-      </w:r>
-      <w:r>
-        <w:t>系统运行后再针对问题做的优化</w:t>
-      </w:r>
-      <w:r>
-        <w:t>”</w:t>
-      </w:r>
-      <w:r>
-        <w:t>更适合放在第</w:t>
-      </w:r>
-      <w:r>
-        <w:t>5</w:t>
-      </w:r>
-      <w:r>
-        <w:t>章来体现。</w:t>
+        <w:t>相互衔接的整体逻辑。</w:t>
       </w:r>
     </w:p>
     <w:p>
@@ -20999,8 +21018,8 @@
         </w:rPr>
       </w:pPr>
       <w:bookmarkStart w:id="51" w:name="_Toc226811229"/>
-      <w:bookmarkEnd w:id="20"/>
       <w:bookmarkEnd w:id="21"/>
+      <w:bookmarkEnd w:id="22"/>
       <w:r>
         <w:lastRenderedPageBreak/>
         <w:t>第5章 系统实现、模型部署与运行测试</w:t>
@@ -21034,13 +21053,7 @@
       </w:r>
       <w:proofErr w:type="gramEnd"/>
       <w:r>
-        <w:t>与部署，实现了基于摄像头视频流的人脸表情实时识别。系统整体运行流程包括视频采集、人脸检测、人脸区域预处理、表情分类以及结果显示五个主要环节，其核心目标是在树莓派平台上完成轻量化、低延迟的实时推理任务。论文前文也已明确，第</w:t>
-      </w:r>
-      <w:r>
-        <w:t>5</w:t>
-      </w:r>
-      <w:r>
-        <w:t>章的重点应当落在系统实现、模型部署以及运行测试结果上，而不是继续停留在纯算法介绍层面。</w:t>
+        <w:t>与部署，实现了基于摄像头视频流的人脸表情实时识别。系统整体运行流程包括视频采集、人脸检测、人脸区域预处理、表情分类以及结果显示五个主要环节，其核心目标是在树莓派平台上完成轻量化、低延迟的实时推理任务。</w:t>
       </w:r>
     </w:p>
     <w:p>
@@ -21051,7 +21064,7 @@
         <w:t>系统运行时，首先通过摄像头实时采集视频帧，并对图像进行基础处理，以保证后续检测与识别过程具有稳定输入。推理程序中将摄像头输入分辨率设置为</w:t>
       </w:r>
       <w:r>
-        <w:t xml:space="preserve"> 640×480</w:t>
+        <w:t>640×480</w:t>
       </w:r>
       <w:r>
         <w:t>，目标</w:t>
@@ -21065,7 +21078,7 @@
         <w:t>为</w:t>
       </w:r>
       <w:r>
-        <w:t xml:space="preserve"> 30 FPS</w:t>
+        <w:t>30FPS</w:t>
       </w:r>
       <w:r>
         <w:t>，同时支持镜像翻转显示，以便于实际交互观察。为了兼顾实时性与识别效果，系统在采集视频后并不直接对</w:t>
@@ -21079,7 +21092,7 @@
         <w:t>表情分类，而是先利用</w:t>
       </w:r>
       <w:r>
-        <w:t xml:space="preserve"> YuNet </w:t>
+        <w:t>YuNet</w:t>
       </w:r>
       <w:r>
         <w:t>轻量级人脸检测模型完成人脸</w:t>
@@ -21109,7 +21122,7 @@
         <w:t>缩放到较低分辨率后输入</w:t>
       </w:r>
       <w:r>
-        <w:t xml:space="preserve"> YuNet </w:t>
+        <w:t>YuNet</w:t>
       </w:r>
       <w:r>
         <w:t>模型，以降低检测开销。</w:t>
@@ -21123,37 +21136,54 @@
         <w:t>中，检测输入尺寸设置为</w:t>
       </w:r>
       <w:r>
-        <w:t xml:space="preserve"> 256×192</w:t>
+        <w:t>256×192</w:t>
       </w:r>
       <w:r>
         <w:t>，并采用间隔检测策略，即每</w:t>
       </w:r>
       <w:r>
-        <w:t xml:space="preserve"> 3 </w:t>
+        <w:t>3</w:t>
+      </w:r>
+      <w:r>
+        <w:t>帧执行一次完整人脸检测，其余</w:t>
       </w:r>
       <w:proofErr w:type="gramStart"/>
       <w:r>
-        <w:t>帧执行</w:t>
+        <w:t>帧</w:t>
       </w:r>
       <w:proofErr w:type="gramEnd"/>
       <w:r>
-        <w:t>一次完整人脸检测，其余</w:t>
+        <w:t>利用轻量跟踪机制维持目标状态。这样的设计可以明显减少重复检测所带来的额外负载，在保持检测连续性的同时提高</w:t>
       </w:r>
       <w:proofErr w:type="gramStart"/>
       <w:r>
-        <w:t>帧</w:t>
+        <w:t>端侧运行</w:t>
       </w:r>
       <w:proofErr w:type="gramEnd"/>
       <w:r>
-        <w:t>利用轻量跟踪机制维持目标状态。这样的设计可以明显减少重复检测所带来的额外负载，在保持检测连续性的同时提高</w:t>
+        <w:t>效率。</w:t>
+      </w:r>
+    </w:p>
+    <w:p>
+      <w:pPr>
+        <w:ind w:firstLine="480"/>
+      </w:pPr>
+      <w:r>
+        <w:t>在人脸区域预处理阶段，系统根据检测</w:t>
       </w:r>
       <w:proofErr w:type="gramStart"/>
       <w:r>
-        <w:t>端侧运行</w:t>
+        <w:t>框位置</w:t>
       </w:r>
       <w:proofErr w:type="gramEnd"/>
       <w:r>
-        <w:t>效率。</w:t>
+        <w:t>对原始图像中的人脸区域进行裁剪，并按一定比例对边界进行扩展，构造更完整的人脸正方形区域。随后，将裁剪得到的人脸图像统一缩放为</w:t>
+      </w:r>
+      <w:r>
+        <w:t>224×224</w:t>
+      </w:r>
+      <w:r>
+        <w:t>，并按照训练阶段相同的均值与标准差进行归一化处理，以保证部署阶段输入分布与训练阶段保持一致。这样可以减小由输入尺度变化和像素分布差异带来的性能波动。</w:t>
       </w:r>
     </w:p>
     <w:p>
@@ -21161,21 +21191,71 @@
         <w:ind w:firstLine="480"/>
       </w:pPr>
       <w:r>
-        <w:t>在人脸区域预处理阶段，系统根据检测</w:t>
+        <w:t>在人脸表情分类阶段，预处理后的人脸图像被送入部署在树莓派端的</w:t>
+      </w:r>
+      <w:proofErr w:type="spellStart"/>
+      <w:r>
+        <w:t>TFLite</w:t>
+      </w:r>
+      <w:proofErr w:type="spellEnd"/>
+      <w:r>
+        <w:t>表情识别模型进行推理。模型输出</w:t>
+      </w:r>
+      <w:r>
+        <w:t>anger</w:t>
+      </w:r>
+      <w:r>
+        <w:t>、</w:t>
+      </w:r>
+      <w:r>
+        <w:t>disgust</w:t>
+      </w:r>
+      <w:r>
+        <w:t>、</w:t>
+      </w:r>
+      <w:r>
+        <w:t>fear</w:t>
+      </w:r>
+      <w:r>
+        <w:t>、</w:t>
+      </w:r>
+      <w:r>
+        <w:t>happy</w:t>
+      </w:r>
+      <w:r>
+        <w:t>、</w:t>
+      </w:r>
+      <w:r>
+        <w:t>sad</w:t>
+      </w:r>
+      <w:r>
+        <w:t>、</w:t>
+      </w:r>
+      <w:r>
+        <w:t>surprise</w:t>
+      </w:r>
+      <w:r>
+        <w:t>和</w:t>
+      </w:r>
+      <w:r>
+        <w:t>neutral</w:t>
+      </w:r>
+      <w:r>
+        <w:t>共</w:t>
+      </w:r>
+      <w:r>
+        <w:t>7</w:t>
+      </w:r>
+      <w:r>
+        <w:t>类表情的预测概率，系统根据最大概率对应类别作为当前识别结果，并设置置信度阈值筛除低可信度输出。为进一步</w:t>
       </w:r>
       <w:proofErr w:type="gramStart"/>
       <w:r>
-        <w:t>框位置</w:t>
+        <w:t>降低端侧负载</w:t>
       </w:r>
       <w:proofErr w:type="gramEnd"/>
       <w:r>
-        <w:t>对原始图像中的人脸区域进行裁剪，并按一定比例对边界进行扩展，构造更完整的人脸正方形区域。随后，将裁剪得到的人脸图像统一缩放为</w:t>
-      </w:r>
-      <w:r>
-        <w:t xml:space="preserve"> 224×224</w:t>
-      </w:r>
-      <w:r>
-        <w:t>，并按照训练阶段相同的均值与标准差进行归一化处理，以保证部署阶段输入分布与训练阶段保持一致。这样可以减小由输入尺度变化和像素分布差异带来的性能波动。</w:t>
+        <w:t>，程序中还限制了最大跟踪人脸数和单次参与分类的人脸数，从而使系统在资源受限平台上仍能够维持较高的响应速度。</w:t>
       </w:r>
     </w:p>
     <w:p>
@@ -21183,100 +21263,25 @@
         <w:ind w:firstLine="480"/>
       </w:pPr>
       <w:r>
-        <w:t>在人脸表情分类阶段，预处理后的人脸图像被送入部署在树莓派端的</w:t>
-      </w:r>
-      <w:r>
-        <w:t xml:space="preserve"> </w:t>
-      </w:r>
-      <w:proofErr w:type="spellStart"/>
-      <w:r>
-        <w:t>TFLite</w:t>
-      </w:r>
-      <w:proofErr w:type="spellEnd"/>
-      <w:r>
-        <w:t xml:space="preserve"> </w:t>
-      </w:r>
-      <w:r>
-        <w:t>表情识别模型进行推理。模型输出</w:t>
-      </w:r>
-      <w:r>
-        <w:t xml:space="preserve"> anger</w:t>
-      </w:r>
-      <w:r>
-        <w:t>、</w:t>
-      </w:r>
-      <w:r>
-        <w:t>disgust</w:t>
-      </w:r>
-      <w:r>
-        <w:t>、</w:t>
-      </w:r>
-      <w:r>
-        <w:t>fear</w:t>
-      </w:r>
-      <w:r>
-        <w:t>、</w:t>
-      </w:r>
-      <w:r>
-        <w:t>happy</w:t>
-      </w:r>
-      <w:r>
-        <w:t>、</w:t>
-      </w:r>
-      <w:r>
-        <w:t>sad</w:t>
-      </w:r>
-      <w:r>
-        <w:t>、</w:t>
-      </w:r>
-      <w:r>
-        <w:t xml:space="preserve">surprise </w:t>
-      </w:r>
-      <w:r>
-        <w:t>和</w:t>
-      </w:r>
-      <w:r>
-        <w:t xml:space="preserve"> neutral </w:t>
-      </w:r>
-      <w:r>
-        <w:t>共</w:t>
-      </w:r>
-      <w:r>
-        <w:t xml:space="preserve"> 7 </w:t>
-      </w:r>
-      <w:r>
-        <w:t>类表情的预测概率，系统根据最大概率对应类别作为当前识别结果，并设置置信度阈值筛除低可信度输出。为进一步</w:t>
+        <w:t>在结果显示阶段，系统将检测框、</w:t>
       </w:r>
       <w:proofErr w:type="gramStart"/>
       <w:r>
-        <w:t>降低端侧负载</w:t>
+        <w:t>五关键</w:t>
       </w:r>
       <w:proofErr w:type="gramEnd"/>
       <w:r>
-        <w:t>，程序中还限制了最大跟踪人脸数和单次参与分类的人脸数，从而使系统在资源受限平台上仍能够维持较高的响应速度。</w:t>
-      </w:r>
-    </w:p>
-    <w:p>
-      <w:pPr>
-        <w:ind w:firstLine="480"/>
-      </w:pPr>
+        <w:t>点、表情类别、预测置信度以及</w:t>
+      </w:r>
+      <w:r>
+        <w:t xml:space="preserve"> FPS</w:t>
+      </w:r>
+      <w:r>
+        <w:t>、延迟、检测耗时和分类耗时等信息叠加到视频画面中，并通过图形窗口实时输出。同时，程序还支持按类别自动保存高质量识别结果图像，为后续演示和</w:t>
+      </w:r>
       <w:r>
         <w:lastRenderedPageBreak/>
-        <w:t>在结果显示阶段，系统将检测框、</w:t>
-      </w:r>
-      <w:proofErr w:type="gramStart"/>
-      <w:r>
-        <w:t>五关键</w:t>
-      </w:r>
-      <w:proofErr w:type="gramEnd"/>
-      <w:r>
-        <w:t>点、表情类别、预测置信度以及</w:t>
-      </w:r>
-      <w:r>
-        <w:t xml:space="preserve"> FPS</w:t>
-      </w:r>
-      <w:r>
-        <w:t>、延迟、检测耗时和分类耗时等信息叠加到视频画面中，并通过图形窗口实时输出。同时，程序还支持按类别自动保存高质量识别结果图像，为后续演示和误差分析提供依据。整体来看，系统已经完成了从</w:t>
+        <w:t>误差分析提供依据。整体来看，系统已经完成了从</w:t>
       </w:r>
       <w:r>
         <w:t>“</w:t>
@@ -21356,7 +21361,7 @@
         <w:t>平台上的可部署性，本文分别在</w:t>
       </w:r>
       <w:r>
-        <w:t xml:space="preserve"> PC </w:t>
+        <w:t>PC</w:t>
       </w:r>
       <w:r>
         <w:t>端和</w:t>
@@ -21370,7 +21375,7 @@
         <w:t>了模型训练、转换与部署实验。其中，</w:t>
       </w:r>
       <w:r>
-        <w:t xml:space="preserve">PC </w:t>
+        <w:t>PC</w:t>
       </w:r>
       <w:proofErr w:type="gramStart"/>
       <w:r>
@@ -21389,13 +21394,13 @@
         <w:t>用于摄像头接入、实时推理与运行验证。通过构建</w:t>
       </w:r>
       <w:r>
-        <w:t xml:space="preserve">“PC </w:t>
+        <w:t>“PC</w:t>
       </w:r>
       <w:r>
         <w:t>端训练</w:t>
       </w:r>
       <w:r>
-        <w:t xml:space="preserve"> + </w:t>
+        <w:t>+</w:t>
       </w:r>
       <w:r>
         <w:t>端侧部署</w:t>
@@ -21428,7 +21433,7 @@
         <w:t>在软件环境方面，</w:t>
       </w:r>
       <w:r>
-        <w:t xml:space="preserve">PC </w:t>
+        <w:t>PC</w:t>
       </w:r>
       <w:proofErr w:type="gramStart"/>
       <w:r>
@@ -21439,133 +21444,403 @@
         <w:t>承担模型训练与导出任务。根据模型导出脚本，系统在</w:t>
       </w:r>
       <w:r>
-        <w:t xml:space="preserve"> PC </w:t>
+        <w:t>PC</w:t>
       </w:r>
       <w:r>
         <w:t>端完成了训练好的</w:t>
       </w:r>
+      <w:proofErr w:type="spellStart"/>
+      <w:r>
+        <w:t>PyTorch</w:t>
+      </w:r>
+      <w:proofErr w:type="spellEnd"/>
       <w:r>
         <w:t xml:space="preserve"> </w:t>
       </w:r>
+      <w:r>
+        <w:t>模型加载，并进一步执行</w:t>
+      </w:r>
+      <w:r>
+        <w:t>ONNX</w:t>
+      </w:r>
+      <w:r>
+        <w:t>导出、</w:t>
+      </w:r>
+      <w:r>
+        <w:t>ONNX</w:t>
+      </w:r>
+      <w:r>
+        <w:t>简化、</w:t>
+      </w:r>
+      <w:r>
+        <w:t xml:space="preserve">TensorFlow </w:t>
+      </w:r>
       <w:proofErr w:type="spellStart"/>
       <w:r>
+        <w:t>SavedModel</w:t>
+      </w:r>
+      <w:proofErr w:type="spellEnd"/>
+      <w:r>
+        <w:t>转换以及</w:t>
+      </w:r>
+      <w:proofErr w:type="spellStart"/>
+      <w:r>
+        <w:t>TFLite</w:t>
+      </w:r>
+      <w:proofErr w:type="spellEnd"/>
+      <w:r>
+        <w:t>模型生成等过程。导出脚本中设置类别数为</w:t>
+      </w:r>
+      <w:r>
+        <w:t>7</w:t>
+      </w:r>
+      <w:r>
+        <w:t>、输入尺寸为</w:t>
+      </w:r>
+      <w:r>
+        <w:t>224×224</w:t>
+      </w:r>
+      <w:r>
+        <w:t>、输入布局为</w:t>
+      </w:r>
+      <w:r>
+        <w:t>NCHW</w:t>
+      </w:r>
+      <w:r>
+        <w:t>，并采用</w:t>
+      </w:r>
+      <w:r>
+        <w:t xml:space="preserve">ONNX </w:t>
+      </w:r>
+      <w:proofErr w:type="spellStart"/>
+      <w:r>
+        <w:t>opset</w:t>
+      </w:r>
+      <w:proofErr w:type="spellEnd"/>
+      <w:r>
+        <w:t xml:space="preserve"> 13</w:t>
+      </w:r>
+      <w:r>
+        <w:t>进行导出。脚本在模型转换过程中还引入了</w:t>
+      </w:r>
+      <w:r>
+        <w:t>ONNX Runtime</w:t>
+      </w:r>
+      <w:r>
+        <w:t>快速检查和验证报告保存功能，用于比较</w:t>
+      </w:r>
+      <w:proofErr w:type="spellStart"/>
+      <w:r>
         <w:t>PyTorch</w:t>
       </w:r>
       <w:proofErr w:type="spellEnd"/>
       <w:r>
+        <w:t>、</w:t>
+      </w:r>
+      <w:r>
+        <w:t>ONNX</w:t>
+      </w:r>
+      <w:r>
+        <w:t>与</w:t>
+      </w:r>
+      <w:proofErr w:type="spellStart"/>
+      <w:r>
+        <w:t>TFLite</w:t>
+      </w:r>
+      <w:proofErr w:type="spellEnd"/>
+      <w:r>
         <w:t xml:space="preserve"> </w:t>
       </w:r>
       <w:r>
-        <w:t>模型加载，并进一步执行</w:t>
-      </w:r>
-      <w:r>
-        <w:t xml:space="preserve"> ONNX </w:t>
-      </w:r>
-      <w:r>
-        <w:t>导出、</w:t>
-      </w:r>
-      <w:r>
-        <w:t xml:space="preserve">ONNX </w:t>
-      </w:r>
-      <w:r>
-        <w:t>简化、</w:t>
-      </w:r>
-      <w:r>
-        <w:t xml:space="preserve">TensorFlow </w:t>
+        <w:t>三种格式下输出结果的一致性。</w:t>
+      </w:r>
+    </w:p>
+    <w:p>
+      <w:pPr>
+        <w:ind w:firstLine="480"/>
+      </w:pPr>
+      <w:r>
+        <w:t>从量化配置来看，导出脚本支持</w:t>
+      </w:r>
+      <w:r>
+        <w:t>float32</w:t>
+      </w:r>
+      <w:r>
+        <w:t>、</w:t>
+      </w:r>
+      <w:r>
+        <w:t>fp16</w:t>
+      </w:r>
+      <w:r>
+        <w:t>和</w:t>
+      </w:r>
+      <w:r>
+        <w:t>int8</w:t>
+      </w:r>
+      <w:proofErr w:type="gramStart"/>
+      <w:r>
+        <w:t>三</w:t>
+      </w:r>
+      <w:proofErr w:type="gramEnd"/>
+      <w:r>
+        <w:t>种格式，其中当前部署使用的默认量化方式为</w:t>
+      </w:r>
+      <w:r>
+        <w:t>fp16</w:t>
+      </w:r>
+      <w:r>
+        <w:t>，并生成</w:t>
+      </w:r>
+      <w:r>
+        <w:t>model_fp16.tflite</w:t>
+      </w:r>
+      <w:r>
+        <w:t>文件。该设置能够在保持较好识别精度的同时降低模型体积与推理开销，更适合树莓派这类资源受限平台。与此同时，脚本仍保留了</w:t>
+      </w:r>
+      <w:r>
+        <w:t>int8</w:t>
+      </w:r>
+      <w:r>
+        <w:t>量化和代表性数据校准接口，为后续进一步压缩模型和</w:t>
+      </w:r>
+      <w:proofErr w:type="gramStart"/>
+      <w:r>
+        <w:t>优化端侧性能</w:t>
+      </w:r>
+      <w:proofErr w:type="gramEnd"/>
+      <w:r>
+        <w:t>提供了实现基础。</w:t>
+      </w:r>
+    </w:p>
+    <w:p>
+      <w:pPr>
+        <w:ind w:firstLine="480"/>
+      </w:pPr>
+      <w:r>
+        <w:t>在树莓派端，系统部署于</w:t>
+      </w:r>
+      <w:r>
+        <w:t>Debian</w:t>
+      </w:r>
+      <w:r>
+        <w:t>环境下，并通过独立虚拟环境完成依赖管理。根据部署脚本，系统首先安装</w:t>
+      </w:r>
+      <w:r>
+        <w:t>python3-venv</w:t>
+      </w:r>
+      <w:r>
+        <w:t>、</w:t>
+      </w:r>
+      <w:r>
+        <w:t>python3-pip</w:t>
+      </w:r>
+      <w:r>
+        <w:t>和</w:t>
       </w:r>
       <w:proofErr w:type="spellStart"/>
       <w:r>
-        <w:t>SavedModel</w:t>
+        <w:t>libatlas</w:t>
       </w:r>
       <w:proofErr w:type="spellEnd"/>
       <w:r>
-        <w:t xml:space="preserve"> </w:t>
-      </w:r>
-      <w:r>
-        <w:t>转换以及</w:t>
-      </w:r>
-      <w:r>
-        <w:t xml:space="preserve"> </w:t>
+        <w:t>-base-dev</w:t>
+      </w:r>
+      <w:r>
+        <w:t>等基础环境，然后创建</w:t>
+      </w:r>
+      <w:r>
+        <w:t>fer-pi5</w:t>
+      </w:r>
+      <w:r>
+        <w:t>虚拟环境，并在其中安装</w:t>
       </w:r>
       <w:proofErr w:type="spellStart"/>
       <w:r>
+        <w:t>numpy</w:t>
+      </w:r>
+      <w:proofErr w:type="spellEnd"/>
+      <w:r>
+        <w:t xml:space="preserve"> 1.26.4</w:t>
+      </w:r>
+      <w:r>
+        <w:t>、</w:t>
+      </w:r>
+      <w:proofErr w:type="spellStart"/>
+      <w:r>
+        <w:t>tflite</w:t>
+      </w:r>
+      <w:proofErr w:type="spellEnd"/>
+      <w:r>
+        <w:t>-runtime 2.14.0</w:t>
+      </w:r>
+      <w:r>
+        <w:t>和</w:t>
+      </w:r>
+      <w:proofErr w:type="spellStart"/>
+      <w:r>
+        <w:t>opencv</w:t>
+      </w:r>
+      <w:proofErr w:type="spellEnd"/>
+      <w:r>
+        <w:t>-</w:t>
+      </w:r>
+      <w:proofErr w:type="spellStart"/>
+      <w:r>
+        <w:t>contrib</w:t>
+      </w:r>
+      <w:proofErr w:type="spellEnd"/>
+      <w:r>
+        <w:t>-python 4.10.0.84</w:t>
+      </w:r>
+      <w:r>
+        <w:t>等核心运行依赖。其中，</w:t>
+      </w:r>
+      <w:proofErr w:type="spellStart"/>
+      <w:r>
+        <w:t>tflite</w:t>
+      </w:r>
+      <w:proofErr w:type="spellEnd"/>
+      <w:r>
+        <w:t>-runtime</w:t>
+      </w:r>
+      <w:r>
+        <w:t>负责执行表情识别模型推理，</w:t>
+      </w:r>
+      <w:r>
+        <w:t>OpenCV</w:t>
+      </w:r>
+      <w:r>
+        <w:t>主要承担摄像头读取、</w:t>
+      </w:r>
+      <w:r>
+        <w:t>YuNet</w:t>
+      </w:r>
+      <w:r>
+        <w:t>调用、图像预处理和结果显示等任务。</w:t>
+      </w:r>
+    </w:p>
+    <w:p>
+      <w:pPr>
+        <w:pStyle w:val="3"/>
+        <w:rPr>
+          <w:rFonts w:hint="eastAsia"/>
+        </w:rPr>
+      </w:pPr>
+      <w:bookmarkStart w:id="55" w:name="_Toc226811233"/>
+      <w:r>
+        <w:t>5.2.2 硬件平台配置</w:t>
+      </w:r>
+      <w:bookmarkEnd w:id="55"/>
+    </w:p>
+    <w:p>
+      <w:pPr>
+        <w:ind w:firstLine="480"/>
+      </w:pPr>
+      <w:r>
+        <w:t>在硬件平台方面，</w:t>
+      </w:r>
+      <w:r>
+        <w:t>PC</w:t>
+      </w:r>
+      <w:proofErr w:type="gramStart"/>
+      <w:r>
+        <w:t>端用于</w:t>
+      </w:r>
+      <w:proofErr w:type="gramEnd"/>
+      <w:r>
+        <w:t>模型训练与测试，其主要配置为</w:t>
+      </w:r>
+      <w:r>
+        <w:t>Intel Core i7-10870H</w:t>
+      </w:r>
+      <w:r>
+        <w:t>处理器、</w:t>
+      </w:r>
+      <w:r>
+        <w:t>32 GB</w:t>
+      </w:r>
+      <w:r>
+        <w:t>内存以及</w:t>
+      </w:r>
+      <w:r>
+        <w:t>NVIDIA GeForce RTX 3060 Laptop GPU</w:t>
+      </w:r>
+      <w:r>
+        <w:t>，操作</w:t>
+      </w:r>
+      <w:r>
+        <w:lastRenderedPageBreak/>
+        <w:t>系统为</w:t>
+      </w:r>
+      <w:r>
+        <w:t>Windows 11</w:t>
+      </w:r>
+      <w:r>
+        <w:t>。该平台主要用于完成前文所述多阶段训练、伪标签更新、模型导出及性能评估等任务。</w:t>
+      </w:r>
+    </w:p>
+    <w:p>
+      <w:pPr>
+        <w:ind w:firstLine="480"/>
+      </w:pPr>
+      <w:r>
+        <w:t>在</w:t>
+      </w:r>
+      <w:proofErr w:type="gramStart"/>
+      <w:r>
+        <w:t>端侧部署</w:t>
+      </w:r>
+      <w:proofErr w:type="gramEnd"/>
+      <w:r>
+        <w:t>平台方面，本文选用</w:t>
+      </w:r>
+      <w:r>
+        <w:t>Raspberry Pi 5 8 GB</w:t>
+      </w:r>
+      <w:r>
+        <w:t>版本作为嵌入式运行载体，并接入</w:t>
+      </w:r>
+      <w:r>
+        <w:t>H052-864-V4</w:t>
+      </w:r>
+      <w:r>
+        <w:t>摄像头模块完成视频采集。树莓</w:t>
+      </w:r>
+      <w:proofErr w:type="gramStart"/>
+      <w:r>
+        <w:t>派端主要</w:t>
+      </w:r>
+      <w:proofErr w:type="gramEnd"/>
+      <w:r>
+        <w:t>负责视频流接入、</w:t>
+      </w:r>
+      <w:r>
+        <w:t>YuNet</w:t>
+      </w:r>
+      <w:r>
+        <w:t>人脸检测、</w:t>
+      </w:r>
+      <w:proofErr w:type="spellStart"/>
+      <w:r>
         <w:t>TFLite</w:t>
       </w:r>
       <w:proofErr w:type="spellEnd"/>
       <w:r>
-        <w:t xml:space="preserve"> </w:t>
-      </w:r>
-      <w:r>
-        <w:t>模型生成等过程。导出脚本中设置类别数为</w:t>
-      </w:r>
-      <w:r>
-        <w:t xml:space="preserve"> 7</w:t>
-      </w:r>
-      <w:r>
-        <w:t>、输入尺寸为</w:t>
-      </w:r>
-      <w:r>
-        <w:t xml:space="preserve"> 224×224</w:t>
-      </w:r>
-      <w:r>
-        <w:t>、输入布局为</w:t>
-      </w:r>
-      <w:r>
-        <w:t xml:space="preserve"> NCHW</w:t>
-      </w:r>
-      <w:r>
-        <w:t>，并采用</w:t>
-      </w:r>
-      <w:r>
-        <w:t xml:space="preserve"> ONNX </w:t>
-      </w:r>
-      <w:proofErr w:type="spellStart"/>
-      <w:r>
-        <w:t>opset</w:t>
-      </w:r>
-      <w:proofErr w:type="spellEnd"/>
-      <w:r>
-        <w:t xml:space="preserve"> 13 </w:t>
-      </w:r>
-      <w:r>
-        <w:t>进行导出。脚本在模型转换过程中还引入了</w:t>
-      </w:r>
-      <w:r>
-        <w:t xml:space="preserve"> ONNX Runtime </w:t>
-      </w:r>
-      <w:r>
-        <w:t>快速检查和验证报告保存功能，用于比较</w:t>
-      </w:r>
-      <w:r>
-        <w:t xml:space="preserve"> </w:t>
-      </w:r>
-      <w:proofErr w:type="spellStart"/>
-      <w:r>
-        <w:t>PyTorch</w:t>
-      </w:r>
-      <w:proofErr w:type="spellEnd"/>
-      <w:r>
-        <w:t>、</w:t>
-      </w:r>
-      <w:r>
-        <w:t xml:space="preserve">ONNX </w:t>
-      </w:r>
-      <w:r>
-        <w:t>与</w:t>
-      </w:r>
-      <w:r>
-        <w:t xml:space="preserve"> </w:t>
-      </w:r>
-      <w:proofErr w:type="spellStart"/>
-      <w:r>
-        <w:t>TFLite</w:t>
-      </w:r>
-      <w:proofErr w:type="spellEnd"/>
-      <w:r>
-        <w:t xml:space="preserve"> </w:t>
-      </w:r>
-      <w:r>
-        <w:t>三种格式下输出结果的一致性。</w:t>
+        <w:t>模型推理以及识别结果显示等任务。由于树莓</w:t>
+      </w:r>
+      <w:proofErr w:type="gramStart"/>
+      <w:r>
+        <w:t>派计算</w:t>
+      </w:r>
+      <w:proofErr w:type="gramEnd"/>
+      <w:r>
+        <w:t>资源明显弱于</w:t>
+      </w:r>
+      <w:r>
+        <w:t>PC</w:t>
+      </w:r>
+      <w:r>
+        <w:t>平台，因此在部署实现中采用了降低检测分辨率、间隔执行检测、限制最大推理人脸数等优化策略，以在保证识别功能完整的前提下尽可能提高系统实时性。</w:t>
       </w:r>
     </w:p>
     <w:p>
@@ -21573,328 +21848,36 @@
         <w:ind w:firstLine="480"/>
       </w:pPr>
       <w:r>
-        <w:t>从量化配置来看，导出脚本支持</w:t>
-      </w:r>
-      <w:r>
-        <w:t xml:space="preserve"> float32</w:t>
-      </w:r>
-      <w:r>
-        <w:t>、</w:t>
-      </w:r>
-      <w:r>
-        <w:t xml:space="preserve">fp16 </w:t>
-      </w:r>
-      <w:r>
-        <w:t>和</w:t>
-      </w:r>
-      <w:r>
-        <w:t xml:space="preserve"> int8 </w:t>
-      </w:r>
-      <w:r>
-        <w:t>三种格式，其中当前部署使用的默认量化方式为</w:t>
-      </w:r>
-      <w:r>
-        <w:t xml:space="preserve"> fp16</w:t>
-      </w:r>
-      <w:r>
-        <w:t>，并生成</w:t>
-      </w:r>
-      <w:r>
-        <w:t xml:space="preserve"> model_fp16.tflite </w:t>
-      </w:r>
-      <w:r>
-        <w:t>文件。该设置能够在保持较好识别精度的同时降低模型体积与推理开销，更适合树莓派这类资源受限平台。与此同时，脚本仍保留了</w:t>
-      </w:r>
-      <w:r>
-        <w:t xml:space="preserve"> int8 </w:t>
-      </w:r>
-      <w:r>
-        <w:t>量化和代表性数据校准接口，为后续进一步压缩模型和</w:t>
+        <w:t>从推理程序参数配置来看，</w:t>
       </w:r>
       <w:proofErr w:type="gramStart"/>
       <w:r>
-        <w:t>优化端侧性能</w:t>
+        <w:t>树莓派端摄像头</w:t>
       </w:r>
       <w:proofErr w:type="gramEnd"/>
       <w:r>
-        <w:t>提供了实现基础。</w:t>
-      </w:r>
-    </w:p>
-    <w:p>
-      <w:pPr>
-        <w:ind w:firstLine="480"/>
-      </w:pPr>
-      <w:r>
-        <w:t>在树莓派端，系统部署于</w:t>
-      </w:r>
-      <w:r>
-        <w:t xml:space="preserve"> Debian </w:t>
-      </w:r>
-      <w:r>
-        <w:t>环境下，并通过独立虚拟环境完成依赖管理。根据部署脚本，系统首先安装</w:t>
-      </w:r>
-      <w:r>
-        <w:t xml:space="preserve"> python3-venv</w:t>
-      </w:r>
-      <w:r>
-        <w:t>、</w:t>
-      </w:r>
-      <w:r>
-        <w:t xml:space="preserve">python3-pip </w:t>
-      </w:r>
-      <w:r>
-        <w:t>和</w:t>
-      </w:r>
-      <w:r>
-        <w:t xml:space="preserve"> </w:t>
-      </w:r>
-      <w:proofErr w:type="spellStart"/>
-      <w:r>
-        <w:t>libatlas</w:t>
-      </w:r>
-      <w:proofErr w:type="spellEnd"/>
-      <w:r>
-        <w:t xml:space="preserve">-base-dev </w:t>
-      </w:r>
-      <w:r>
-        <w:t>等基础环境，然后创建</w:t>
-      </w:r>
-      <w:r>
-        <w:t xml:space="preserve"> fer-pi5 </w:t>
-      </w:r>
-      <w:r>
-        <w:t>虚拟环境，并在其中安装</w:t>
-      </w:r>
-      <w:r>
-        <w:t xml:space="preserve"> </w:t>
-      </w:r>
-      <w:proofErr w:type="spellStart"/>
-      <w:r>
-        <w:t>numpy</w:t>
-      </w:r>
-      <w:proofErr w:type="spellEnd"/>
-      <w:r>
-        <w:t xml:space="preserve"> 1.26.4</w:t>
-      </w:r>
-      <w:r>
-        <w:t>、</w:t>
-      </w:r>
-      <w:proofErr w:type="spellStart"/>
-      <w:r>
-        <w:t>tflite</w:t>
-      </w:r>
-      <w:proofErr w:type="spellEnd"/>
-      <w:r>
-        <w:t xml:space="preserve">-runtime 2.14.0 </w:t>
-      </w:r>
-      <w:r>
-        <w:t>和</w:t>
-      </w:r>
-      <w:r>
-        <w:t xml:space="preserve"> </w:t>
-      </w:r>
-      <w:proofErr w:type="spellStart"/>
-      <w:r>
-        <w:t>opencv</w:t>
-      </w:r>
-      <w:proofErr w:type="spellEnd"/>
-      <w:r>
-        <w:t>-</w:t>
-      </w:r>
-      <w:proofErr w:type="spellStart"/>
-      <w:r>
-        <w:t>contrib</w:t>
-      </w:r>
-      <w:proofErr w:type="spellEnd"/>
-      <w:r>
-        <w:t xml:space="preserve">-python 4.10.0.84 </w:t>
-      </w:r>
-      <w:r>
-        <w:t>等核心运行依赖。其中，</w:t>
-      </w:r>
-      <w:proofErr w:type="spellStart"/>
-      <w:r>
-        <w:t>tflite</w:t>
-      </w:r>
-      <w:proofErr w:type="spellEnd"/>
-      <w:r>
-        <w:t xml:space="preserve">-runtime </w:t>
-      </w:r>
-      <w:r>
-        <w:t>负责执行表情识别模型推理，</w:t>
-      </w:r>
-      <w:r>
-        <w:t xml:space="preserve">OpenCV </w:t>
-      </w:r>
-      <w:r>
-        <w:t>主要承担摄像头读取、</w:t>
-      </w:r>
-      <w:r>
-        <w:t xml:space="preserve">YuNet </w:t>
-      </w:r>
-      <w:r>
-        <w:t>调用、图像预处理和结果显示等任务。</w:t>
-      </w:r>
-    </w:p>
-    <w:p>
-      <w:pPr>
-        <w:pStyle w:val="3"/>
-        <w:rPr>
-          <w:rFonts w:hint="eastAsia"/>
-        </w:rPr>
-      </w:pPr>
-      <w:bookmarkStart w:id="55" w:name="_Toc226811233"/>
-      <w:r>
-        <w:lastRenderedPageBreak/>
-        <w:t>5.2.2 硬件平台配置</w:t>
-      </w:r>
-      <w:bookmarkEnd w:id="55"/>
-    </w:p>
-    <w:p>
-      <w:pPr>
-        <w:ind w:firstLine="480"/>
-      </w:pPr>
-      <w:r>
-        <w:t>在硬件平台方面，</w:t>
-      </w:r>
-      <w:r>
-        <w:t xml:space="preserve">PC </w:t>
-      </w:r>
-      <w:proofErr w:type="gramStart"/>
-      <w:r>
-        <w:t>端用于</w:t>
-      </w:r>
-      <w:proofErr w:type="gramEnd"/>
-      <w:r>
-        <w:t>模型训练与测试，其主要配置为</w:t>
-      </w:r>
-      <w:r>
-        <w:t xml:space="preserve"> Intel Core i7-10870H </w:t>
-      </w:r>
-      <w:r>
-        <w:t>处理器、</w:t>
-      </w:r>
-      <w:r>
-        <w:t xml:space="preserve">32 GB </w:t>
-      </w:r>
-      <w:r>
-        <w:t>内存以及</w:t>
-      </w:r>
-      <w:r>
-        <w:t xml:space="preserve"> NVIDIA GeForce RTX 3060 Laptop GPU</w:t>
-      </w:r>
-      <w:r>
-        <w:t>，操作系统为</w:t>
-      </w:r>
-      <w:r>
-        <w:t xml:space="preserve"> Windows 11</w:t>
-      </w:r>
-      <w:r>
-        <w:t>。该平台主要用于完成前文所述多阶段训练、伪标签更新、模型导出及性能评估等任务。</w:t>
-      </w:r>
-    </w:p>
-    <w:p>
-      <w:pPr>
-        <w:ind w:firstLine="480"/>
-      </w:pPr>
-      <w:r>
-        <w:t>在</w:t>
-      </w:r>
-      <w:proofErr w:type="gramStart"/>
-      <w:r>
-        <w:t>端侧部署</w:t>
-      </w:r>
-      <w:proofErr w:type="gramEnd"/>
-      <w:r>
-        <w:t>平台方面，本文选用</w:t>
-      </w:r>
-      <w:r>
-        <w:t xml:space="preserve"> Raspberry Pi 5 8 GB </w:t>
-      </w:r>
-      <w:r>
-        <w:t>版本作为嵌入式运行载体，并接入</w:t>
-      </w:r>
-      <w:r>
-        <w:t xml:space="preserve"> H052-864-V4 </w:t>
-      </w:r>
-      <w:r>
-        <w:t>摄像头模块完成视频采集。树莓</w:t>
-      </w:r>
-      <w:proofErr w:type="gramStart"/>
-      <w:r>
-        <w:t>派端主要</w:t>
-      </w:r>
-      <w:proofErr w:type="gramEnd"/>
-      <w:r>
-        <w:t>负责视频流接入、</w:t>
-      </w:r>
-      <w:r>
-        <w:t xml:space="preserve">YuNet </w:t>
-      </w:r>
-      <w:r>
-        <w:t>人脸检测、</w:t>
-      </w:r>
-      <w:proofErr w:type="spellStart"/>
-      <w:r>
-        <w:t>TFLite</w:t>
-      </w:r>
-      <w:proofErr w:type="spellEnd"/>
-      <w:r>
-        <w:t xml:space="preserve"> </w:t>
-      </w:r>
-      <w:r>
-        <w:t>模型推理以及识别结果显示等任务。由于树莓</w:t>
-      </w:r>
-      <w:proofErr w:type="gramStart"/>
-      <w:r>
-        <w:t>派计算</w:t>
-      </w:r>
-      <w:proofErr w:type="gramEnd"/>
-      <w:r>
-        <w:t>资源明显弱于</w:t>
-      </w:r>
-      <w:r>
-        <w:t xml:space="preserve"> PC </w:t>
-      </w:r>
-      <w:r>
-        <w:t>平台，因此在部署实现中采用了降低检测分辨率、间隔执行检测、限制最大推理人脸数等优化策略，以在保证识别功能完整的前提下尽可能提高系统实时性。</w:t>
-      </w:r>
-    </w:p>
-    <w:p>
-      <w:pPr>
-        <w:ind w:firstLine="480"/>
-      </w:pPr>
-      <w:r>
-        <w:t>从推理程序参数配置来看，</w:t>
-      </w:r>
-      <w:proofErr w:type="gramStart"/>
-      <w:r>
-        <w:t>树莓派端摄像头</w:t>
-      </w:r>
-      <w:proofErr w:type="gramEnd"/>
-      <w:r>
         <w:t>采集分辨率设置为</w:t>
       </w:r>
       <w:r>
-        <w:t xml:space="preserve"> 640×480</w:t>
+        <w:t>640×480</w:t>
       </w:r>
       <w:r>
         <w:t>，检测输入尺寸为</w:t>
       </w:r>
       <w:r>
-        <w:t xml:space="preserve"> 256×192</w:t>
+        <w:t>256×192</w:t>
       </w:r>
       <w:r>
         <w:t>，最大跟踪人脸数为</w:t>
       </w:r>
       <w:r>
-        <w:t xml:space="preserve"> 4</w:t>
+        <w:t>4</w:t>
       </w:r>
       <w:r>
         <w:t>，默认单次最多对</w:t>
       </w:r>
       <w:r>
-        <w:t xml:space="preserve"> 1 </w:t>
+        <w:t>1</w:t>
       </w:r>
       <w:r>
         <w:t>张人脸执行表情分类。该参数设置体现</w:t>
@@ -21961,13 +21944,13 @@
         <w:t>章所述模型训练与优化后，本文选取验证效果最优的</w:t>
       </w:r>
       <w:r>
-        <w:t xml:space="preserve"> best_model_stage3.pth </w:t>
+        <w:t>best_model_stage3.pth</w:t>
       </w:r>
       <w:r>
         <w:t>作为部署模型，并在</w:t>
       </w:r>
       <w:r>
-        <w:t xml:space="preserve"> PC </w:t>
+        <w:t>PC</w:t>
       </w:r>
       <w:r>
         <w:t>端完成模型导出与格式转换。为适应树莓派平台</w:t>
@@ -21980,593 +21963,512 @@
       <w:r>
         <w:t>需求，本文没有直接在部署端加载</w:t>
       </w:r>
+      <w:proofErr w:type="spellStart"/>
+      <w:r>
+        <w:t>PyTorch</w:t>
+      </w:r>
+      <w:proofErr w:type="spellEnd"/>
+      <w:r>
+        <w:t>权重，而是将训练完成的表情识别模型转换为更适合嵌入式平台调用的</w:t>
+      </w:r>
+      <w:proofErr w:type="spellStart"/>
+      <w:r>
+        <w:t>TFLite</w:t>
+      </w:r>
+      <w:proofErr w:type="spellEnd"/>
+      <w:r>
+        <w:t>格式。</w:t>
+      </w:r>
+    </w:p>
+    <w:p>
+      <w:pPr>
+        <w:ind w:firstLine="480"/>
+      </w:pPr>
+      <w:r>
+        <w:t>具体转换流程如下：首先加载训练完成的</w:t>
+      </w:r>
+      <w:proofErr w:type="spellStart"/>
+      <w:r>
+        <w:t>PyTorch</w:t>
+      </w:r>
+      <w:proofErr w:type="spellEnd"/>
+      <w:r>
+        <w:t>权重文件，并导出为</w:t>
+      </w:r>
+      <w:r>
+        <w:t>ONNX</w:t>
+      </w:r>
+      <w:r>
+        <w:t>模型；随后利用</w:t>
+      </w:r>
+      <w:proofErr w:type="spellStart"/>
+      <w:r>
+        <w:t>onnxsim</w:t>
+      </w:r>
+      <w:proofErr w:type="spellEnd"/>
+      <w:r>
+        <w:t>对导出的</w:t>
+      </w:r>
+      <w:r>
+        <w:t>ONNX</w:t>
+      </w:r>
+      <w:r>
+        <w:t>模型进行简化，减少冗余计算图节点；之后调用</w:t>
+      </w:r>
+      <w:r>
+        <w:t>onnx2t</w:t>
+      </w:r>
+      <w:r>
+        <w:t>将</w:t>
+      </w:r>
+      <w:r>
+        <w:t>ONNX</w:t>
+      </w:r>
+      <w:r>
+        <w:t>模型转换为</w:t>
+      </w:r>
+      <w:r>
+        <w:t xml:space="preserve">TensorFlow </w:t>
+      </w:r>
+      <w:proofErr w:type="spellStart"/>
+      <w:r>
+        <w:t>SavedModel</w:t>
+      </w:r>
+      <w:proofErr w:type="spellEnd"/>
+      <w:r>
+        <w:t>；最后使用</w:t>
+      </w:r>
+      <w:r>
+        <w:t>TensorFlow Lite</w:t>
+      </w:r>
+      <w:r>
+        <w:t>转换器生成可在树莓</w:t>
+      </w:r>
+      <w:proofErr w:type="gramStart"/>
+      <w:r>
+        <w:t>派端运行</w:t>
+      </w:r>
+      <w:proofErr w:type="gramEnd"/>
+      <w:r>
+        <w:t>的</w:t>
+      </w:r>
+      <w:proofErr w:type="spellStart"/>
+      <w:r>
+        <w:t>TFLite</w:t>
+      </w:r>
+      <w:proofErr w:type="spellEnd"/>
+      <w:r>
+        <w:t>模型文件。为保证导出模型的可用性，脚本在转换过程中加入了</w:t>
+      </w:r>
+      <w:r>
+        <w:t>ONNX Runtime</w:t>
+      </w:r>
+      <w:r>
+        <w:t>的快速检查，并支持生成验证报告，以比较</w:t>
+      </w:r>
+      <w:proofErr w:type="spellStart"/>
+      <w:r>
+        <w:t>PyTorch</w:t>
+      </w:r>
+      <w:proofErr w:type="spellEnd"/>
+      <w:r>
+        <w:t>、</w:t>
+      </w:r>
+      <w:r>
+        <w:t>ONNX</w:t>
+      </w:r>
+      <w:r>
+        <w:t>和</w:t>
+      </w:r>
+      <w:proofErr w:type="spellStart"/>
+      <w:r>
+        <w:t>TFLite</w:t>
+      </w:r>
+      <w:proofErr w:type="spellEnd"/>
+      <w:r>
+        <w:t>三种格式下的输出一致性。这样既完成了格式迁移，也保证了部署前模型推理结果的可靠性。</w:t>
+      </w:r>
+    </w:p>
+    <w:p>
+      <w:pPr>
+        <w:ind w:firstLine="480"/>
+      </w:pPr>
+      <w:r>
+        <w:t>从部署效果上看，采用</w:t>
+      </w:r>
+      <w:r>
+        <w:t>fp16</w:t>
+      </w:r>
+      <w:r>
+        <w:t>量化后的</w:t>
+      </w:r>
+      <w:proofErr w:type="spellStart"/>
+      <w:r>
+        <w:t>TFLite</w:t>
+      </w:r>
+      <w:proofErr w:type="spellEnd"/>
+      <w:r>
+        <w:t>模型能够在保持较好精度的同时有效减轻树莓派端的推理负担，是当前系统实现中精度与效率之间较为合适的折中方案。这也说</w:t>
+      </w:r>
+      <w:proofErr w:type="gramStart"/>
+      <w:r>
+        <w:t>明前文选择</w:t>
+      </w:r>
+      <w:proofErr w:type="gramEnd"/>
+      <w:r>
+        <w:t>MobileNetV3</w:t>
+      </w:r>
+      <w:r>
+        <w:t>作为轻量化骨干网络、并在部署</w:t>
+      </w:r>
+      <w:proofErr w:type="gramStart"/>
+      <w:r>
+        <w:t>端采用</w:t>
+      </w:r>
+      <w:proofErr w:type="spellStart"/>
+      <w:proofErr w:type="gramEnd"/>
+      <w:r>
+        <w:t>TFLite</w:t>
+      </w:r>
+      <w:proofErr w:type="spellEnd"/>
+      <w:r>
+        <w:t>推理的总体设计思路是合理可行的。</w:t>
+      </w:r>
+    </w:p>
+    <w:p>
+      <w:pPr>
+        <w:pStyle w:val="3"/>
+        <w:rPr>
+          <w:rFonts w:hint="eastAsia"/>
+        </w:rPr>
+      </w:pPr>
+      <w:bookmarkStart w:id="58" w:name="_Toc226811236"/>
+      <w:r>
+        <w:lastRenderedPageBreak/>
+        <w:t xml:space="preserve">5.3.2 </w:t>
+      </w:r>
+      <w:proofErr w:type="gramStart"/>
+      <w:r>
+        <w:t>树莓派端推理</w:t>
+      </w:r>
+      <w:proofErr w:type="gramEnd"/>
+      <w:r>
+        <w:t>程序设计</w:t>
+      </w:r>
+      <w:bookmarkEnd w:id="58"/>
+    </w:p>
+    <w:p>
+      <w:pPr>
+        <w:ind w:firstLine="480"/>
+      </w:pPr>
+      <w:proofErr w:type="gramStart"/>
+      <w:r>
+        <w:t>树莓派端推理</w:t>
+      </w:r>
+      <w:proofErr w:type="gramEnd"/>
+      <w:r>
+        <w:t>程序围绕</w:t>
+      </w:r>
+      <w:r>
+        <w:t>“</w:t>
+      </w:r>
+      <w:r>
+        <w:t>采集</w:t>
+      </w:r>
+      <w:r>
+        <w:t>—</w:t>
+      </w:r>
+      <w:r>
+        <w:t>检测</w:t>
+      </w:r>
+      <w:r>
+        <w:t>—</w:t>
+      </w:r>
+      <w:r>
+        <w:t>裁剪</w:t>
+      </w:r>
+      <w:r>
+        <w:t>—</w:t>
+      </w:r>
+      <w:r>
+        <w:t>分类</w:t>
+      </w:r>
+      <w:r>
+        <w:t>—</w:t>
+      </w:r>
+      <w:r>
+        <w:t>显示</w:t>
+      </w:r>
+      <w:r>
+        <w:t>”</w:t>
+      </w:r>
+      <w:r>
+        <w:t>这一主线进行组织。程序启动后，首先初始化摄像头读取模块、人脸检测模块、</w:t>
+      </w:r>
+      <w:proofErr w:type="spellStart"/>
+      <w:r>
+        <w:t>TFLite</w:t>
+      </w:r>
+      <w:proofErr w:type="spellEnd"/>
+      <w:r>
+        <w:t>表情识别模块以及轻量跟踪模块；</w:t>
+      </w:r>
+      <w:proofErr w:type="gramStart"/>
+      <w:r>
+        <w:t>待成功</w:t>
+      </w:r>
+      <w:proofErr w:type="gramEnd"/>
+      <w:r>
+        <w:t>接收到第一帧图像后，进入循环推理状态。摄像头输入分辨率设为</w:t>
+      </w:r>
+      <w:r>
+        <w:t>640×480</w:t>
+      </w:r>
+      <w:r>
+        <w:t>，并通过独立线程持续读取图像，以减少主线程阻塞对实时性的影响。</w:t>
+      </w:r>
+    </w:p>
+    <w:p>
+      <w:pPr>
+        <w:ind w:firstLine="480"/>
+      </w:pPr>
+      <w:r>
+        <w:t>在人脸检测阶段，程序采用</w:t>
+      </w:r>
+      <w:r>
+        <w:t>YuNet</w:t>
+      </w:r>
+      <w:r>
+        <w:t>模型对视频</w:t>
+      </w:r>
+      <w:proofErr w:type="gramStart"/>
+      <w:r>
+        <w:t>帧</w:t>
+      </w:r>
+      <w:proofErr w:type="gramEnd"/>
+      <w:r>
+        <w:t>进行实时检测，并提取五个关键点位置。考虑到树莓派</w:t>
+      </w:r>
+      <w:proofErr w:type="gramStart"/>
+      <w:r>
+        <w:t>平台算力有限</w:t>
+      </w:r>
+      <w:proofErr w:type="gramEnd"/>
+      <w:r>
+        <w:t>，推理脚本没有对每一帧都执行完整检测，而是将检测输入尺寸降为</w:t>
+      </w:r>
+      <w:r>
+        <w:t>256×192</w:t>
+      </w:r>
+      <w:r>
+        <w:t>，并设置</w:t>
+      </w:r>
+      <w:proofErr w:type="spellStart"/>
+      <w:r>
+        <w:t>detect_every</w:t>
+      </w:r>
+      <w:proofErr w:type="spellEnd"/>
+      <w:r>
+        <w:t>=3</w:t>
+      </w:r>
+      <w:r>
+        <w:t>，即每</w:t>
+      </w:r>
+      <w:r>
+        <w:t>3</w:t>
+      </w:r>
+      <w:r>
+        <w:t>帧执行一次人脸检测，其余</w:t>
+      </w:r>
+      <w:proofErr w:type="gramStart"/>
+      <w:r>
+        <w:t>帧</w:t>
+      </w:r>
+      <w:proofErr w:type="gramEnd"/>
+      <w:r>
+        <w:t>通过关键</w:t>
+      </w:r>
+      <w:proofErr w:type="gramStart"/>
+      <w:r>
+        <w:t>点中心</w:t>
+      </w:r>
+      <w:proofErr w:type="gramEnd"/>
+      <w:r>
+        <w:t>距离实现的轻量跟踪方式维持目标状态。这种处理方式减少了重复检测开销，在不显著影响检测连续性的前提下提高了系统运行效率。</w:t>
+      </w:r>
+    </w:p>
+    <w:p>
+      <w:pPr>
+        <w:ind w:firstLine="480"/>
+      </w:pPr>
+      <w:r>
+        <w:t>在人脸分类阶段，程序根据检测框从原始图像中裁剪人脸区域，并按</w:t>
+      </w:r>
+      <w:proofErr w:type="spellStart"/>
+      <w:r>
+        <w:t>pad_ratio</w:t>
+      </w:r>
+      <w:proofErr w:type="spellEnd"/>
+      <w:r>
+        <w:t>=0.18</w:t>
+      </w:r>
+      <w:r>
+        <w:t>对边界进行扩展，使输入区域包含更完整的面部信息。裁剪后的人脸图像被缩放到</w:t>
+      </w:r>
+      <w:r>
+        <w:t>224×224</w:t>
+      </w:r>
+      <w:r>
+        <w:t>，并进行</w:t>
+      </w:r>
+      <w:r>
+        <w:t>RGB</w:t>
+      </w:r>
+      <w:r>
+        <w:t>转换、归一化和维度重排，然后输入</w:t>
+      </w:r>
+      <w:proofErr w:type="spellStart"/>
+      <w:r>
+        <w:t>TFLite</w:t>
+      </w:r>
+      <w:proofErr w:type="spellEnd"/>
+      <w:r>
+        <w:t>解释器完成推理。脚本中分类</w:t>
+      </w:r>
+      <w:proofErr w:type="gramStart"/>
+      <w:r>
+        <w:t>线程数设置</w:t>
+      </w:r>
+      <w:proofErr w:type="gramEnd"/>
+      <w:r>
+        <w:t>为</w:t>
+      </w:r>
+      <w:r>
+        <w:t>4</w:t>
+      </w:r>
+      <w:r>
+        <w:t>，置信度阈值设为</w:t>
+      </w:r>
+      <w:r>
+        <w:t>0.45</w:t>
+      </w:r>
+      <w:r>
+        <w:t>；同时，为进一步</w:t>
+      </w:r>
+      <w:proofErr w:type="gramStart"/>
+      <w:r>
+        <w:t>控制端侧负载</w:t>
+      </w:r>
+      <w:proofErr w:type="gramEnd"/>
+      <w:r>
+        <w:t>，程序将最大跟踪人脸数限制为</w:t>
+      </w:r>
+      <w:r>
+        <w:t>4</w:t>
+      </w:r>
+      <w:r>
+        <w:t>，并设置</w:t>
+      </w:r>
       <w:r>
         <w:t xml:space="preserve"> </w:t>
       </w:r>
       <w:proofErr w:type="spellStart"/>
       <w:r>
-        <w:t>PyTorch</w:t>
+        <w:t>max_infer_faces</w:t>
       </w:r>
       <w:proofErr w:type="spellEnd"/>
       <w:r>
-        <w:t xml:space="preserve"> </w:t>
-      </w:r>
-      <w:r>
-        <w:t>权重，而是将训练完成的表情识别模型转换为更适合嵌入式平台调用的</w:t>
-      </w:r>
-      <w:r>
-        <w:t xml:space="preserve"> </w:t>
+        <w:t>=1</w:t>
+      </w:r>
+      <w:r>
+        <w:t>，即默认单次只对</w:t>
+      </w:r>
+      <w:r>
+        <w:t>1</w:t>
+      </w:r>
+      <w:r>
+        <w:t>张人脸进行表情分类。这种设计体现了部署阶段</w:t>
+      </w:r>
+      <w:r>
+        <w:t>“</w:t>
+      </w:r>
+      <w:r>
+        <w:t>以实时响应为优先</w:t>
+      </w:r>
+      <w:r>
+        <w:t>”</w:t>
+      </w:r>
+      <w:r>
+        <w:t>的工程思路。</w:t>
+      </w:r>
+    </w:p>
+    <w:p>
+      <w:pPr>
+        <w:pStyle w:val="3"/>
+        <w:rPr>
+          <w:rFonts w:hint="eastAsia"/>
+        </w:rPr>
+      </w:pPr>
+      <w:bookmarkStart w:id="59" w:name="_Toc226811237"/>
+      <w:r>
+        <w:t>5.3.3 结果显示与图像保存</w:t>
+      </w:r>
+      <w:bookmarkEnd w:id="59"/>
+    </w:p>
+    <w:p>
+      <w:pPr>
+        <w:ind w:firstLine="480"/>
+      </w:pPr>
+      <w:r>
+        <w:t>在结果显示方面，系统将检测框、</w:t>
+      </w:r>
+      <w:proofErr w:type="gramStart"/>
+      <w:r>
+        <w:t>五关键</w:t>
+      </w:r>
+      <w:proofErr w:type="gramEnd"/>
+      <w:r>
+        <w:t>点、表情类别、预测置信度以及</w:t>
+      </w:r>
+      <w:r>
+        <w:t>FPS</w:t>
+      </w:r>
+      <w:r>
+        <w:t>、延迟、检测耗时和分类耗时等信息实时叠加到当前视频画面中。该设计一方面便于直接观察当前识别结果，另一方面也方便在测试阶段同步记录系统运行状态。结合实际运行情况可以看出，系统已经能够在树莓派平台上完成单人场景下的实时检测与表情识别，并具有较好的界面可读性。</w:t>
+      </w:r>
+    </w:p>
+    <w:p>
+      <w:pPr>
+        <w:ind w:firstLine="480"/>
+      </w:pPr>
+      <w:r>
+        <w:t>除实时显示外，程序还设计了按类别保存</w:t>
+      </w:r>
+      <w:r>
+        <w:t>“</w:t>
+      </w:r>
+      <w:r>
+        <w:t>最佳识别结果图</w:t>
+      </w:r>
+      <w:r>
+        <w:t>”</w:t>
+      </w:r>
+      <w:r>
+        <w:t>的功能。脚本中设置保存目录为</w:t>
       </w:r>
       <w:proofErr w:type="spellStart"/>
       <w:r>
-        <w:t>TFLite</w:t>
+        <w:t>best_by_class</w:t>
       </w:r>
       <w:proofErr w:type="spellEnd"/>
       <w:r>
-        <w:t xml:space="preserve"> </w:t>
-      </w:r>
-      <w:r>
-        <w:t>格式。</w:t>
-      </w:r>
-    </w:p>
-    <w:p>
-      <w:pPr>
-        <w:ind w:firstLine="480"/>
-      </w:pPr>
-      <w:r>
-        <w:t>具体转换流程如下：首先加载训练完成的</w:t>
-      </w:r>
-      <w:r>
-        <w:t xml:space="preserve"> </w:t>
-      </w:r>
-      <w:proofErr w:type="spellStart"/>
-      <w:r>
-        <w:t>PyTorch</w:t>
-      </w:r>
-      <w:proofErr w:type="spellEnd"/>
-      <w:r>
-        <w:t xml:space="preserve"> </w:t>
-      </w:r>
-      <w:r>
-        <w:t>权重文件，并导出为</w:t>
-      </w:r>
-      <w:r>
-        <w:t xml:space="preserve"> ONNX </w:t>
-      </w:r>
-      <w:r>
-        <w:t>模型；随后利用</w:t>
-      </w:r>
-      <w:r>
-        <w:t xml:space="preserve"> </w:t>
-      </w:r>
-      <w:proofErr w:type="spellStart"/>
-      <w:r>
-        <w:t>onnxsim</w:t>
-      </w:r>
-      <w:proofErr w:type="spellEnd"/>
-      <w:r>
-        <w:t xml:space="preserve"> </w:t>
-      </w:r>
-      <w:r>
-        <w:t>对导出的</w:t>
-      </w:r>
-      <w:r>
-        <w:t xml:space="preserve"> ONNX </w:t>
-      </w:r>
-      <w:r>
-        <w:t>模型进行简化，减少冗余计算图节点；之后调用</w:t>
-      </w:r>
-      <w:r>
-        <w:t xml:space="preserve"> onnx2tf </w:t>
-      </w:r>
-      <w:r>
-        <w:t>将</w:t>
-      </w:r>
-      <w:r>
-        <w:t xml:space="preserve"> ONNX </w:t>
-      </w:r>
-      <w:r>
-        <w:t>模型转换为</w:t>
-      </w:r>
-      <w:r>
-        <w:t xml:space="preserve"> TensorFlow </w:t>
-      </w:r>
-      <w:proofErr w:type="spellStart"/>
-      <w:r>
-        <w:t>SavedModel</w:t>
-      </w:r>
-      <w:proofErr w:type="spellEnd"/>
-      <w:r>
-        <w:t>；最后使用</w:t>
-      </w:r>
-      <w:r>
-        <w:t xml:space="preserve"> TensorFlow Lite </w:t>
-      </w:r>
-      <w:r>
-        <w:t>转换器生成可在树莓</w:t>
-      </w:r>
-      <w:proofErr w:type="gramStart"/>
-      <w:r>
-        <w:t>派端运行</w:t>
-      </w:r>
-      <w:proofErr w:type="gramEnd"/>
-      <w:r>
-        <w:t>的</w:t>
-      </w:r>
-      <w:r>
-        <w:t xml:space="preserve"> </w:t>
-      </w:r>
-      <w:proofErr w:type="spellStart"/>
-      <w:r>
-        <w:t>TFLite</w:t>
-      </w:r>
-      <w:proofErr w:type="spellEnd"/>
-      <w:r>
-        <w:t xml:space="preserve"> </w:t>
-      </w:r>
-      <w:r>
-        <w:t>模型文件。为保证导出模型的可用性，脚本在转换过程中加入了</w:t>
-      </w:r>
-      <w:r>
-        <w:t xml:space="preserve"> ONNX Runtime </w:t>
-      </w:r>
-      <w:r>
-        <w:t>的快速检查，并支持生成验证报告，以比较</w:t>
-      </w:r>
-      <w:r>
-        <w:t xml:space="preserve"> </w:t>
-      </w:r>
-      <w:proofErr w:type="spellStart"/>
-      <w:r>
-        <w:t>PyTorch</w:t>
-      </w:r>
-      <w:proofErr w:type="spellEnd"/>
-      <w:r>
-        <w:t>、</w:t>
-      </w:r>
-      <w:r>
-        <w:t xml:space="preserve">ONNX </w:t>
-      </w:r>
-      <w:r>
-        <w:t>和</w:t>
-      </w:r>
-      <w:r>
-        <w:t xml:space="preserve"> </w:t>
-      </w:r>
-      <w:proofErr w:type="spellStart"/>
-      <w:r>
-        <w:t>TFLite</w:t>
-      </w:r>
-      <w:proofErr w:type="spellEnd"/>
-      <w:r>
-        <w:t xml:space="preserve"> </w:t>
-      </w:r>
-      <w:r>
-        <w:t>三种格式下的输出一致性。这样既完成了格式迁移，也保证了部署前模型推理结果的可靠性。</w:t>
-      </w:r>
-    </w:p>
-    <w:p>
-      <w:pPr>
-        <w:ind w:firstLine="480"/>
-      </w:pPr>
-      <w:r>
-        <w:t>从部署效果上看，采用</w:t>
-      </w:r>
-      <w:r>
-        <w:t xml:space="preserve"> fp16 </w:t>
-      </w:r>
-      <w:r>
-        <w:t>量化后的</w:t>
-      </w:r>
-      <w:r>
-        <w:t xml:space="preserve"> </w:t>
-      </w:r>
-      <w:proofErr w:type="spellStart"/>
-      <w:r>
-        <w:t>TFLite</w:t>
-      </w:r>
-      <w:proofErr w:type="spellEnd"/>
-      <w:r>
-        <w:t xml:space="preserve"> </w:t>
-      </w:r>
-      <w:r>
-        <w:t>模型能够在保持较好精度的同时有效减轻树莓派端的推理负担，是当前系统实现中精度与效率之间较为合适</w:t>
-      </w:r>
-      <w:r>
-        <w:lastRenderedPageBreak/>
-        <w:t>的折中方案。这也说</w:t>
-      </w:r>
-      <w:proofErr w:type="gramStart"/>
-      <w:r>
-        <w:t>明前文选择</w:t>
-      </w:r>
-      <w:proofErr w:type="gramEnd"/>
-      <w:r>
-        <w:t xml:space="preserve"> MobileNetV3 </w:t>
-      </w:r>
-      <w:r>
-        <w:t>作为轻量化骨干网络、并在部署</w:t>
-      </w:r>
-      <w:proofErr w:type="gramStart"/>
-      <w:r>
-        <w:t>端采用</w:t>
-      </w:r>
-      <w:proofErr w:type="gramEnd"/>
-      <w:r>
-        <w:t xml:space="preserve"> </w:t>
-      </w:r>
-      <w:proofErr w:type="spellStart"/>
-      <w:r>
-        <w:t>TFLite</w:t>
-      </w:r>
-      <w:proofErr w:type="spellEnd"/>
-      <w:r>
-        <w:t xml:space="preserve"> </w:t>
-      </w:r>
-      <w:r>
-        <w:t>推理的总体设计思路是合理可行的。</w:t>
-      </w:r>
-    </w:p>
-    <w:p>
-      <w:pPr>
-        <w:pStyle w:val="3"/>
-        <w:rPr>
-          <w:rFonts w:hint="eastAsia"/>
-        </w:rPr>
-      </w:pPr>
-      <w:bookmarkStart w:id="58" w:name="_Toc226811236"/>
-      <w:r>
-        <w:t xml:space="preserve">5.3.2 </w:t>
-      </w:r>
-      <w:proofErr w:type="gramStart"/>
-      <w:r>
-        <w:t>树莓派端推理</w:t>
-      </w:r>
-      <w:proofErr w:type="gramEnd"/>
-      <w:r>
-        <w:t>程序设计</w:t>
-      </w:r>
-      <w:bookmarkEnd w:id="58"/>
-    </w:p>
-    <w:p>
-      <w:pPr>
-        <w:ind w:firstLine="480"/>
-      </w:pPr>
-      <w:proofErr w:type="gramStart"/>
-      <w:r>
-        <w:t>树莓派端推理</w:t>
-      </w:r>
-      <w:proofErr w:type="gramEnd"/>
-      <w:r>
-        <w:t>程序围绕</w:t>
-      </w:r>
-      <w:r>
-        <w:t>“</w:t>
-      </w:r>
-      <w:r>
-        <w:t>采集</w:t>
-      </w:r>
-      <w:r>
-        <w:t>—</w:t>
-      </w:r>
-      <w:r>
-        <w:t>检测</w:t>
-      </w:r>
-      <w:r>
-        <w:t>—</w:t>
-      </w:r>
-      <w:r>
-        <w:t>裁剪</w:t>
-      </w:r>
-      <w:r>
-        <w:t>—</w:t>
-      </w:r>
-      <w:r>
-        <w:t>分类</w:t>
-      </w:r>
-      <w:r>
-        <w:t>—</w:t>
-      </w:r>
-      <w:r>
-        <w:t>显示</w:t>
-      </w:r>
-      <w:r>
-        <w:t>”</w:t>
-      </w:r>
-      <w:r>
-        <w:t>这一主线进行组织。程序启动后，首先初始化摄像头读取模块、人脸检测模块、</w:t>
-      </w:r>
-      <w:proofErr w:type="spellStart"/>
-      <w:r>
-        <w:t>TFLite</w:t>
-      </w:r>
-      <w:proofErr w:type="spellEnd"/>
-      <w:r>
-        <w:t xml:space="preserve"> </w:t>
-      </w:r>
-      <w:r>
-        <w:t>表情识别模块以及轻量跟踪模块；</w:t>
-      </w:r>
-      <w:proofErr w:type="gramStart"/>
-      <w:r>
-        <w:t>待成功</w:t>
-      </w:r>
-      <w:proofErr w:type="gramEnd"/>
-      <w:r>
-        <w:t>接收到第一帧图像后，进入循环推理状态。摄像头输入分辨率设为</w:t>
-      </w:r>
-      <w:r>
-        <w:t xml:space="preserve"> 640×480</w:t>
-      </w:r>
-      <w:r>
-        <w:t>，并通过独立线程持续读取图像，以减少主线程阻塞对实时性的影响。</w:t>
-      </w:r>
-    </w:p>
-    <w:p>
-      <w:pPr>
-        <w:ind w:firstLine="480"/>
-      </w:pPr>
-      <w:r>
-        <w:t>在人脸检测阶段，程序采用</w:t>
-      </w:r>
-      <w:r>
-        <w:t xml:space="preserve"> YuNet </w:t>
-      </w:r>
-      <w:r>
-        <w:t>模型对视频</w:t>
-      </w:r>
-      <w:proofErr w:type="gramStart"/>
-      <w:r>
-        <w:t>帧</w:t>
-      </w:r>
-      <w:proofErr w:type="gramEnd"/>
-      <w:r>
-        <w:t>进行实时检测，并提取五个关键点位置。考虑到树莓派</w:t>
-      </w:r>
-      <w:proofErr w:type="gramStart"/>
-      <w:r>
-        <w:t>平台算力有限</w:t>
-      </w:r>
-      <w:proofErr w:type="gramEnd"/>
-      <w:r>
-        <w:t>，推理脚本没有对每一帧都执行完整检测，而是将检测输入尺寸降为</w:t>
-      </w:r>
-      <w:r>
-        <w:t xml:space="preserve"> 256×192</w:t>
-      </w:r>
-      <w:r>
-        <w:t>，并设置</w:t>
-      </w:r>
-      <w:r>
-        <w:t xml:space="preserve"> </w:t>
-      </w:r>
-      <w:proofErr w:type="spellStart"/>
-      <w:r>
-        <w:t>detect_every</w:t>
-      </w:r>
-      <w:proofErr w:type="spellEnd"/>
-      <w:r>
-        <w:t>=3</w:t>
-      </w:r>
-      <w:r>
-        <w:t>，即每</w:t>
-      </w:r>
-      <w:r>
-        <w:t xml:space="preserve"> 3 </w:t>
-      </w:r>
-      <w:proofErr w:type="gramStart"/>
-      <w:r>
-        <w:t>帧执行</w:t>
-      </w:r>
-      <w:proofErr w:type="gramEnd"/>
-      <w:r>
-        <w:t>一次人脸检测，其余</w:t>
-      </w:r>
-      <w:proofErr w:type="gramStart"/>
-      <w:r>
-        <w:t>帧</w:t>
-      </w:r>
-      <w:proofErr w:type="gramEnd"/>
-      <w:r>
-        <w:t>通过关键</w:t>
-      </w:r>
-      <w:proofErr w:type="gramStart"/>
-      <w:r>
-        <w:t>点中心</w:t>
-      </w:r>
-      <w:proofErr w:type="gramEnd"/>
-      <w:r>
-        <w:t>距离实现的轻量跟踪方式维持目标状态。这种处理方式减少了重复检测开销，在不显著影响检测连续性的前提下提高了系统运行效率。</w:t>
-      </w:r>
-    </w:p>
-    <w:p>
-      <w:pPr>
-        <w:ind w:firstLine="480"/>
-      </w:pPr>
-      <w:r>
-        <w:t>在人脸分类阶段，程序根据检测框从原始图像中裁剪人脸区域，并按</w:t>
-      </w:r>
-      <w:r>
-        <w:t xml:space="preserve"> </w:t>
-      </w:r>
-      <w:proofErr w:type="spellStart"/>
-      <w:r>
-        <w:t>pad_ratio</w:t>
-      </w:r>
-      <w:proofErr w:type="spellEnd"/>
-      <w:r>
-        <w:t xml:space="preserve">=0.18 </w:t>
-      </w:r>
-      <w:r>
-        <w:t>对边界进行扩展，使输入区域包含更完整的面部信息。裁剪后的人脸图像被缩放到</w:t>
-      </w:r>
-      <w:r>
-        <w:t xml:space="preserve"> 224×224</w:t>
-      </w:r>
-      <w:r>
-        <w:t>，并进行</w:t>
-      </w:r>
-      <w:r>
-        <w:t xml:space="preserve"> RGB </w:t>
-      </w:r>
-      <w:r>
-        <w:t>转换、归一化和维度重排，然后输入</w:t>
-      </w:r>
-      <w:r>
-        <w:t xml:space="preserve"> </w:t>
-      </w:r>
-      <w:proofErr w:type="spellStart"/>
-      <w:r>
-        <w:t>TFLite</w:t>
-      </w:r>
-      <w:proofErr w:type="spellEnd"/>
-      <w:r>
-        <w:t xml:space="preserve"> </w:t>
-      </w:r>
-      <w:r>
-        <w:t>解释器完成推理。脚本中分类</w:t>
-      </w:r>
-      <w:proofErr w:type="gramStart"/>
-      <w:r>
-        <w:t>线程数设置</w:t>
-      </w:r>
-      <w:proofErr w:type="gramEnd"/>
-      <w:r>
-        <w:t>为</w:t>
-      </w:r>
-      <w:r>
-        <w:t xml:space="preserve"> 4</w:t>
-      </w:r>
-      <w:r>
-        <w:t>，置信度阈值设为</w:t>
-      </w:r>
-      <w:r>
-        <w:t xml:space="preserve"> 0.45</w:t>
-      </w:r>
-      <w:r>
-        <w:t>；同时，为进一步</w:t>
-      </w:r>
-      <w:proofErr w:type="gramStart"/>
-      <w:r>
-        <w:t>控制端侧负载</w:t>
-      </w:r>
-      <w:proofErr w:type="gramEnd"/>
-      <w:r>
-        <w:t>，程序将最大跟踪人脸数限制为</w:t>
-      </w:r>
-      <w:r>
-        <w:t xml:space="preserve"> 4</w:t>
-      </w:r>
-      <w:r>
-        <w:t>，并设置</w:t>
-      </w:r>
-      <w:r>
-        <w:t xml:space="preserve"> </w:t>
-      </w:r>
-      <w:proofErr w:type="spellStart"/>
-      <w:r>
-        <w:t>max_infer_faces</w:t>
-      </w:r>
-      <w:proofErr w:type="spellEnd"/>
-      <w:r>
-        <w:t>=1</w:t>
-      </w:r>
-      <w:r>
-        <w:t>，即默认单次只对</w:t>
-      </w:r>
-      <w:r>
-        <w:t xml:space="preserve"> 1 </w:t>
-      </w:r>
-      <w:r>
-        <w:t>张人脸进行表情分类。这种设计体现了部署阶段</w:t>
-      </w:r>
-      <w:r>
-        <w:t>“</w:t>
-      </w:r>
-      <w:r>
-        <w:t>以实时响应为优先</w:t>
-      </w:r>
-      <w:r>
-        <w:t>”</w:t>
-      </w:r>
-      <w:r>
-        <w:t>的工程思路。</w:t>
-      </w:r>
-    </w:p>
-    <w:p>
-      <w:pPr>
-        <w:pStyle w:val="3"/>
-        <w:rPr>
-          <w:rFonts w:hint="eastAsia"/>
-        </w:rPr>
-      </w:pPr>
-      <w:bookmarkStart w:id="59" w:name="_Toc226811237"/>
-      <w:r>
-        <w:t>5.3.3 结果显示与图像保存</w:t>
-      </w:r>
-      <w:bookmarkEnd w:id="59"/>
-    </w:p>
-    <w:p>
-      <w:pPr>
-        <w:ind w:firstLine="480"/>
-      </w:pPr>
-      <w:r>
-        <w:t>在结果显示方面，系统将检测框、</w:t>
-      </w:r>
-      <w:proofErr w:type="gramStart"/>
-      <w:r>
-        <w:t>五关键</w:t>
-      </w:r>
-      <w:proofErr w:type="gramEnd"/>
-      <w:r>
-        <w:t>点、表情类别、预测置信度以及</w:t>
-      </w:r>
-      <w:r>
-        <w:t xml:space="preserve"> FPS</w:t>
-      </w:r>
-      <w:r>
-        <w:t>、延迟、检测耗时和分类耗时等信息实时叠加到当前视频画面中。该设计一方面便于直接观察当前识别结果，另一方面也方便在测试阶段同步记录系统运行状态。结合实际运行情况可以看出，系统已经能够在树莓派平台上完成单人场景下的实时检测与表情识别，并具有较好的界面可读性。</w:t>
-      </w:r>
-    </w:p>
-    <w:p>
-      <w:pPr>
-        <w:ind w:firstLine="480"/>
-      </w:pPr>
-      <w:r>
-        <w:t>除实时显示外，程序还设计了按类别保存</w:t>
-      </w:r>
-      <w:r>
-        <w:t>“</w:t>
-      </w:r>
-      <w:r>
-        <w:t>最佳识别结果图</w:t>
-      </w:r>
-      <w:r>
-        <w:t>”</w:t>
-      </w:r>
-      <w:r>
-        <w:t>的功能。脚本中设置保存目录为</w:t>
-      </w:r>
-      <w:r>
-        <w:t xml:space="preserve"> </w:t>
-      </w:r>
-      <w:proofErr w:type="spellStart"/>
-      <w:r>
-        <w:t>best_by_class</w:t>
-      </w:r>
-      <w:proofErr w:type="spellEnd"/>
-      <w:r>
         <w:t>，并为每个类别分别记录当前最优结果。只有当识别置信度高于</w:t>
       </w:r>
       <w:r>
-        <w:t xml:space="preserve"> 0.55 </w:t>
-      </w:r>
-      <w:r>
-        <w:t>且图像清晰度达到设定阈值时，程序才触发保存操作；若新的结果在置信度或清晰度上优于历史结果，则会异步写入更新后的图像文件。该</w:t>
-      </w:r>
-      <w:r>
-        <w:lastRenderedPageBreak/>
-        <w:t>机制在不显著影响主循环实时性的前提下，为系统自动保留具有代表性的表情识别样本，便于后续展示与误差分析。</w:t>
+        <w:t>0.55</w:t>
+      </w:r>
+      <w:r>
+        <w:t>且图像清晰度达到设定阈值时，程序才触发保存操作；若新的结果在置信度或清晰度上优于历史结果，则会异步写入更新后的图像文件。该机制在不显著影响主循环实时性的前提下，为系统自动保留具有代表性的表情识别样本，便于后续展示与误差分析。</w:t>
       </w:r>
     </w:p>
     <w:p>
@@ -22579,6 +22481,7 @@
       </w:pPr>
       <w:bookmarkStart w:id="60" w:name="_Toc226811238"/>
       <w:r>
+        <w:lastRenderedPageBreak/>
         <w:t>5.4 系统运行测试</w:t>
       </w:r>
       <w:bookmarkEnd w:id="60"/>
@@ -22783,59 +22686,219 @@
       </w:pPr>
       <w:bookmarkStart w:id="62" w:name="_Toc226811240"/>
       <w:r>
+        <w:t>5.4.2 实时性测试</w:t>
+      </w:r>
+      <w:bookmarkEnd w:id="62"/>
+    </w:p>
+    <w:p>
+      <w:pPr>
+        <w:ind w:firstLine="480"/>
+      </w:pPr>
+      <w:r>
+        <w:t>实时性是本系统部署验证中的核心指标之一。根据程序设计思路，系统通过降低检测分辨率、间隔执行检测、限制单次参与分类的人脸数等方式</w:t>
+      </w:r>
+      <w:proofErr w:type="gramStart"/>
+      <w:r>
+        <w:t>控制端侧推理</w:t>
+      </w:r>
+      <w:proofErr w:type="gramEnd"/>
+      <w:r>
+        <w:t>负载，从而在有限</w:t>
+      </w:r>
+      <w:proofErr w:type="gramStart"/>
+      <w:r>
+        <w:t>算力条件</w:t>
+      </w:r>
+      <w:proofErr w:type="gramEnd"/>
+      <w:r>
+        <w:t>下保持较高响应速度。结合实际测试结果，系统在</w:t>
+      </w:r>
+      <w:r>
         <w:lastRenderedPageBreak/>
-        <w:t>5.4.2 实时性测试</w:t>
-      </w:r>
-      <w:bookmarkEnd w:id="62"/>
+        <w:t>树莓派平台上的整体</w:t>
+      </w:r>
+      <w:proofErr w:type="gramStart"/>
+      <w:r>
+        <w:t>运行帧率约</w:t>
+      </w:r>
+      <w:proofErr w:type="gramEnd"/>
+      <w:r>
+        <w:t>为</w:t>
+      </w:r>
+      <w:r>
+        <w:t>40</w:t>
+      </w:r>
+      <w:r>
+        <w:t>～</w:t>
+      </w:r>
+      <w:r>
+        <w:t>60 FPS</w:t>
+      </w:r>
+      <w:r>
+        <w:t>，能够满足单人室内场景下的实时交互需求。该结果也说明，当前系统的实时表现优于程序中最初设定的</w:t>
+      </w:r>
+      <w:r>
+        <w:t>30 FPS</w:t>
+      </w:r>
+      <w:r>
+        <w:t>目标值，具备较好的运行余量。</w:t>
+      </w:r>
     </w:p>
     <w:p>
       <w:pPr>
         <w:ind w:firstLine="480"/>
       </w:pPr>
       <w:r>
-        <w:t>实时性是本系统部署验证中的核心指标之一。根据程序设计思路，系统通过降低检测分辨率、间隔执行检测、限制单次参与分类的人脸数等方式</w:t>
+        <w:t>从细分耗时来看，在当前测试条件下，人脸检测阶段</w:t>
+      </w:r>
+      <w:r>
+        <w:t>det</w:t>
+      </w:r>
+      <w:r>
+        <w:t>的单次耗时通常控制在</w:t>
+      </w:r>
+      <w:r>
+        <w:t xml:space="preserve">10 </w:t>
+      </w:r>
+      <w:proofErr w:type="spellStart"/>
+      <w:r>
+        <w:t>ms</w:t>
+      </w:r>
+      <w:proofErr w:type="spellEnd"/>
+      <w:r>
+        <w:t>以内；表情分类阶段</w:t>
+      </w:r>
+      <w:proofErr w:type="spellStart"/>
+      <w:r>
+        <w:t>cls</w:t>
+      </w:r>
+      <w:proofErr w:type="spellEnd"/>
+      <w:r>
+        <w:t>的耗时存在一定波动，约为</w:t>
+      </w:r>
+      <w:r>
+        <w:t>20</w:t>
+      </w:r>
+      <w:r>
+        <w:t>～</w:t>
+      </w:r>
+      <w:r>
+        <w:t>60ms</w:t>
+      </w:r>
+      <w:r>
+        <w:t>；主循环整体耗时</w:t>
+      </w:r>
+      <w:r>
+        <w:t>loop</w:t>
+      </w:r>
+      <w:r>
+        <w:t>大致保持在</w:t>
+      </w:r>
+      <w:r>
+        <w:t>10</w:t>
+      </w:r>
+      <w:r>
+        <w:t>～</w:t>
+      </w:r>
+      <w:r>
+        <w:t xml:space="preserve">30 </w:t>
+      </w:r>
+      <w:proofErr w:type="spellStart"/>
+      <w:r>
+        <w:t>ms</w:t>
+      </w:r>
+      <w:proofErr w:type="spellEnd"/>
+      <w:r>
+        <w:t>范围内。综合来看，分类推理仍是整个系统中耗时较高的部分，但由于检测阶段采用了低分辨率输入、检测间隔执行和轻量跟踪机制，系统整体仍能够维持较好的连续显示效果和交互响应速度。</w:t>
+      </w:r>
+    </w:p>
+    <w:p>
+      <w:pPr>
+        <w:ind w:firstLine="480"/>
+      </w:pPr>
+      <w:r>
+        <w:t>结合程序结构分析，上述实时性表现主要得益于三方面措施：其一，检测阶段采用低分辨率输入，减轻了前端计算压力；其二，检测与分类都采用间隔执行策略，避免每帧重复计算；其三，程序使用异步视频读取和轻量跟踪方式，降低了</w:t>
+      </w:r>
+      <w:r>
+        <w:t>I/O</w:t>
+      </w:r>
+      <w:r>
+        <w:t>与检测模块对主循环的阻塞影响。对树莓派这类资源受限平台而言，这种</w:t>
+      </w:r>
+      <w:r>
+        <w:t>“</w:t>
+      </w:r>
+      <w:r>
+        <w:t>适度降采样</w:t>
+      </w:r>
+      <w:r>
+        <w:t>+</w:t>
+      </w:r>
+      <w:r>
+        <w:t>分步推理</w:t>
+      </w:r>
+      <w:r>
+        <w:t>+</w:t>
+      </w:r>
+      <w:r>
+        <w:t>轻量跟踪</w:t>
+      </w:r>
+      <w:r>
+        <w:t>”</w:t>
+      </w:r>
+      <w:r>
+        <w:t>的策略具有较好的工程实用性。</w:t>
+      </w:r>
+    </w:p>
+    <w:p>
+      <w:pPr>
+        <w:pStyle w:val="3"/>
+        <w:rPr>
+          <w:rFonts w:hint="eastAsia"/>
+        </w:rPr>
+      </w:pPr>
+      <w:bookmarkStart w:id="63" w:name="_Toc226811241"/>
+      <w:r>
+        <w:t>5.4.3 稳定性测试</w:t>
+      </w:r>
+      <w:bookmarkEnd w:id="63"/>
+    </w:p>
+    <w:p>
+      <w:pPr>
+        <w:ind w:firstLine="480"/>
+      </w:pPr>
+      <w:r>
+        <w:t>除实时性外，系统运行稳定性同样是部署阶段的重要评价内容。根据当前测试情况，系统在树莓</w:t>
       </w:r>
       <w:proofErr w:type="gramStart"/>
       <w:r>
-        <w:t>控制端侧推理</w:t>
+        <w:t>派端连续</w:t>
       </w:r>
       <w:proofErr w:type="gramEnd"/>
       <w:r>
-        <w:t>负载，从而在有限</w:t>
+        <w:t>运行</w:t>
+      </w:r>
+      <w:r>
+        <w:t>10</w:t>
+      </w:r>
+      <w:r>
+        <w:t>分钟未出现程序崩溃、摄像头中断或界面卡死等异常情况，说明当前部署方案已经具备基本的连续工作能力。对于毕业设计中的原型系统而言，这一结果表明模型转换、</w:t>
       </w:r>
       <w:proofErr w:type="gramStart"/>
       <w:r>
-        <w:t>算力条件</w:t>
+        <w:t>端侧推理</w:t>
       </w:r>
       <w:proofErr w:type="gramEnd"/>
       <w:r>
-        <w:t>下保持较高响应速度。结合实际测试结果，系统在树莓派平台上的整体</w:t>
+        <w:t>和视频</w:t>
       </w:r>
       <w:proofErr w:type="gramStart"/>
       <w:r>
-        <w:t>运行帧率约</w:t>
+        <w:t>流处理</w:t>
       </w:r>
       <w:proofErr w:type="gramEnd"/>
       <w:r>
-        <w:t>为</w:t>
-      </w:r>
-      <w:r>
-        <w:t xml:space="preserve"> 40</w:t>
-      </w:r>
-      <w:r>
-        <w:t>～</w:t>
-      </w:r>
-      <w:r>
-        <w:t>60 FPS</w:t>
-      </w:r>
-      <w:r>
-        <w:t>，能够满足单人室内场景下的实时交互需求。该结果也说明，当前系统的实时表现优于程序中最初设定的</w:t>
-      </w:r>
-      <w:r>
-        <w:t xml:space="preserve"> 30 FPS </w:t>
-      </w:r>
-      <w:r>
-        <w:t>目标值，具备较好的运行余量。</w:t>
+        <w:t>之间已经形成较为稳定的运行链路。</w:t>
       </w:r>
     </w:p>
     <w:p>
@@ -22843,390 +22906,174 @@
         <w:ind w:firstLine="480"/>
       </w:pPr>
       <w:r>
-        <w:t>从细分耗时来看，在当前测试条件下，人脸检测阶段</w:t>
-      </w:r>
-      <w:r>
-        <w:t xml:space="preserve"> det </w:t>
-      </w:r>
-      <w:r>
-        <w:t>的单次耗时通常控制在</w:t>
-      </w:r>
-      <w:r>
-        <w:t xml:space="preserve"> 10 </w:t>
+        <w:t>从程序实现上看，稳定性的获得并非仅依赖硬件性能，还与软件结构密切相关。推理脚本通过独立线程持续读取摄像头帧，避免了视频采集阻塞主循环；同时，通过目标跟踪和异步图像保存机制，将部分非关键操作从主线程中分离出来，从而减小了单次循环内的阻塞风险。此外，程序对摄像头打开失败、模型文件缺失等情况也设置了异常处理逻辑，这在一定程度上增强了系统的可维护性和容错能力。</w:t>
+      </w:r>
+    </w:p>
+    <w:p>
+      <w:pPr>
+        <w:ind w:firstLine="480"/>
+      </w:pPr>
+      <w:r>
+        <w:t>需要说明的是，当前稳定性测试主要以单人室内场景为主，测试时长和场景复杂度仍然有限。后续若扩展为更长时间运行测试、多光照条件测试或多人场景测试，还可以对系统鲁棒性作更全面的评估。这一点也表明，本文当前实现的是一个已具备实际运行能力的原型系统，而并非面向复杂开放环境的最终产品。</w:t>
+      </w:r>
+    </w:p>
+    <w:p>
+      <w:pPr>
+        <w:pStyle w:val="3"/>
+        <w:rPr>
+          <w:rFonts w:hint="eastAsia"/>
+        </w:rPr>
+      </w:pPr>
+      <w:bookmarkStart w:id="64" w:name="_Toc226811242"/>
+      <w:r>
+        <w:lastRenderedPageBreak/>
+        <w:t>5.4.4 运行效果分析</w:t>
+      </w:r>
+      <w:bookmarkEnd w:id="64"/>
+    </w:p>
+    <w:p>
+      <w:pPr>
+        <w:ind w:firstLine="480"/>
+      </w:pPr>
+      <w:r>
+        <w:t>从运行效果来看，当前系统已经能够在树莓派平台上完成检测、分类和结果显示一体化处理，并在单人室内场景中保持较高识别稳定性。结合运行截图可以看出，系统对</w:t>
+      </w:r>
+      <w:r>
+        <w:t>anger</w:t>
+      </w:r>
+      <w:r>
+        <w:t>、</w:t>
+      </w:r>
+      <w:r>
+        <w:t>fear</w:t>
+      </w:r>
+      <w:r>
+        <w:t>、</w:t>
+      </w:r>
+      <w:r>
+        <w:t>happy</w:t>
+      </w:r>
+      <w:r>
+        <w:t>、</w:t>
+      </w:r>
+      <w:r>
+        <w:t>neutral</w:t>
+      </w:r>
+      <w:r>
+        <w:t>、</w:t>
+      </w:r>
+      <w:r>
+        <w:t>sad</w:t>
+      </w:r>
+      <w:r>
+        <w:t>等表情均能输出较为合理的识别结果，且多数样本的识别置信度处于较高水平，说</w:t>
+      </w:r>
+      <w:proofErr w:type="gramStart"/>
+      <w:r>
+        <w:t>明前文</w:t>
+      </w:r>
+      <w:proofErr w:type="gramEnd"/>
+      <w:r>
+        <w:t>训练得到的模型在</w:t>
+      </w:r>
+      <w:proofErr w:type="gramStart"/>
+      <w:r>
+        <w:t>部署端仍具有</w:t>
+      </w:r>
+      <w:proofErr w:type="gramEnd"/>
+      <w:r>
+        <w:t>较好的判别能力。</w:t>
+      </w:r>
+    </w:p>
+    <w:p>
+      <w:pPr>
+        <w:ind w:firstLine="480"/>
+      </w:pPr>
+      <w:r>
+        <w:t>与</w:t>
+      </w:r>
+      <w:r>
+        <w:t>PC</w:t>
+      </w:r>
+      <w:proofErr w:type="gramStart"/>
+      <w:r>
+        <w:t>端训练</w:t>
+      </w:r>
+      <w:proofErr w:type="gramEnd"/>
+      <w:r>
+        <w:t>和离线评估相比，树莓派端的部署结果在运行速度和资源利用方面更具有实际工程意义。</w:t>
+      </w:r>
+      <w:r>
+        <w:t>PC</w:t>
+      </w:r>
+      <w:proofErr w:type="gramStart"/>
+      <w:r>
+        <w:t>端能够</w:t>
+      </w:r>
+      <w:proofErr w:type="gramEnd"/>
+      <w:r>
+        <w:t>提供更强的计算资源，因此更适合模型训练、参数调整和批量评估；树莓</w:t>
+      </w:r>
+      <w:proofErr w:type="gramStart"/>
+      <w:r>
+        <w:t>派端虽然算力</w:t>
+      </w:r>
+      <w:proofErr w:type="gramEnd"/>
+      <w:r>
+        <w:t>受限，但通过</w:t>
       </w:r>
       <w:proofErr w:type="spellStart"/>
       <w:r>
-        <w:t>ms</w:t>
+        <w:t>TFLite</w:t>
       </w:r>
       <w:proofErr w:type="spellEnd"/>
       <w:r>
-        <w:t xml:space="preserve"> </w:t>
-      </w:r>
-      <w:r>
-        <w:t>以内；表情分类阶段</w:t>
-      </w:r>
-      <w:r>
-        <w:t xml:space="preserve"> </w:t>
+        <w:t>模型导出、低分辨率检测、间隔推理和轻量跟踪等策略，仍能够在较低资源消耗下实现连续视频识别。由此可见，本文所设计系统在</w:t>
+      </w:r>
+      <w:r>
+        <w:t>“</w:t>
+      </w:r>
+      <w:r>
+        <w:t>训练端精度优化</w:t>
+      </w:r>
+      <w:r>
+        <w:t>—</w:t>
+      </w:r>
+      <w:r>
+        <w:t>部署端实时运行</w:t>
+      </w:r>
+      <w:r>
+        <w:t>”</w:t>
+      </w:r>
+      <w:r>
+        <w:t>这一链路上已经形成较完整的工程实现闭环。</w:t>
+      </w:r>
+    </w:p>
+    <w:p>
+      <w:pPr>
+        <w:ind w:firstLine="480"/>
+      </w:pPr>
+      <w:r>
+        <w:t>在实际部署过程中，系统也暴露出一些值得进一步优化的问题。例如，分类耗时相较检测耗时波动更大，说明表情分类模型</w:t>
+      </w:r>
+      <w:proofErr w:type="gramStart"/>
+      <w:r>
+        <w:t>仍是端侧推理</w:t>
+      </w:r>
+      <w:proofErr w:type="gramEnd"/>
+      <w:r>
+        <w:t>的主要瓶颈；当输入场景更加复杂或同时出现多张人脸时，当前</w:t>
       </w:r>
       <w:proofErr w:type="spellStart"/>
       <w:r>
-        <w:t>cls</w:t>
+        <w:t>max_infer_faces</w:t>
       </w:r>
       <w:proofErr w:type="spellEnd"/>
       <w:r>
-        <w:t xml:space="preserve"> </w:t>
-      </w:r>
-      <w:r>
-        <w:t>的耗时存在一定波动，约为</w:t>
-      </w:r>
-      <w:r>
-        <w:t xml:space="preserve"> 20</w:t>
-      </w:r>
-      <w:r>
-        <w:t>～</w:t>
-      </w:r>
-      <w:r>
-        <w:t xml:space="preserve">60 </w:t>
-      </w:r>
-      <w:proofErr w:type="spellStart"/>
-      <w:r>
-        <w:t>ms</w:t>
-      </w:r>
-      <w:proofErr w:type="spellEnd"/>
-      <w:r>
-        <w:t>；主循环整体耗时</w:t>
-      </w:r>
-      <w:r>
-        <w:t xml:space="preserve"> loop </w:t>
-      </w:r>
-      <w:r>
-        <w:t>大致保持在</w:t>
-      </w:r>
-      <w:r>
-        <w:t xml:space="preserve"> 10</w:t>
-      </w:r>
-      <w:r>
-        <w:t>～</w:t>
-      </w:r>
-      <w:r>
-        <w:t xml:space="preserve">30 </w:t>
-      </w:r>
-      <w:proofErr w:type="spellStart"/>
-      <w:r>
-        <w:t>ms</w:t>
-      </w:r>
-      <w:proofErr w:type="spellEnd"/>
-      <w:r>
-        <w:t xml:space="preserve"> </w:t>
-      </w:r>
-      <w:r>
-        <w:t>范围内。综合来看，分类推理仍是整个系统中耗时较高的部分，但由于检测阶段采用了低分辨率输入、检测间隔执行和轻量跟踪机制，系统整体仍能够维持较好的连续显示效果和交互响应速度。</w:t>
-      </w:r>
-    </w:p>
-    <w:p>
-      <w:pPr>
-        <w:ind w:firstLine="480"/>
-      </w:pPr>
-      <w:r>
-        <w:t>结合程序结构分析，上述实时性表现主要得益于三方面措施：其一，检测阶段采用低分辨率输入，减轻了前端计算压力；其二，检测与分类都采用间隔执行策略，避免每帧重复计算；其三，程序使用异步视频读取和轻量跟踪方式，降低了</w:t>
-      </w:r>
-      <w:r>
-        <w:t xml:space="preserve"> I/O </w:t>
-      </w:r>
-      <w:r>
-        <w:t>与检测模块对主循环的阻塞影响。对树莓派这类资源受限平台而言，这种</w:t>
-      </w:r>
-      <w:r>
-        <w:t>“</w:t>
-      </w:r>
-      <w:r>
-        <w:t>适度降采样</w:t>
-      </w:r>
-      <w:r>
-        <w:t xml:space="preserve"> + </w:t>
-      </w:r>
-      <w:r>
-        <w:t>分步推理</w:t>
-      </w:r>
-      <w:r>
-        <w:t xml:space="preserve"> + </w:t>
-      </w:r>
-      <w:r>
-        <w:t>轻量跟踪</w:t>
-      </w:r>
-      <w:r>
-        <w:t>”</w:t>
-      </w:r>
-      <w:r>
-        <w:t>的策略具有较好的工程实用性。</w:t>
-      </w:r>
-    </w:p>
-    <w:p>
-      <w:pPr>
-        <w:pStyle w:val="3"/>
-        <w:rPr>
-          <w:rFonts w:hint="eastAsia"/>
-        </w:rPr>
-      </w:pPr>
-      <w:bookmarkStart w:id="63" w:name="_Toc226811241"/>
-      <w:r>
-        <w:t>5.4.3 稳定性测试</w:t>
-      </w:r>
-      <w:bookmarkEnd w:id="63"/>
-    </w:p>
-    <w:p>
-      <w:pPr>
-        <w:ind w:firstLine="480"/>
-      </w:pPr>
-      <w:r>
-        <w:t>除实时性外，系统运行稳定性同样是部署阶段的重要评价内容。根据当前测试情况，系统在树莓</w:t>
-      </w:r>
-      <w:proofErr w:type="gramStart"/>
-      <w:r>
-        <w:t>派端连续</w:t>
-      </w:r>
-      <w:proofErr w:type="gramEnd"/>
-      <w:r>
-        <w:t>运行</w:t>
-      </w:r>
-      <w:r>
-        <w:t xml:space="preserve"> 10 </w:t>
-      </w:r>
-      <w:r>
-        <w:t>分钟未出现程序崩溃、摄像头中断或界面卡死等异常情况，说明当前部署方案已经具备基本的连续工作能力。对于毕业设计中的原型系统而言，这一结果表明模型转换、</w:t>
-      </w:r>
-      <w:proofErr w:type="gramStart"/>
-      <w:r>
-        <w:t>端侧推理</w:t>
-      </w:r>
-      <w:proofErr w:type="gramEnd"/>
-      <w:r>
-        <w:t>和视频</w:t>
-      </w:r>
-      <w:proofErr w:type="gramStart"/>
-      <w:r>
-        <w:t>流处理</w:t>
-      </w:r>
-      <w:proofErr w:type="gramEnd"/>
-      <w:r>
-        <w:t>之间已经形成较为稳定的运行链路。</w:t>
-      </w:r>
-    </w:p>
-    <w:p>
-      <w:pPr>
-        <w:ind w:firstLine="480"/>
-      </w:pPr>
-      <w:r>
-        <w:t>从程序实现上看，稳定性的获得并非仅依赖硬件性能，还与软件结构密切相关。推理脚本通过独立线程持续读取摄像头帧，避免了视频采集阻塞主循环；同时，通过目标跟踪和异步图像保存机制，将部分非关键操作从主线程中分离出来，从而减小了单次循环内的阻塞风险。此外，程序对摄像头打开失败、模型文件缺失等情况也设置了异常处理逻辑，这在一定程度上增强了系统的可维护性和容错能力。</w:t>
-      </w:r>
-    </w:p>
-    <w:p>
-      <w:pPr>
-        <w:ind w:firstLine="480"/>
-      </w:pPr>
-      <w:r>
-        <w:t>需要说明的是，当前稳定性测试主要以单人室内场景为主，测试时长和场景复杂度仍然有限。后续若扩展为更长时间运行测试、多光照条件测试或多人场景</w:t>
-      </w:r>
-      <w:r>
-        <w:lastRenderedPageBreak/>
-        <w:t>测试，还可以对系统鲁棒性作更全面的评估。这一点也表明，本文当前实现的是一个已具备实际运行能力的原型系统，而并非面向复杂开放环境的最终产品。</w:t>
-      </w:r>
-    </w:p>
-    <w:p>
-      <w:pPr>
-        <w:pStyle w:val="3"/>
-        <w:rPr>
-          <w:rFonts w:hint="eastAsia"/>
-        </w:rPr>
-      </w:pPr>
-      <w:bookmarkStart w:id="64" w:name="_Toc226811242"/>
-      <w:r>
-        <w:t>5.4.4 运行效果分析</w:t>
-      </w:r>
-      <w:bookmarkEnd w:id="64"/>
-    </w:p>
-    <w:p>
-      <w:pPr>
-        <w:ind w:firstLine="480"/>
-      </w:pPr>
-      <w:r>
-        <w:t>从运行效果来看，当前系统已经能够在树莓派平台上完成检测、分类和结果显示一体化处理，并在单人室内场景中保持较高识别稳定性。结合运行截图可以看出，系统对</w:t>
-      </w:r>
-      <w:r>
-        <w:t xml:space="preserve"> anger</w:t>
-      </w:r>
-      <w:r>
-        <w:t>、</w:t>
-      </w:r>
-      <w:r>
-        <w:t>fear</w:t>
-      </w:r>
-      <w:r>
-        <w:t>、</w:t>
-      </w:r>
-      <w:r>
-        <w:t>happy</w:t>
-      </w:r>
-      <w:r>
-        <w:t>、</w:t>
-      </w:r>
-      <w:r>
-        <w:t>neutral</w:t>
-      </w:r>
-      <w:r>
-        <w:t>、</w:t>
-      </w:r>
-      <w:r>
-        <w:t xml:space="preserve">sad </w:t>
-      </w:r>
-      <w:r>
-        <w:t>等表情均能输出较为合理的识别结果，且多数样本的识别置信度处于较高水平，说</w:t>
-      </w:r>
-      <w:proofErr w:type="gramStart"/>
-      <w:r>
-        <w:t>明前文</w:t>
-      </w:r>
-      <w:proofErr w:type="gramEnd"/>
-      <w:r>
-        <w:t>训练得到的模型在</w:t>
-      </w:r>
-      <w:proofErr w:type="gramStart"/>
-      <w:r>
-        <w:t>部署端仍具有</w:t>
-      </w:r>
-      <w:proofErr w:type="gramEnd"/>
-      <w:r>
-        <w:t>较好的判别能力。</w:t>
-      </w:r>
-    </w:p>
-    <w:p>
-      <w:pPr>
-        <w:ind w:firstLine="480"/>
-      </w:pPr>
-      <w:r>
-        <w:t>与</w:t>
-      </w:r>
-      <w:r>
-        <w:t xml:space="preserve"> PC </w:t>
-      </w:r>
-      <w:proofErr w:type="gramStart"/>
-      <w:r>
-        <w:t>端训练</w:t>
-      </w:r>
-      <w:proofErr w:type="gramEnd"/>
-      <w:r>
-        <w:t>和离线评估相比，树莓派端的部署结果在运行速度和资源利用方面更具有实际工程意义。</w:t>
-      </w:r>
-      <w:r>
-        <w:t xml:space="preserve">PC </w:t>
-      </w:r>
-      <w:proofErr w:type="gramStart"/>
-      <w:r>
-        <w:t>端能够</w:t>
-      </w:r>
-      <w:proofErr w:type="gramEnd"/>
-      <w:r>
-        <w:t>提供更强的计算资源，因此更适合模型训练、参数调整和批量评估；树莓</w:t>
-      </w:r>
-      <w:proofErr w:type="gramStart"/>
-      <w:r>
-        <w:t>派端虽然算力</w:t>
-      </w:r>
-      <w:proofErr w:type="gramEnd"/>
-      <w:r>
-        <w:t>受限，但通过</w:t>
-      </w:r>
-      <w:r>
-        <w:t xml:space="preserve"> </w:t>
-      </w:r>
-      <w:proofErr w:type="spellStart"/>
-      <w:r>
-        <w:t>TFLite</w:t>
-      </w:r>
-      <w:proofErr w:type="spellEnd"/>
-      <w:r>
-        <w:t xml:space="preserve"> </w:t>
-      </w:r>
-      <w:r>
-        <w:t>模型导出、低分辨率检测、间隔推理和轻量跟踪等策略，仍能够在较低资源消耗下实现连续视频识别。由此可见，本文所设计系统在</w:t>
-      </w:r>
-      <w:r>
-        <w:t>“</w:t>
-      </w:r>
-      <w:r>
-        <w:t>训练端精度优化</w:t>
-      </w:r>
-      <w:r>
-        <w:t>—</w:t>
-      </w:r>
-      <w:r>
-        <w:t>部署端实时运行</w:t>
-      </w:r>
-      <w:r>
-        <w:t>”</w:t>
-      </w:r>
-      <w:r>
-        <w:t>这一链路上已经形成较完整的工程实现闭环。</w:t>
-      </w:r>
-    </w:p>
-    <w:p>
-      <w:pPr>
-        <w:ind w:firstLine="480"/>
-      </w:pPr>
-      <w:r>
-        <w:t>在实际部署过程中，系统也暴露出一些值得进一步优化的问题。例如，分类耗时相较检测耗时波动更大，说明表情分类模型</w:t>
-      </w:r>
-      <w:proofErr w:type="gramStart"/>
-      <w:r>
-        <w:t>仍是端侧推理</w:t>
-      </w:r>
-      <w:proofErr w:type="gramEnd"/>
-      <w:r>
-        <w:t>的主要瓶颈；当输入场景更加复杂或同时出现多张人脸时，当前</w:t>
-      </w:r>
-      <w:r>
-        <w:t xml:space="preserve"> </w:t>
-      </w:r>
-      <w:proofErr w:type="spellStart"/>
-      <w:r>
-        <w:t>max_infer_faces</w:t>
-      </w:r>
-      <w:proofErr w:type="spellEnd"/>
-      <w:r>
-        <w:t xml:space="preserve">=1 </w:t>
-      </w:r>
-      <w:r>
-        <w:t>的设置虽然有利于维持实时性，但也会限制多目标并发表情识别能力。针对这些问题，本文在实现中已经通过降低检测分辨率、限制参与分类的人脸数、使用异步读取和异步保存等方式进行优化。老师之前也明确建议你把这种</w:t>
-      </w:r>
-      <w:r>
-        <w:t>“</w:t>
-      </w:r>
-      <w:r>
-        <w:t>运行后发现问题</w:t>
-      </w:r>
-      <w:r>
-        <w:t>—</w:t>
-      </w:r>
-      <w:r>
-        <w:t>再优化</w:t>
-      </w:r>
-      <w:r>
-        <w:t>—</w:t>
-      </w:r>
-      <w:r>
-        <w:t>最后达到效果</w:t>
-      </w:r>
-      <w:r>
-        <w:t>”</w:t>
-      </w:r>
-      <w:r>
-        <w:t>的内容写进第</w:t>
-      </w:r>
-      <w:r>
-        <w:t>5</w:t>
-      </w:r>
-      <w:r>
-        <w:t>章，这样更符合毕业设计的写法。</w:t>
+        <w:t>=1</w:t>
+      </w:r>
+      <w:r>
+        <w:t>的设置虽然有利于维持实时性，但也会限制多目标并发表情识别能力。针对这些问题，本文在实现中已经通过降低检测分辨率、限制参与分类的人脸数、使用异步读取和异步保存等方式进行优化。</w:t>
       </w:r>
     </w:p>
     <w:p>
@@ -23267,7 +23114,7 @@
         <w:t>本章围绕人脸表情识别系统的实现、部署与运行测试展开研究，重点介绍了模型从</w:t>
       </w:r>
       <w:r>
-        <w:t xml:space="preserve"> PC </w:t>
+        <w:t>PC</w:t>
       </w:r>
       <w:proofErr w:type="gramStart"/>
       <w:r>
@@ -23285,22 +23132,16 @@
       <w:r>
         <w:t>平台的完整过程。首先，本文对系统整体运行流程进行了说明，明确了视频采集、人脸检测、人脸区域预处理、表情分类和结果显示等主要环节；其次，从软件环境和硬件平台两个方面介绍了部署条件，并说明了</w:t>
       </w:r>
-      <w:r>
-        <w:t xml:space="preserve"> </w:t>
-      </w:r>
       <w:proofErr w:type="spellStart"/>
       <w:r>
         <w:t>PyTorch</w:t>
       </w:r>
       <w:proofErr w:type="spellEnd"/>
       <w:r>
-        <w:t xml:space="preserve"> </w:t>
-      </w:r>
-      <w:r>
         <w:t>模型经</w:t>
       </w:r>
       <w:r>
-        <w:t xml:space="preserve"> ONNX</w:t>
+        <w:t>ONNX</w:t>
       </w:r>
       <w:r>
         <w:t>、</w:t>
@@ -23311,51 +23152,42 @@
       </w:r>
       <w:proofErr w:type="spellEnd"/>
       <w:r>
-        <w:t xml:space="preserve"> </w:t>
-      </w:r>
-      <w:r>
         <w:t>转换后生成</w:t>
       </w:r>
-      <w:r>
-        <w:t xml:space="preserve"> </w:t>
-      </w:r>
       <w:proofErr w:type="spellStart"/>
       <w:r>
         <w:t>TFLite</w:t>
       </w:r>
       <w:proofErr w:type="spellEnd"/>
       <w:r>
-        <w:t xml:space="preserve"> </w:t>
-      </w:r>
-      <w:r>
-        <w:t>模型</w:t>
+        <w:t>模型文件的具体过程；然后，对</w:t>
+      </w:r>
+      <w:proofErr w:type="gramStart"/>
+      <w:r>
+        <w:t>树莓派端推理</w:t>
+      </w:r>
+      <w:proofErr w:type="gramEnd"/>
+      <w:r>
+        <w:t>程序的结构设计、结果显示方式以及图像保存机制进行了分析。</w:t>
+      </w:r>
+    </w:p>
+    <w:p>
+      <w:pPr>
+        <w:ind w:firstLine="480"/>
+      </w:pPr>
+      <w:r>
+        <w:t>在系统运行测试方面，本文分别从功能测试、实时性测试、稳定性测试和运行效果分析四个角度对部署结果进行了评估。测试结果表明，系统能够在树莓派</w:t>
       </w:r>
       <w:r>
         <w:lastRenderedPageBreak/>
-        <w:t>文件的具体过程；然后，对</w:t>
+        <w:t>平台上稳定完成单人场景下的人脸检测与表情识别任务，整体</w:t>
       </w:r>
       <w:proofErr w:type="gramStart"/>
       <w:r>
-        <w:t>树莓派端推理</w:t>
+        <w:t>运行帧率约</w:t>
       </w:r>
       <w:proofErr w:type="gramEnd"/>
       <w:r>
-        <w:t>程序的结构设计、结果显示方式以及图像保存机制进行了分析。</w:t>
-      </w:r>
-    </w:p>
-    <w:p>
-      <w:pPr>
-        <w:ind w:firstLine="480"/>
-      </w:pPr>
-      <w:r>
-        <w:t>在系统运行测试方面，本文分别从功能测试、实时性测试、稳定性测试和运行效果分析四个角度对部署结果进行了评估。测试结果表明，系统能够在树莓派平台上稳定完成单人场景下的人脸检测与表情识别任务，整体</w:t>
-      </w:r>
-      <w:proofErr w:type="gramStart"/>
-      <w:r>
-        <w:t>运行帧率约</w:t>
-      </w:r>
-      <w:proofErr w:type="gramEnd"/>
-      <w:r>
         <w:t>为</w:t>
       </w:r>
       <w:r>
@@ -23371,7 +23203,7 @@
         <w:t>，检测耗时控制在</w:t>
       </w:r>
       <w:r>
-        <w:t xml:space="preserve"> 10 </w:t>
+        <w:t xml:space="preserve">10 </w:t>
       </w:r>
       <w:proofErr w:type="spellStart"/>
       <w:r>
@@ -23379,13 +23211,10 @@
       </w:r>
       <w:proofErr w:type="spellEnd"/>
       <w:r>
-        <w:t xml:space="preserve"> </w:t>
-      </w:r>
-      <w:r>
         <w:t>以内，分类耗时约为</w:t>
       </w:r>
       <w:r>
-        <w:t xml:space="preserve"> 20</w:t>
+        <w:t>20</w:t>
       </w:r>
       <w:r>
         <w:t>～</w:t>
@@ -23402,7 +23231,7 @@
         <w:t>，主循环耗时约为</w:t>
       </w:r>
       <w:r>
-        <w:t xml:space="preserve"> 10</w:t>
+        <w:t>10</w:t>
       </w:r>
       <w:r>
         <w:t>～</w:t>
@@ -23419,7 +23248,7 @@
         <w:t>，能够满足毕业设计原型系统对实时性的基本要求。同时，系统连续运行</w:t>
       </w:r>
       <w:r>
-        <w:t xml:space="preserve"> 10 </w:t>
+        <w:t>10</w:t>
       </w:r>
       <w:r>
         <w:t>分钟未出现明显异常，说明当前部署方案已具备较好的稳定性和可用性。综合来看，本章完成了从模型部署到系统运行测试的完整验证，为全文工作提供了工程实现层面的支撑。</w:t>
@@ -23472,13 +23301,13 @@
         <w:t>表情识别系统的设计与实现开展研究，针对传统表情识别方法在复杂环境下鲁棒性不足以及深度学习模型在嵌入式平台上部署困难等问题，提出并实现了一种基于轻量级人脸检测模型</w:t>
       </w:r>
       <w:r>
-        <w:t xml:space="preserve"> YuNet </w:t>
+        <w:t>YuNet</w:t>
       </w:r>
       <w:r>
         <w:t>与轻量化卷积神经网络</w:t>
       </w:r>
       <w:r>
-        <w:t xml:space="preserve"> MobileNetV3 </w:t>
+        <w:t>MobileNetV3</w:t>
       </w:r>
       <w:r>
         <w:t>的人脸表情识别系统。论文从系统需求分析、模型构建与训练、训练优化、模型部署到运行测试，完成了较为完整的研究与实现过程，最终实现了从离线模型设计到</w:t>
@@ -23552,13 +23381,13 @@
         <w:t>其次，在模型构建与训练方面，本文以</w:t>
       </w:r>
       <w:r>
-        <w:t xml:space="preserve"> FER2013 </w:t>
+        <w:t>FER2013</w:t>
       </w:r>
       <w:r>
         <w:t>数据集为基础，并结合扩展的亚裔样本数据构建了适合本课题的人脸表情识别数据集。针对数据分布不均衡和无标签数据利用不足等问题，本文采用了轻量化</w:t>
       </w:r>
       <w:r>
-        <w:t xml:space="preserve"> MobileNetV3-large </w:t>
+        <w:t>MobileNetV3-large</w:t>
       </w:r>
       <w:r>
         <w:t>作为表情分类骨干网络，并引入类别平衡策略、数据增强方法以及基于伪标签的半监督训练思路，逐步提升模型对不同表情类别的识别能力。在训练优化过程中，本文按照</w:t>
@@ -23608,7 +23437,7 @@
         <w:t>再次，在实验结果方面，本文构建的最终模型在验证集和测试集上均取得了较好的识别效果。其中，测试集准确率达到</w:t>
       </w:r>
       <w:r>
-        <w:t xml:space="preserve"> 90.77%</w:t>
+        <w:t>90.77%</w:t>
       </w:r>
       <w:r>
         <w:t>，</w:t>
@@ -23619,19 +23448,19 @@
       </w:r>
       <w:proofErr w:type="gramEnd"/>
       <w:r>
-        <w:t xml:space="preserve"> F1 </w:t>
+        <w:t>F1</w:t>
       </w:r>
       <w:r>
         <w:t>值达到</w:t>
       </w:r>
       <w:r>
-        <w:t xml:space="preserve"> 87.43%</w:t>
+        <w:t>87.43%</w:t>
       </w:r>
       <w:r>
         <w:t>，验证集准确率达到</w:t>
       </w:r>
       <w:r>
-        <w:t xml:space="preserve"> 90.55%</w:t>
+        <w:t>90.55%</w:t>
       </w:r>
       <w:r>
         <w:t>，</w:t>
@@ -23642,13 +23471,13 @@
       </w:r>
       <w:proofErr w:type="gramEnd"/>
       <w:r>
-        <w:t xml:space="preserve"> F1 </w:t>
+        <w:t>F1</w:t>
       </w:r>
       <w:r>
         <w:t>值达到</w:t>
       </w:r>
       <w:r>
-        <w:t xml:space="preserve"> 87.32%</w:t>
+        <w:t>87.32%</w:t>
       </w:r>
       <w:r>
         <w:t>。从各类别评价结果来看，</w:t>
@@ -23717,22 +23546,16 @@
       <w:r>
         <w:t>最后，在系统部署与运行验证方面，本文完成了模型从</w:t>
       </w:r>
-      <w:r>
-        <w:t xml:space="preserve"> </w:t>
-      </w:r>
       <w:proofErr w:type="spellStart"/>
       <w:r>
         <w:t>PyTorch</w:t>
       </w:r>
       <w:proofErr w:type="spellEnd"/>
       <w:r>
-        <w:t xml:space="preserve"> </w:t>
-      </w:r>
-      <w:r>
         <w:t>到</w:t>
       </w:r>
       <w:r>
-        <w:t xml:space="preserve"> ONNX</w:t>
+        <w:t>ONNX</w:t>
       </w:r>
       <w:r>
         <w:t>、</w:t>
@@ -23743,132 +23566,123 @@
       </w:r>
       <w:proofErr w:type="spellEnd"/>
       <w:r>
-        <w:t xml:space="preserve"> </w:t>
-      </w:r>
-      <w:r>
         <w:t>以及</w:t>
       </w:r>
       <w:r>
-        <w:t xml:space="preserve"> TensorFlow Lite </w:t>
+        <w:t>TensorFlow Lite</w:t>
       </w:r>
       <w:r>
         <w:t>格式的转换，并将</w:t>
       </w:r>
       <w:r>
-        <w:t xml:space="preserve"> fp16 </w:t>
+        <w:t>fp16</w:t>
       </w:r>
       <w:r>
         <w:t>量化后的</w:t>
       </w:r>
-      <w:r>
-        <w:t xml:space="preserve"> </w:t>
-      </w:r>
       <w:proofErr w:type="spellStart"/>
       <w:r>
+        <w:t>TFLite</w:t>
+      </w:r>
+      <w:proofErr w:type="spellEnd"/>
+      <w:r>
+        <w:t>模型部署到树莓派</w:t>
+      </w:r>
+      <w:r>
+        <w:t>5</w:t>
+      </w:r>
+      <w:r>
+        <w:t>平台上，构建了可实际运行</w:t>
+      </w:r>
+      <w:proofErr w:type="gramStart"/>
+      <w:r>
+        <w:t>的端侧表情</w:t>
+      </w:r>
+      <w:proofErr w:type="gramEnd"/>
+      <w:r>
+        <w:t>识别原型系统。实际测试表</w:t>
+      </w:r>
+      <w:r>
         <w:lastRenderedPageBreak/>
-        <w:t>TFLite</w:t>
+        <w:t>明，该系统能够完成摄像头视频流采集、人脸检测、表情分类和结果显示的完整流程，系统整体</w:t>
+      </w:r>
+      <w:proofErr w:type="gramStart"/>
+      <w:r>
+        <w:t>运行帧率约</w:t>
+      </w:r>
+      <w:proofErr w:type="gramEnd"/>
+      <w:r>
+        <w:t>为</w:t>
+      </w:r>
+      <w:r>
+        <w:t>40</w:t>
+      </w:r>
+      <w:r>
+        <w:t>～</w:t>
+      </w:r>
+      <w:r>
+        <w:t>60 FPS</w:t>
+      </w:r>
+      <w:r>
+        <w:t>，人脸检测耗时控制在</w:t>
+      </w:r>
+      <w:r>
+        <w:t xml:space="preserve">10 </w:t>
+      </w:r>
+      <w:proofErr w:type="spellStart"/>
+      <w:r>
+        <w:t>ms</w:t>
       </w:r>
       <w:proofErr w:type="spellEnd"/>
       <w:r>
-        <w:t xml:space="preserve"> </w:t>
-      </w:r>
-      <w:r>
-        <w:t>模型部署到树莓派</w:t>
-      </w:r>
-      <w:r>
-        <w:t xml:space="preserve"> 5 </w:t>
-      </w:r>
-      <w:r>
-        <w:t>平台上，构建了可实际运行</w:t>
+        <w:t>以内，表情分类耗时约为</w:t>
+      </w:r>
+      <w:r>
+        <w:t>20</w:t>
+      </w:r>
+      <w:r>
+        <w:t>～</w:t>
+      </w:r>
+      <w:r>
+        <w:t xml:space="preserve">60 </w:t>
+      </w:r>
+      <w:proofErr w:type="spellStart"/>
+      <w:r>
+        <w:t>ms</w:t>
+      </w:r>
+      <w:proofErr w:type="spellEnd"/>
+      <w:r>
+        <w:t>，主循环耗时约为</w:t>
+      </w:r>
+      <w:r>
+        <w:t>10</w:t>
+      </w:r>
+      <w:r>
+        <w:t>～</w:t>
+      </w:r>
+      <w:r>
+        <w:t xml:space="preserve">30 </w:t>
+      </w:r>
+      <w:proofErr w:type="spellStart"/>
+      <w:r>
+        <w:t>ms</w:t>
+      </w:r>
+      <w:proofErr w:type="spellEnd"/>
+      <w:r>
+        <w:t>，连续运行</w:t>
+      </w:r>
+      <w:r>
+        <w:t>10</w:t>
+      </w:r>
+      <w:r>
+        <w:t>分钟未出现明显异常。上述结果表明，本文设计的人脸表情识别系统不仅具备较高的识别准确率，而且在树莓派这类资源受限平台上具有较好的实时性、稳定性和</w:t>
       </w:r>
       <w:proofErr w:type="gramStart"/>
       <w:r>
-        <w:t>的端侧表情</w:t>
+        <w:t>可</w:t>
       </w:r>
       <w:proofErr w:type="gramEnd"/>
       <w:r>
-        <w:t>识别原型系统。实际测试表明，该系统能够完成摄像头视频流采集、人脸检测、表情分类和结果显示的完整流程，系统整体</w:t>
-      </w:r>
-      <w:proofErr w:type="gramStart"/>
-      <w:r>
-        <w:t>运行帧率约</w:t>
-      </w:r>
-      <w:proofErr w:type="gramEnd"/>
-      <w:r>
-        <w:t>为</w:t>
-      </w:r>
-      <w:r>
-        <w:t xml:space="preserve"> 40</w:t>
-      </w:r>
-      <w:r>
-        <w:t>～</w:t>
-      </w:r>
-      <w:r>
-        <w:t>60 FPS</w:t>
-      </w:r>
-      <w:r>
-        <w:t>，人脸检测耗时控制在</w:t>
-      </w:r>
-      <w:r>
-        <w:t xml:space="preserve"> 10 </w:t>
-      </w:r>
-      <w:proofErr w:type="spellStart"/>
-      <w:r>
-        <w:t>ms</w:t>
-      </w:r>
-      <w:proofErr w:type="spellEnd"/>
-      <w:r>
-        <w:t xml:space="preserve"> </w:t>
-      </w:r>
-      <w:r>
-        <w:t>以内，表情分类耗时约为</w:t>
-      </w:r>
-      <w:r>
-        <w:t xml:space="preserve"> 20</w:t>
-      </w:r>
-      <w:r>
-        <w:t>～</w:t>
-      </w:r>
-      <w:r>
-        <w:t xml:space="preserve">60 </w:t>
-      </w:r>
-      <w:proofErr w:type="spellStart"/>
-      <w:r>
-        <w:t>ms</w:t>
-      </w:r>
-      <w:proofErr w:type="spellEnd"/>
-      <w:r>
-        <w:t>，主循环耗时约为</w:t>
-      </w:r>
-      <w:r>
-        <w:t xml:space="preserve"> 10</w:t>
-      </w:r>
-      <w:r>
-        <w:t>～</w:t>
-      </w:r>
-      <w:r>
-        <w:t xml:space="preserve">30 </w:t>
-      </w:r>
-      <w:proofErr w:type="spellStart"/>
-      <w:r>
-        <w:t>ms</w:t>
-      </w:r>
-      <w:proofErr w:type="spellEnd"/>
-      <w:r>
-        <w:t>，连续运行</w:t>
-      </w:r>
-      <w:r>
-        <w:t xml:space="preserve"> 10 </w:t>
-      </w:r>
-      <w:r>
-        <w:t>分钟未出现明显异常。上述结果表明，本文设计的人脸表情识别系统不仅具备较高的识别准确率，而且在树莓派这类资源受限平台上具有较好的实时性、稳定性和</w:t>
-      </w:r>
-      <w:proofErr w:type="gramStart"/>
-      <w:r>
-        <w:t>可</w:t>
-      </w:r>
-      <w:proofErr w:type="gramEnd"/>
-      <w:r>
         <w:t>部署性。</w:t>
       </w:r>
     </w:p>
@@ -23880,13 +23694,13 @@
         <w:t>综上所述，本文完成了基于</w:t>
       </w:r>
       <w:r>
-        <w:t xml:space="preserve"> CNN </w:t>
+        <w:t>CNN</w:t>
       </w:r>
       <w:r>
         <w:t>与</w:t>
       </w:r>
       <w:r>
-        <w:t xml:space="preserve"> YuNet </w:t>
+        <w:t>YuNet</w:t>
       </w:r>
       <w:proofErr w:type="gramStart"/>
       <w:r>
@@ -24015,31 +23829,25 @@
         <w:t>方面，本文当前系统主要针对树莓派平台进行实现与验证，并采用</w:t>
       </w:r>
       <w:r>
-        <w:t xml:space="preserve"> fp16 </w:t>
+        <w:t>fp16</w:t>
       </w:r>
       <w:r>
         <w:t>量化后的</w:t>
       </w:r>
-      <w:r>
-        <w:t xml:space="preserve"> </w:t>
-      </w:r>
       <w:proofErr w:type="spellStart"/>
       <w:r>
         <w:t>TFLite</w:t>
       </w:r>
       <w:proofErr w:type="spellEnd"/>
       <w:r>
-        <w:t xml:space="preserve"> </w:t>
-      </w:r>
-      <w:r>
-        <w:t>模型完成推理。虽然当前部署结果已经能够</w:t>
+        <w:t>模型完成推理。虽然当前部署结果已经能够满足毕业设计阶段的实时性要求，但从更高层次的工程应用角度来看，系统在多目</w:t>
       </w:r>
       <w:r>
         <w:lastRenderedPageBreak/>
-        <w:t>满足毕业设计阶段的实时性要求，但从更高层次的工程应用角度来看，系统在多目标并发识别、更加复杂场景下的实时性以及进一步压缩推理延迟等方面仍有提升空间。后续可尝试引入</w:t>
-      </w:r>
-      <w:r>
-        <w:t xml:space="preserve"> int8 </w:t>
+        <w:t>标并发识别、更加复杂场景下的实时性以及进一步压缩推理延迟等方面仍有提升空间。后续可尝试引入</w:t>
+      </w:r>
+      <w:r>
+        <w:t>int8</w:t>
       </w:r>
       <w:r>
         <w:t>量化、硬件加速、算子优化以及更高效的检测与跟踪策略，以进一步提升嵌入式平台上的推理速度和资源利用效率。</w:t>
@@ -24485,6 +24293,9 @@
     <w:p>
       <w:pPr>
         <w:pStyle w:val="1"/>
+        <w:rPr>
+          <w:rFonts w:hint="eastAsia"/>
+        </w:rPr>
       </w:pPr>
       <w:bookmarkStart w:id="71" w:name="_Toc226811249"/>
       <w:r>
@@ -24499,9 +24310,6 @@
     <w:p>
       <w:pPr>
         <w:ind w:firstLine="480"/>
-        <w:rPr>
-          <w:rFonts w:hint="eastAsia"/>
-        </w:rPr>
       </w:pPr>
     </w:p>
     <w:sectPr>
@@ -25395,6 +25203,7 @@
   <w:style w:type="character" w:default="1" w:styleId="a0">
     <w:name w:val="Default Paragraph Font"/>
     <w:uiPriority w:val="1"/>
+    <w:semiHidden/>
     <w:unhideWhenUsed/>
   </w:style>
   <w:style w:type="table" w:default="1" w:styleId="a1">
@@ -26065,10 +25874,6 @@
 </file>
 
 <file path=customXml/item1.xml><?xml version="1.0" encoding="utf-8"?>
-<b:Sources xmlns:b="http://schemas.openxmlformats.org/officeDocument/2006/bibliography" xmlns="http://schemas.openxmlformats.org/officeDocument/2006/bibliography" SelectedStyle="\APASixthEditionOfficeOnline.xsl" StyleName="APA" Version="6"/>
-</file>
-
-<file path=customXml/item2.xml><?xml version="1.0" encoding="utf-8"?>
 <s:customData xmlns="http://www.wps.cn/officeDocument/2013/wpsCustomData" xmlns:s="http://www.wps.cn/officeDocument/2013/wpsCustomData">
   <customSectProps>
     <customSectPr/>
@@ -26084,18 +25889,22 @@
 </s:customData>
 </file>
 
+<file path=customXml/item2.xml><?xml version="1.0" encoding="utf-8"?>
+<b:Sources xmlns:b="http://schemas.openxmlformats.org/officeDocument/2006/bibliography" xmlns="http://schemas.openxmlformats.org/officeDocument/2006/bibliography" SelectedStyle="\APASixthEditionOfficeOnline.xsl" StyleName="APA" Version="6"/>
+</file>
+
 <file path=customXml/itemProps1.xml><?xml version="1.0" encoding="utf-8"?>
+<ds:datastoreItem xmlns:ds="http://schemas.openxmlformats.org/officeDocument/2006/customXml" ds:itemID="{B1977F7D-205B-4081-913C-38D41E755F92}">
+  <ds:schemaRefs>
+    <ds:schemaRef ds:uri="http://www.wps.cn/officeDocument/2013/wpsCustomData"/>
+  </ds:schemaRefs>
+</ds:datastoreItem>
+</file>
+
+<file path=customXml/itemProps2.xml><?xml version="1.0" encoding="utf-8"?>
 <ds:datastoreItem xmlns:ds="http://schemas.openxmlformats.org/officeDocument/2006/customXml" ds:itemID="{237CE73F-B303-4DA7-94C8-D54DEBC6CCE8}">
   <ds:schemaRefs>
     <ds:schemaRef ds:uri="http://schemas.openxmlformats.org/officeDocument/2006/bibliography"/>
   </ds:schemaRefs>
 </ds:datastoreItem>
-</file>
-
-<file path=customXml/itemProps2.xml><?xml version="1.0" encoding="utf-8"?>
-<ds:datastoreItem xmlns:ds="http://schemas.openxmlformats.org/officeDocument/2006/customXml" ds:itemID="{B1977F7D-205B-4081-913C-38D41E755F92}">
-  <ds:schemaRefs>
-    <ds:schemaRef ds:uri="http://www.wps.cn/officeDocument/2013/wpsCustomData"/>
-  </ds:schemaRefs>
-</ds:datastoreItem>
 </file>
</xml_diff>